<commit_message>
feat(cli,worker): implement M9 sandbox hardening with fingerprinting
- Add docsight-worker crate with sandbox execution and policy enforcement
- Implement fingerprint command for document integrity verification via SHA256
- Add --sandbox global flag for isolated CLI execution
- Integrate worker protocol for controlled document processing
- Add sha2 and zip dependencies for fingerprinting and archive operations
- Implement M9 hardening test suite for sandbox security validation
- Update workspace configuration to include new worker module
- Enable agent-ready document processing with reproducible fingerprints
</commit_message>
<xml_diff>
--- a/Projeto_DOCSIGHT_Especificacao.docx
+++ b/Projeto_DOCSIGHT_Especificacao.docx
@@ -13,7 +13,7 @@
           <w:color w:val="4C63D2"/>
           <w:sz w:val="18"/>
         </w:rPr>
-        <w:t>PROJECT SPECIFICATION  /  v1.0</w:t>
+        <w:t>PROJECT SPECIFICATION  /  v1.1 — architecture revision</w:t>
       </w:r>
     </w:p>
     <w:p>
@@ -99,7 +99,7 @@
                 <w:color w:val="172033"/>
                 <w:sz w:val="18"/>
               </w:rPr>
-              <w:t>A terminal-native tool that lets an agent inspect DOCX and PDF files as structured, visual, queryable documents — without Microsoft Office, LibreOffice, Excel, or Word installed.</w:t>
+              <w:t>A terminal-native tool that lets an agent inspect DOCX and PDF files as structured, visual, queryable documents — without Microsoft Office, LibreOffice, Word, an external document engine, or a remote conversion service.</w:t>
             </w:r>
           </w:p>
         </w:tc>
@@ -145,7 +145,7 @@
           <w:color w:val="5D667A"/>
           <w:sz w:val="19"/>
         </w:rPr>
-        <w:t>CLI + document IR + OOXML parser + renderer orchestration + agent protocol</w:t>
+        <w:t>CLI + document IR + in-tree OOXML/PDF engines + deterministic layout/rendering + agent evidence protocol</w:t>
       </w:r>
     </w:p>
     <w:p>
@@ -249,6 +249,14 @@
           <w:sz w:val="18"/>
         </w:rPr>
         <w:t>It is not “pdftotext with prettier output”. Layout, coordinates, relationships and rendered evidence are first-class data.</w:t>
+      </w:r>
+    </w:p>
+    <w:p>
+      <w:pPr>
+        <w:pStyle w:val="ListBullet"/>
+      </w:pPr>
+      <w:r>
+        <w:t>It is not required that v1 reimplement every general-purpose primitive such as ZIP, XML, compression, image decoding or font shaping. Such libraries may exist behind replaceable adapters; no third-party document engine may define authoritative document semantics, geometry or pixels.</w:t>
       </w:r>
     </w:p>
     <w:p>
@@ -769,6 +777,58 @@
                 <w:sz w:val="16"/>
               </w:rPr>
               <w:t>Malformed documents return diagnostics; no process-wide panic</w:t>
+            </w:r>
+          </w:p>
+        </w:tc>
+      </w:tr>
+      <w:tr>
+        <w:tc>
+          <w:tcPr>
+            <w:tcW w:type="dxa" w:w="3600"/>
+            <w:shd w:fill="F6F7FA"/>
+            <w:tcMar>
+              <w:top w:w="80" w:type="dxa"/>
+              <w:start w:w="90" w:type="dxa"/>
+              <w:bottom w:w="80" w:type="dxa"/>
+              <w:end w:w="90" w:type="dxa"/>
+            </w:tcMar>
+            <w:tcBorders>
+              <w:top w:val="single" w:sz="4" w:color="D9DEEA"/>
+              <w:left w:val="single" w:sz="4" w:color="D9DEEA"/>
+              <w:bottom w:val="single" w:sz="4" w:color="D9DEEA"/>
+              <w:right w:val="single" w:sz="4" w:color="D9DEEA"/>
+              <w:insideH w:val="single" w:sz="4" w:color="D9DEEA"/>
+              <w:insideV w:val="single" w:sz="4" w:color="D9DEEA"/>
+            </w:tcBorders>
+          </w:tcPr>
+          <w:p>
+            <w:r>
+              <w:t>Document-engine dependency</w:t>
+            </w:r>
+          </w:p>
+        </w:tc>
+        <w:tc>
+          <w:tcPr>
+            <w:tcW w:type="dxa" w:w="6048"/>
+            <w:shd w:fill="F6F7FA"/>
+            <w:tcMar>
+              <w:top w:w="80" w:type="dxa"/>
+              <w:start w:w="90" w:type="dxa"/>
+              <w:bottom w:w="80" w:type="dxa"/>
+              <w:end w:w="90" w:type="dxa"/>
+            </w:tcMar>
+            <w:tcBorders>
+              <w:top w:val="single" w:sz="4" w:color="D9DEEA"/>
+              <w:left w:val="single" w:sz="4" w:color="D9DEEA"/>
+              <w:bottom w:val="single" w:sz="4" w:color="D9DEEA"/>
+              <w:right w:val="single" w:sz="4" w:color="D9DEEA"/>
+              <w:insideH w:val="single" w:sz="4" w:color="D9DEEA"/>
+              <w:insideV w:val="single" w:sz="4" w:color="D9DEEA"/>
+            </w:tcBorders>
+          </w:tcPr>
+          <w:p>
+            <w:r>
+              <w:t>Zero runtime dependency on MuPDF/Poppler/PDFium/Ghostscript/browser renderers or remote converters</w:t>
             </w:r>
           </w:p>
         </w:tc>
@@ -2044,6 +2104,237 @@
           </w:p>
         </w:tc>
       </w:tr>
+      <w:tr>
+        <w:tc>
+          <w:tcPr>
+            <w:tcW w:type="dxa" w:w="1800"/>
+            <w:shd w:fill="F6F7FA"/>
+            <w:tcMar>
+              <w:top w:w="80" w:type="dxa"/>
+              <w:start w:w="90" w:type="dxa"/>
+              <w:bottom w:w="80" w:type="dxa"/>
+              <w:end w:w="90" w:type="dxa"/>
+            </w:tcMar>
+            <w:tcBorders>
+              <w:top w:val="single" w:sz="4" w:color="D9DEEA"/>
+              <w:left w:val="single" w:sz="4" w:color="D9DEEA"/>
+              <w:bottom w:val="single" w:sz="4" w:color="D9DEEA"/>
+              <w:right w:val="single" w:sz="4" w:color="D9DEEA"/>
+              <w:insideH w:val="single" w:sz="4" w:color="D9DEEA"/>
+              <w:insideV w:val="single" w:sz="4" w:color="D9DEEA"/>
+            </w:tcBorders>
+          </w:tcPr>
+          <w:p>
+            <w:r>
+              <w:t>evidence / coverage</w:t>
+            </w:r>
+          </w:p>
+        </w:tc>
+        <w:tc>
+          <w:tcPr>
+            <w:tcW w:type="dxa" w:w="3528"/>
+            <w:shd w:fill="F6F7FA"/>
+            <w:tcMar>
+              <w:top w:w="80" w:type="dxa"/>
+              <w:start w:w="90" w:type="dxa"/>
+              <w:bottom w:w="80" w:type="dxa"/>
+              <w:end w:w="90" w:type="dxa"/>
+            </w:tcMar>
+            <w:tcBorders>
+              <w:top w:val="single" w:sz="4" w:color="D9DEEA"/>
+              <w:left w:val="single" w:sz="4" w:color="D9DEEA"/>
+              <w:bottom w:val="single" w:sz="4" w:color="D9DEEA"/>
+              <w:right w:val="single" w:sz="4" w:color="D9DEEA"/>
+              <w:insideH w:val="single" w:sz="4" w:color="D9DEEA"/>
+              <w:insideV w:val="single" w:sz="4" w:color="D9DEEA"/>
+            </w:tcBorders>
+          </w:tcPr>
+          <w:p>
+            <w:r>
+              <w:t>Trace provenance and fidelity/coverage</w:t>
+            </w:r>
+          </w:p>
+        </w:tc>
+        <w:tc>
+          <w:tcPr>
+            <w:tcW w:type="dxa" w:w="4320"/>
+            <w:shd w:fill="F6F7FA"/>
+            <w:tcMar>
+              <w:top w:w="80" w:type="dxa"/>
+              <w:start w:w="90" w:type="dxa"/>
+              <w:bottom w:w="80" w:type="dxa"/>
+              <w:end w:w="90" w:type="dxa"/>
+            </w:tcMar>
+            <w:tcBorders>
+              <w:top w:val="single" w:sz="4" w:color="D9DEEA"/>
+              <w:left w:val="single" w:sz="4" w:color="D9DEEA"/>
+              <w:bottom w:val="single" w:sz="4" w:color="D9DEEA"/>
+              <w:right w:val="single" w:sz="4" w:color="D9DEEA"/>
+              <w:insideH w:val="single" w:sz="4" w:color="D9DEEA"/>
+              <w:insideV w:val="single" w:sz="4" w:color="D9DEEA"/>
+            </w:tcBorders>
+          </w:tcPr>
+          <w:p>
+            <w:r>
+              <w:t>Decide what claims are safe and where to inspect visually</w:t>
+            </w:r>
+          </w:p>
+        </w:tc>
+      </w:tr>
+      <w:tr>
+        <w:tc>
+          <w:tcPr>
+            <w:tcW w:type="dxa" w:w="1800"/>
+            <w:shd w:fill="FFFFFF"/>
+            <w:tcMar>
+              <w:top w:w="80" w:type="dxa"/>
+              <w:start w:w="90" w:type="dxa"/>
+              <w:bottom w:w="80" w:type="dxa"/>
+              <w:end w:w="90" w:type="dxa"/>
+            </w:tcMar>
+            <w:tcBorders>
+              <w:top w:val="single" w:sz="4" w:color="D9DEEA"/>
+              <w:left w:val="single" w:sz="4" w:color="D9DEEA"/>
+              <w:bottom w:val="single" w:sz="4" w:color="D9DEEA"/>
+              <w:right w:val="single" w:sz="4" w:color="D9DEEA"/>
+              <w:insideH w:val="single" w:sz="4" w:color="D9DEEA"/>
+              <w:insideV w:val="single" w:sz="4" w:color="D9DEEA"/>
+            </w:tcBorders>
+          </w:tcPr>
+          <w:p>
+            <w:r>
+              <w:t>hit / focus</w:t>
+            </w:r>
+          </w:p>
+        </w:tc>
+        <w:tc>
+          <w:tcPr>
+            <w:tcW w:type="dxa" w:w="3528"/>
+            <w:shd w:fill="FFFFFF"/>
+            <w:tcMar>
+              <w:top w:w="80" w:type="dxa"/>
+              <w:start w:w="90" w:type="dxa"/>
+              <w:bottom w:w="80" w:type="dxa"/>
+              <w:end w:w="90" w:type="dxa"/>
+            </w:tcMar>
+            <w:tcBorders>
+              <w:top w:val="single" w:sz="4" w:color="D9DEEA"/>
+              <w:left w:val="single" w:sz="4" w:color="D9DEEA"/>
+              <w:bottom w:val="single" w:sz="4" w:color="D9DEEA"/>
+              <w:right w:val="single" w:sz="4" w:color="D9DEEA"/>
+              <w:insideH w:val="single" w:sz="4" w:color="D9DEEA"/>
+              <w:insideV w:val="single" w:sz="4" w:color="D9DEEA"/>
+            </w:tcBorders>
+          </w:tcPr>
+          <w:p>
+            <w:r>
+              <w:t>Reverse visual lookup + bounded semantic zoom</w:t>
+            </w:r>
+          </w:p>
+        </w:tc>
+        <w:tc>
+          <w:tcPr>
+            <w:tcW w:type="dxa" w:w="4320"/>
+            <w:shd w:fill="FFFFFF"/>
+            <w:tcMar>
+              <w:top w:w="80" w:type="dxa"/>
+              <w:start w:w="90" w:type="dxa"/>
+              <w:bottom w:w="80" w:type="dxa"/>
+              <w:end w:w="90" w:type="dxa"/>
+            </w:tcMar>
+            <w:tcBorders>
+              <w:top w:val="single" w:sz="4" w:color="D9DEEA"/>
+              <w:left w:val="single" w:sz="4" w:color="D9DEEA"/>
+              <w:bottom w:val="single" w:sz="4" w:color="D9DEEA"/>
+              <w:right w:val="single" w:sz="4" w:color="D9DEEA"/>
+              <w:insideH w:val="single" w:sz="4" w:color="D9DEEA"/>
+              <w:insideV w:val="single" w:sz="4" w:color="D9DEEA"/>
+            </w:tcBorders>
+          </w:tcPr>
+          <w:p>
+            <w:r>
+              <w:t>Navigate from pixels/regions to objects without whole-document dumps</w:t>
+            </w:r>
+          </w:p>
+        </w:tc>
+      </w:tr>
+      <w:tr>
+        <w:tc>
+          <w:tcPr>
+            <w:tcW w:type="dxa" w:w="1800"/>
+            <w:shd w:fill="FFFFFF"/>
+            <w:tcMar>
+              <w:top w:w="80" w:type="dxa"/>
+              <w:start w:w="90" w:type="dxa"/>
+              <w:bottom w:w="80" w:type="dxa"/>
+              <w:end w:w="90" w:type="dxa"/>
+            </w:tcMar>
+            <w:tcBorders>
+              <w:top w:val="single" w:sz="4" w:color="D9DEEA"/>
+              <w:left w:val="single" w:sz="4" w:color="D9DEEA"/>
+              <w:bottom w:val="single" w:sz="4" w:color="D9DEEA"/>
+              <w:right w:val="single" w:sz="4" w:color="D9DEEA"/>
+              <w:insideH w:val="single" w:sz="4" w:color="D9DEEA"/>
+              <w:insideV w:val="single" w:sz="4" w:color="D9DEEA"/>
+            </w:tcBorders>
+          </w:tcPr>
+          <w:p>
+            <w:r>
+              <w:t>trace / replay</w:t>
+            </w:r>
+          </w:p>
+        </w:tc>
+        <w:tc>
+          <w:tcPr>
+            <w:tcW w:type="dxa" w:w="3528"/>
+            <w:shd w:fill="FFFFFF"/>
+            <w:tcMar>
+              <w:top w:w="80" w:type="dxa"/>
+              <w:start w:w="90" w:type="dxa"/>
+              <w:bottom w:w="80" w:type="dxa"/>
+              <w:end w:w="90" w:type="dxa"/>
+            </w:tcMar>
+            <w:tcBorders>
+              <w:top w:val="single" w:sz="4" w:color="D9DEEA"/>
+              <w:left w:val="single" w:sz="4" w:color="D9DEEA"/>
+              <w:bottom w:val="single" w:sz="4" w:color="D9DEEA"/>
+              <w:right w:val="single" w:sz="4" w:color="D9DEEA"/>
+              <w:insideH w:val="single" w:sz="4" w:color="D9DEEA"/>
+              <w:insideV w:val="single" w:sz="4" w:color="D9DEEA"/>
+            </w:tcBorders>
+          </w:tcPr>
+          <w:p>
+            <w:r>
+              <w:t>Record and reproduce deterministic engine decisions</w:t>
+            </w:r>
+          </w:p>
+        </w:tc>
+        <w:tc>
+          <w:tcPr>
+            <w:tcW w:type="dxa" w:w="4320"/>
+            <w:shd w:fill="FFFFFF"/>
+            <w:tcMar>
+              <w:top w:w="80" w:type="dxa"/>
+              <w:start w:w="90" w:type="dxa"/>
+              <w:bottom w:w="80" w:type="dxa"/>
+              <w:end w:w="90" w:type="dxa"/>
+            </w:tcMar>
+            <w:tcBorders>
+              <w:top w:val="single" w:sz="4" w:color="D9DEEA"/>
+              <w:left w:val="single" w:sz="4" w:color="D9DEEA"/>
+              <w:bottom w:val="single" w:sz="4" w:color="D9DEEA"/>
+              <w:right w:val="single" w:sz="4" w:color="D9DEEA"/>
+              <w:insideH w:val="single" w:sz="4" w:color="D9DEEA"/>
+              <w:insideV w:val="single" w:sz="4" w:color="D9DEEA"/>
+            </w:tcBorders>
+          </w:tcPr>
+          <w:p>
+            <w:r>
+              <w:t>Debug layout/raster differences and verify evidence</w:t>
+            </w:r>
+          </w:p>
+        </w:tc>
+      </w:tr>
     </w:tbl>
     <w:p>
       <w:pPr>
@@ -2095,6 +2386,38 @@
           <w:sz w:val="18"/>
         </w:rPr>
         <w:t>Pipeline mode: stdout remains data; diagnostics always go to stderr; --quiet removes progress output.</w:t>
+      </w:r>
+    </w:p>
+    <w:p>
+      <w:pPr>
+        <w:pStyle w:val="Heading2"/>
+      </w:pPr>
+      <w:r>
+        <w:t>2.3 Self-contained engine doctrine</w:t>
+      </w:r>
+    </w:p>
+    <w:p>
+      <w:pPr>
+        <w:pStyle w:val="ListBullet"/>
+      </w:pPr>
+      <w:r>
+        <w:t>The production binary owns the document path from source structures through DIR, layout/display lists and authoritative pixels.</w:t>
+      </w:r>
+    </w:p>
+    <w:p>
+      <w:pPr>
+        <w:pStyle w:val="ListBullet"/>
+      </w:pPr>
+      <w:r>
+        <w:t>No canonical operation may silently fall back to desktop Office software, an installed converter, a browser renderer or a remote service.</w:t>
+      </w:r>
+    </w:p>
+    <w:p>
+      <w:pPr>
+        <w:pStyle w:val="ListBullet"/>
+      </w:pPr>
+      <w:r>
+        <w:t>General-purpose parsing/codec/shaping libraries may be temporary replaceable primitives; they do not define DOCSIGHT semantics, geometry, IDs or evidence contracts.</w:t>
       </w:r>
     </w:p>
     <w:p>
@@ -2510,6 +2833,130 @@
           <w:sz w:val="16"/>
         </w:rPr>
         <w:t>sha256(file) + source-path -&gt; deterministic 128-bit object id</w:t>
+      </w:r>
+    </w:p>
+    <w:p>
+      <w:pPr>
+        <w:pStyle w:val="Heading2"/>
+      </w:pPr>
+      <w:r>
+        <w:t>3.4 Evidence graph and bidirectional provenance</w:t>
+      </w:r>
+    </w:p>
+    <w:p>
+      <w:pPr/>
+      <w:r>
+        <w:t>The DIR is not only a normalized representation; it is the center of an evidence graph. When knowable, every agent-visible fact can be traced backward to its source representation and forward to the geometry/display operations that produced visual evidence. The intended chain is source bytes or OOXML/PDF objects → semantic object → layout geometry → display list → pixels. Reverse inspection must also be possible: pixels or page coordinates → geometry → semantic object → source provenance.</w:t>
+      </w:r>
+    </w:p>
+    <w:p>
+      <w:pPr>
+        <w:pStyle w:val="CodeBlock"/>
+        <w:shd w:fill="0E1424"/>
+        <w:pBdr>
+          <w:bottom w:val="single" w:sz="2" w:space="1" w:color="2B3658"/>
+        </w:pBdr>
+      </w:pPr>
+      <w:r>
+        <w:rPr>
+          <w:rFonts w:ascii="Liberation Mono" w:hAnsi="Liberation Mono"/>
+          <w:b w:val="0"/>
+          <w:color w:val="DDE4FF"/>
+          <w:sz w:val="16"/>
+        </w:rPr>
+        <w:t>docsight evidence contract.docx tbl_0008 --json</w:t>
+        <w:br/>
+        <w:t>docsight hit contract.docx --page 7 --point 341,287 --json</w:t>
+      </w:r>
+    </w:p>
+    <w:p>
+      <w:pPr/>
+      <w:r>
+        <w:t>Evidence records may include document digest, source part/object identity, normalized semantic path, object IDs, page/bbox, render fingerprint and crop digest. Missing links must be explicit rather than fabricated.</w:t>
+      </w:r>
+    </w:p>
+    <w:p>
+      <w:pPr>
+        <w:pStyle w:val="Heading2"/>
+      </w:pPr>
+      <w:r>
+        <w:t>3.5 Fidelity profile</w:t>
+      </w:r>
+    </w:p>
+    <w:p>
+      <w:pPr/>
+      <w:r>
+        <w:t>A single confidence number is insufficient for document inspection. Inference confidence remains valid for inferred facts such as PDF tables or reading order, while fidelity is reported independently across text, structure, geometry and visual rendering. A document may have exact text and table structure while font substitution makes pagination or pixel appearance less certain.</w:t>
+      </w:r>
+    </w:p>
+    <w:p>
+      <w:pPr>
+        <w:pStyle w:val="CodeBlock"/>
+        <w:shd w:fill="0E1424"/>
+        <w:pBdr>
+          <w:bottom w:val="single" w:sz="2" w:space="1" w:color="2B3658"/>
+        </w:pBdr>
+      </w:pPr>
+      <w:r>
+        <w:rPr>
+          <w:rFonts w:ascii="Liberation Mono" w:hAnsi="Liberation Mono"/>
+          <w:b w:val="0"/>
+          <w:color w:val="DDE4FF"/>
+          <w:sz w:val="16"/>
+        </w:rPr>
+        <w:t>FidelityProfile {</w:t>
+        <w:br/>
+        <w:t xml:space="preserve">  text: 1.000,</w:t>
+        <w:br/>
+        <w:t xml:space="preserve">  structure: 1.000,</w:t>
+        <w:br/>
+        <w:t xml:space="preserve">  geometry: 0.943,</w:t>
+        <w:br/>
+        <w:t xml:space="preserve">  visual: 0.812,</w:t>
+        <w:br/>
+        <w:t xml:space="preserve">  reasons: ["DOCX_FONT_SUBSTITUTED"]</w:t>
+        <w:br/>
+        <w:t>}</w:t>
+      </w:r>
+    </w:p>
+    <w:p>
+      <w:pPr>
+        <w:pStyle w:val="Heading2"/>
+      </w:pPr>
+      <w:r>
+        <w:t>3.6 Evidence invariants</w:t>
+      </w:r>
+    </w:p>
+    <w:p>
+      <w:pPr>
+        <w:pStyle w:val="ListBullet"/>
+      </w:pPr>
+      <w:r>
+        <w:t>Truth before completeness: unsupported evidence stays visible as unknown/opaque/partial instead of being silently normalized away.</w:t>
+      </w:r>
+    </w:p>
+    <w:p>
+      <w:pPr>
+        <w:pStyle w:val="ListBullet"/>
+      </w:pPr>
+      <w:r>
+        <w:t>One geometry transform: page coordinates, crop, render, hit-testing and visual diff share the same canonical mapping.</w:t>
+      </w:r>
+    </w:p>
+    <w:p>
+      <w:pPr>
+        <w:pStyle w:val="ListBullet"/>
+      </w:pPr>
+      <w:r>
+        <w:t>Deterministic identity and provenance are separate from probabilistic inference; confidence never substitutes for source identity.</w:t>
+      </w:r>
+    </w:p>
+    <w:p>
+      <w:pPr>
+        <w:pStyle w:val="ListBullet"/>
+      </w:pPr>
+      <w:r>
+        <w:t>The same document bytes, engine fingerprint, resources and options must produce the same externally observable records and visual artifacts.</w:t>
       </w:r>
     </w:p>
     <w:p>
@@ -4016,7 +4463,7 @@
         <w:rPr>
           <w:rFonts w:ascii="Aptos" w:hAnsi="Aptos"/>
         </w:rPr>
-        <w:t>PDF is already page-oriented, so the challenge is different: preserve visual truth while reconstructing semantic reading order. DOCSIGHT uses a native PDF engine backend for rasterization and object extraction, isolated behind a small C ABI boundary.</w:t>
+        <w:t>PDF is already page-oriented, so the challenge is different: preserve visual truth while reconstructing semantic reading order. DOCSIGHT owns an in-tree PDF syntax parser, object/page model, content-stream interpreter, reconstruction pipeline and authoritative raster path. No external document engine is required for production parsing, geometry or rendering.</w:t>
       </w:r>
     </w:p>
     <w:p>
@@ -4032,7 +4479,21 @@
         <w:rPr>
           <w:rFonts w:ascii="Aptos" w:hAnsi="Aptos"/>
         </w:rPr>
-        <w:t>Preferred production backend: MuPDF compiled as a pinned native dependency and wrapped by the Rust core. A secondary pure-Rust metadata path may use lopdf for lightweight tasks, but all page rendering and authoritative geometry should come from one pinned engine to keep outputs stable.</w:t>
+        <w:t>Authoritative production backend: the in-tree docsight-pdf engine. It owns syntax parsing, xref/object resolution, page-tree traversal, content-stream interpretation, text span extraction, semantic reconstruction, display-list construction and rasterization. Production paths must not invoke MuPDF, Poppler, PDFium, Ghostscript, browser engines or remote converters. General-purpose compression, image and font primitives may remain behind narrow adapters while they are hardened or replaced. Optional C/C++ modules may be introduced later only as in-tree implementation components behind a small audited ABI when measurements justify them; they are not a substitute for owning the document engine.</w:t>
+      </w:r>
+    </w:p>
+    <w:p>
+      <w:pPr>
+        <w:pStyle w:val="Heading2"/>
+      </w:pPr>
+      <w:r>
+        <w:t>6.1.1 PDF engine ownership boundary</w:t>
+      </w:r>
+    </w:p>
+    <w:p>
+      <w:pPr/>
+      <w:r>
+        <w:t>The public DIR, normalized coordinates, reading-order semantics and raster transforms are defined by DOCSIGHT. Library-specific types never escape adapters. External document engines may be used only as explicit development or test oracles and are never linked into, invoked by, or required for the normal executable.</w:t>
       </w:r>
     </w:p>
     <w:p>
@@ -4312,7 +4773,7 @@
                 <w:color w:val="172033"/>
                 <w:sz w:val="18"/>
               </w:rPr>
-              <w:t>A scanned page is reported as image-only. Optional OCR can be enabled explicitly via a plugin/backend. OCR text must be tagged as inferred evidence and never be indistinguishable from embedded PDF text.</w:t>
+              <w:t>A scanned page is reported as image-only. Optional OCR can be enabled explicitly through a plugin/backend. OCR text must be tagged as inferred evidence, its backend identity must be recorded, and it must never be indistinguishable from embedded PDF text or become a hidden core dependency.</w:t>
             </w:r>
           </w:p>
         </w:tc>
@@ -4767,6 +5228,38 @@
           <w:sz w:val="16"/>
         </w:rPr>
         <w:t>Warnings     none</w:t>
+      </w:r>
+    </w:p>
+    <w:p>
+      <w:pPr>
+        <w:pStyle w:val="Heading2"/>
+      </w:pPr>
+      <w:r>
+        <w:t>7.4 Layout causality</w:t>
+      </w:r>
+    </w:p>
+    <w:p>
+      <w:pPr/>
+      <w:r>
+        <w:t>For DOCX, explain may expose the causal decisions that produced geometry: computed style provenance, resolved fonts and glyph metrics, available line width, selected line-break candidates, table intrinsic widths, keep-with-next/keep-lines decisions, remaining page height and the exact pagination action. The goal is for an agent to answer not only “where is it?” but “why did it end up there?” without opening Word.</w:t>
+      </w:r>
+    </w:p>
+    <w:p>
+      <w:pPr>
+        <w:pStyle w:val="CodeBlock"/>
+        <w:shd w:fill="0E1424"/>
+        <w:pBdr>
+          <w:bottom w:val="single" w:sz="2" w:space="1" w:color="2B3658"/>
+        </w:pBdr>
+      </w:pPr>
+      <w:r>
+        <w:rPr>
+          <w:rFonts w:ascii="Liberation Mono" w:hAnsi="Liberation Mono"/>
+          <w:b w:val="0"/>
+          <w:color w:val="DDE4FF"/>
+          <w:sz w:val="16"/>
+        </w:rPr>
+        <w:t>docsight explain report.docx p_0187 --layout --json</w:t>
       </w:r>
     </w:p>
     <w:p>
@@ -5645,8 +6138,105 @@
       </w:r>
     </w:p>
     <w:p>
-      <w:r>
-        <w:br w:type="page"/>
+      <w:pPr>
+        <w:pStyle w:val="Heading2"/>
+      </w:pPr>
+      <w:r>
+        <w:t>9.5 Reverse hit-testing</w:t>
+      </w:r>
+    </w:p>
+    <w:p>
+      <w:pPr/>
+      <w:r>
+        <w:t>hit is the inverse of object-aware crop: a page point or rectangle resolves the visible object stack and, where available, the run/cell/span/source objects behind it. Rendering and hit-testing use the same authoritative page transform.</w:t>
+      </w:r>
+    </w:p>
+    <w:p>
+      <w:pPr>
+        <w:pStyle w:val="CodeBlock"/>
+        <w:shd w:fill="0E1424"/>
+        <w:pBdr>
+          <w:bottom w:val="single" w:sz="2" w:space="1" w:color="2B3658"/>
+        </w:pBdr>
+      </w:pPr>
+      <w:r>
+        <w:rPr>
+          <w:rFonts w:ascii="Liberation Mono" w:hAnsi="Liberation Mono"/>
+          <w:b w:val="0"/>
+          <w:color w:val="DDE4FF"/>
+          <w:sz w:val="16"/>
+        </w:rPr>
+        <w:t>docsight hit file.docx --page 7 --point 341,287</w:t>
+        <w:br/>
+        <w:t>docsight hit file.pdf --page 4 --bbox 120,300,400,500 --json</w:t>
+      </w:r>
+    </w:p>
+    <w:p>
+      <w:pPr>
+        <w:pStyle w:val="Heading2"/>
+      </w:pPr>
+      <w:r>
+        <w:t>9.6 Coverage maps</w:t>
+      </w:r>
+    </w:p>
+    <w:p>
+      <w:pPr/>
+      <w:r>
+        <w:t>coverage reports where text, structure, geometry or visual fidelity is reduced, globally and by page/object. Unsupported or approximated content remains an addressable region with reason codes instead of disappearing into a generic warning.</w:t>
+      </w:r>
+    </w:p>
+    <w:p>
+      <w:pPr>
+        <w:pStyle w:val="CodeBlock"/>
+        <w:shd w:fill="0E1424"/>
+        <w:pBdr>
+          <w:bottom w:val="single" w:sz="2" w:space="1" w:color="2B3658"/>
+        </w:pBdr>
+      </w:pPr>
+      <w:r>
+        <w:rPr>
+          <w:rFonts w:ascii="Liberation Mono" w:hAnsi="Liberation Mono"/>
+          <w:b w:val="0"/>
+          <w:color w:val="DDE4FF"/>
+          <w:sz w:val="16"/>
+        </w:rPr>
+        <w:t>docsight coverage file.docx --json</w:t>
+        <w:br/>
+        <w:t>docsight coverage file.pdf --page 11 --regions --json</w:t>
+      </w:r>
+    </w:p>
+    <w:p>
+      <w:pPr>
+        <w:pStyle w:val="Heading2"/>
+      </w:pPr>
+      <w:r>
+        <w:t>9.7 Verifiable evidence bundles</w:t>
+      </w:r>
+    </w:p>
+    <w:p>
+      <w:pPr/>
+      <w:r>
+        <w:t>A proof bundle is a local deterministic package for one object/region: semantic record, source provenance, geometry, safe source fragment, render fingerprint and optional crop. Bundles are content-addressed and verifiable offline.</w:t>
+      </w:r>
+    </w:p>
+    <w:p>
+      <w:pPr>
+        <w:pStyle w:val="CodeBlock"/>
+        <w:shd w:fill="0E1424"/>
+        <w:pBdr>
+          <w:bottom w:val="single" w:sz="2" w:space="1" w:color="2B3658"/>
+        </w:pBdr>
+      </w:pPr>
+      <w:r>
+        <w:rPr>
+          <w:rFonts w:ascii="Liberation Mono" w:hAnsi="Liberation Mono"/>
+          <w:b w:val="0"/>
+          <w:color w:val="DDE4FF"/>
+          <w:sz w:val="16"/>
+        </w:rPr>
+        <w:t>docsight bundle contract.docx --object tbl_0008 --out tbl_0008.dse</w:t>
+        <w:br/>
+        <w:t>docsight verify tbl_0008.dse --json</w:t>
       </w:r>
     </w:p>
     <w:p>
@@ -6481,6 +7071,80 @@
     </w:tbl>
     <w:p>
       <w:pPr>
+        <w:pStyle w:val="Heading2"/>
+      </w:pPr>
+      <w:r>
+        <w:t>11.4 Spatial DQL</w:t>
+      </w:r>
+    </w:p>
+    <w:p>
+      <w:pPr/>
+      <w:r>
+        <w:t>DQL grows from structural selection into deterministic spatial queries over canonical page geometry. Spatial operators operate in points and never depend on guessed raster coordinates.</w:t>
+      </w:r>
+    </w:p>
+    <w:p>
+      <w:pPr>
+        <w:pStyle w:val="CodeBlock"/>
+        <w:shd w:fill="0E1424"/>
+        <w:pBdr>
+          <w:bottom w:val="single" w:sz="2" w:space="1" w:color="2B3658"/>
+        </w:pBdr>
+      </w:pPr>
+      <w:r>
+        <w:rPr>
+          <w:rFonts w:ascii="Liberation Mono" w:hAnsi="Liberation Mono"/>
+          <w:b w:val="0"/>
+          <w:color w:val="DDE4FF"/>
+          <w:sz w:val="16"/>
+        </w:rPr>
+        <w:t>docsight query file.docx 'table below(heading contains("Revenue"))'</w:t>
+        <w:br/>
+        <w:t>docsight query file.pdf 'figure nearest(caption)'</w:t>
+        <w:br/>
+        <w:t>docsight query file.docx 'paragraph overlaps(watermark)'</w:t>
+        <w:br/>
+        <w:t>docsight query file.pdf 'object distance-to(tbl_0008) &lt; 24pt'</w:t>
+      </w:r>
+    </w:p>
+    <w:p>
+      <w:pPr>
+        <w:pStyle w:val="Heading2"/>
+      </w:pPr>
+      <w:r>
+        <w:t>11.5 Agent viewport and semantic focus</w:t>
+      </w:r>
+    </w:p>
+    <w:p>
+      <w:pPr/>
+      <w:r>
+        <w:t>Large documents should be navigated progressively rather than serialized wholesale. overview/focus operations return a bounded semantic neighborhood around a heading, table, figure or page range: parents, nearby reading-order objects, related captions/notes and low-resolution visual references. This is a semantic zoom mechanism layered on the existing continuation-token protocol.</w:t>
+      </w:r>
+    </w:p>
+    <w:p>
+      <w:pPr>
+        <w:pStyle w:val="CodeBlock"/>
+        <w:shd w:fill="0E1424"/>
+        <w:pBdr>
+          <w:bottom w:val="single" w:sz="2" w:space="1" w:color="2B3658"/>
+        </w:pBdr>
+      </w:pPr>
+      <w:r>
+        <w:rPr>
+          <w:rFonts w:ascii="Liberation Mono" w:hAnsi="Liberation Mono"/>
+          <w:b w:val="0"/>
+          <w:color w:val="DDE4FF"/>
+          <w:sz w:val="16"/>
+        </w:rPr>
+        <w:t>docsight overview dissertation.pdf --json</w:t>
+        <w:br/>
+        <w:t>docsight focus dissertation.pdf h2_004 --budget 24kb --json</w:t>
+        <w:br/>
+        <w:t>docsight focus dissertation.pdf tbl_0004 --related --json</w:t>
+      </w:r>
+    </w:p>
+    <w:p>
+      <w:pPr>
         <w:spacing w:after="0"/>
       </w:pPr>
     </w:p>
@@ -6766,6 +7430,54 @@
           <w:sz w:val="18"/>
         </w:rPr>
         <w:t>Layout regression score normalized by page area.</w:t>
+      </w:r>
+    </w:p>
+    <w:p>
+      <w:pPr>
+        <w:pStyle w:val="Heading2"/>
+      </w:pPr>
+      <w:r>
+        <w:t>12.3 Object identity and semantic lineage</w:t>
+      </w:r>
+    </w:p>
+    <w:p>
+      <w:pPr/>
+      <w:r>
+        <w:t>ObjectId remains deterministic and document-bound: changing file bytes may legitimately change every ObjectId. Diffing therefore introduces a separate LineageId/match record for cross-version correspondence. Lineage is evidence-backed and may be probabilistic; it can combine source paths, normalized text, style, geometry, table shape, image digests and neighborhood relationships. It never replaces the cryptographic identity of the current object.</w:t>
+      </w:r>
+    </w:p>
+    <w:p>
+      <w:pPr>
+        <w:pStyle w:val="CodeBlock"/>
+        <w:shd w:fill="0E1424"/>
+        <w:pBdr>
+          <w:bottom w:val="single" w:sz="2" w:space="1" w:color="2B3658"/>
+        </w:pBdr>
+      </w:pPr>
+      <w:r>
+        <w:rPr>
+          <w:rFonts w:ascii="Liberation Mono" w:hAnsi="Liberation Mono"/>
+          <w:b w:val="0"/>
+          <w:color w:val="DDE4FF"/>
+          <w:sz w:val="16"/>
+        </w:rPr>
+        <w:t>before: tbl_0008  object=X7A…  lineage=L12…</w:t>
+        <w:br/>
+        <w:t>after:  tbl_0011  object=B91…  lineage=L12…  match=0.982</w:t>
+      </w:r>
+    </w:p>
+    <w:p>
+      <w:pPr>
+        <w:pStyle w:val="Heading2"/>
+      </w:pPr>
+      <w:r>
+        <w:t>12.4 Evidence-aware diff</w:t>
+      </w:r>
+    </w:p>
+    <w:p>
+      <w:pPr/>
+      <w:r>
+        <w:t>Diff results should distinguish semantic change from uncertainty introduced by the engine itself. A font substitution, unsupported shape or low-confidence PDF reconstruction must not be reported as an authoritative content change without carrying the relevant fidelity/evidence diagnostics.</w:t>
       </w:r>
     </w:p>
     <w:p>
@@ -7174,12 +7886,7 @@
           </w:tcPr>
           <w:p>
             <w:r>
-              <w:rPr>
-                <w:rFonts w:ascii="Aptos" w:hAnsi="Aptos"/>
-                <w:color w:val="172033"/>
-                <w:sz w:val="16"/>
-              </w:rPr>
-              <w:t>Native backend isolated in optional worker process</w:t>
+              <w:t>In-tree PDF parser/rasterizer can run in an isolated worker process with memory/CPU/file/network limits</w:t>
             </w:r>
           </w:p>
         </w:tc>
@@ -7462,10 +8169,15 @@
           <w:sz w:val="16"/>
         </w:rPr>
         <w:t>docsight inspect suspicious.pdf --sandbox</w:t>
-      </w:r>
-      <w:r>
         <w:br/>
-      </w:r>
+        <w:br/>
+        <w:t>parent docsight</w:t>
+        <w:br/>
+        <w:t xml:space="preserve">  └─ docsight-worker [memory 768 MiB, cpu 30 s, no network, temp dir only]</w:t>
+        <w:br/>
+        <w:t xml:space="preserve">       └─ in-tree PDF parser/rasterizer + bounded image/font decoders</w:t>
+      </w:r>
+      <w:r/>
       <w:r>
         <w:rPr>
           <w:rFonts w:ascii="Liberation Mono" w:hAnsi="Liberation Mono"/>
@@ -7474,9 +8186,7 @@
           <w:sz w:val="16"/>
         </w:rPr>
       </w:r>
-      <w:r>
-        <w:br/>
-      </w:r>
+      <w:r/>
       <w:r>
         <w:rPr>
           <w:rFonts w:ascii="Liberation Mono" w:hAnsi="Liberation Mono"/>
@@ -7484,11 +8194,8 @@
           <w:color w:val="DDE4FF"/>
           <w:sz w:val="16"/>
         </w:rPr>
-        <w:t>parent docsight</w:t>
-      </w:r>
-      <w:r>
-        <w:br/>
-      </w:r>
+      </w:r>
+      <w:r/>
       <w:r>
         <w:rPr>
           <w:rFonts w:ascii="Liberation Mono" w:hAnsi="Liberation Mono"/>
@@ -7496,11 +8203,8 @@
           <w:color w:val="DDE4FF"/>
           <w:sz w:val="16"/>
         </w:rPr>
-        <w:t xml:space="preserve">  └─ docsight-worker [memory 768 MiB, cpu 30 s, no network, temp dir only]</w:t>
-      </w:r>
-      <w:r>
-        <w:br/>
-      </w:r>
+      </w:r>
+      <w:r/>
       <w:r>
         <w:rPr>
           <w:rFonts w:ascii="Liberation Mono" w:hAnsi="Liberation Mono"/>
@@ -7508,7 +8212,6 @@
           <w:color w:val="DDE4FF"/>
           <w:sz w:val="16"/>
         </w:rPr>
-        <w:t xml:space="preserve">       └─ MuPDF / image decoders</w:t>
       </w:r>
     </w:p>
     <w:p>
@@ -7517,6 +8220,20 @@
           <w:rFonts w:ascii="Aptos" w:hAnsi="Aptos"/>
         </w:rPr>
         <w:t>On Linux, the worker can use namespaces/seccomp where available. On Windows, use Job Objects and restricted tokens. Failure of the worker becomes a typed backend error instead of taking down the caller.</w:t>
+      </w:r>
+    </w:p>
+    <w:p>
+      <w:pPr>
+        <w:pStyle w:val="Heading2"/>
+      </w:pPr>
+      <w:r>
+        <w:t>13.3 Engine-independence security rule</w:t>
+      </w:r>
+    </w:p>
+    <w:p>
+      <w:pPr/>
+      <w:r>
+        <w:t>No parser may fall back to an installed desktop application, browser, shell converter or network service when the canonical engine rejects a file. Unsupported or malformed content fails closed with typed diagnostics. This keeps the security boundary, evidence provenance and reproducibility fingerprint observable to the caller.</w:t>
       </w:r>
     </w:p>
     <w:p>
@@ -7548,10 +8265,44 @@
           <w:sz w:val="16"/>
         </w:rPr>
         <w:t>docsight/</w:t>
-      </w:r>
-      <w:r>
         <w:br/>
-      </w:r>
+        <w:t>├── crates/</w:t>
+        <w:br/>
+        <w:t>│   ├── docsight-cli/          # clap interface, human formatting</w:t>
+        <w:br/>
+        <w:t>│   ├── docsight-agent/        # JSON/NDJSON schemas, bounded navigation</w:t>
+        <w:br/>
+        <w:t>│   ├── docsight-core/         # IDs, geometry, DIR, fidelity, provenance</w:t>
+        <w:br/>
+        <w:t>│   ├── docsight-ooxml/        # bounded OPC + OOXML parser</w:t>
+        <w:br/>
+        <w:t>│   ├── docsight-layout/       # deterministic DOCX pagination/layout</w:t>
+        <w:br/>
+        <w:t>│   ├── docsight-pdf/          # in-tree PDF syntax/content/reconstruction/raster</w:t>
+        <w:br/>
+        <w:t>│   ├── docsight-render/       # display lists, raster/crop/contact sheet/hit</w:t>
+        <w:br/>
+        <w:t>│   ├── docsight-fonts/        # font discovery, shaping, deterministic fallback</w:t>
+        <w:br/>
+        <w:t>│   ├── docsight-tables/       # PDF table inference + exports</w:t>
+        <w:br/>
+        <w:t>│   ├── docsight-search/       # text index, regex, DQL/spatial selectors</w:t>
+        <w:br/>
+        <w:t>│   ├── docsight-diff/         # semantic + visual diff + lineage</w:t>
+        <w:br/>
+        <w:t>│   ├── docsight-cache/        # content-addressed caches + proof artifacts</w:t>
+        <w:br/>
+        <w:t>│   └── docsight-worker/       # optional parser/decoder isolation boundary</w:t>
+        <w:br/>
+        <w:t>├── native/                    # optional in-tree C/C++ accelerators only when justified</w:t>
+        <w:br/>
+        <w:t>├── fixtures/                  # adversarial, conformance and golden documents</w:t>
+        <w:br/>
+        <w:t>├── schemas/                   # versioned JSON/evidence schema snapshots</w:t>
+        <w:br/>
+        <w:t>└── xtask/                     # release/build/golden/conformance tasks</w:t>
+      </w:r>
+      <w:r/>
       <w:r>
         <w:rPr>
           <w:rFonts w:ascii="Liberation Mono" w:hAnsi="Liberation Mono"/>
@@ -7559,11 +8310,8 @@
           <w:color w:val="DDE4FF"/>
           <w:sz w:val="16"/>
         </w:rPr>
-        <w:t>├── crates/</w:t>
-      </w:r>
-      <w:r>
-        <w:br/>
-      </w:r>
+      </w:r>
+      <w:r/>
       <w:r>
         <w:rPr>
           <w:rFonts w:ascii="Liberation Mono" w:hAnsi="Liberation Mono"/>
@@ -7571,11 +8319,8 @@
           <w:color w:val="DDE4FF"/>
           <w:sz w:val="16"/>
         </w:rPr>
-        <w:t>│   ├── docsight-cli/          # clap interface, human formatting</w:t>
-      </w:r>
-      <w:r>
-        <w:br/>
-      </w:r>
+      </w:r>
+      <w:r/>
       <w:r>
         <w:rPr>
           <w:rFonts w:ascii="Liberation Mono" w:hAnsi="Liberation Mono"/>
@@ -7583,11 +8328,8 @@
           <w:color w:val="DDE4FF"/>
           <w:sz w:val="16"/>
         </w:rPr>
-        <w:t>│   ├── docsight-agent/        # JSON/NDJSON schemas and continuation tokens</w:t>
-      </w:r>
-      <w:r>
-        <w:br/>
-      </w:r>
+      </w:r>
+      <w:r/>
       <w:r>
         <w:rPr>
           <w:rFonts w:ascii="Liberation Mono" w:hAnsi="Liberation Mono"/>
@@ -7595,11 +8337,8 @@
           <w:color w:val="DDE4FF"/>
           <w:sz w:val="16"/>
         </w:rPr>
-        <w:t>│   ├── docsight-core/         # IDs, geometry, DIR, diagnostics</w:t>
-      </w:r>
-      <w:r>
-        <w:br/>
-      </w:r>
+      </w:r>
+      <w:r/>
       <w:r>
         <w:rPr>
           <w:rFonts w:ascii="Liberation Mono" w:hAnsi="Liberation Mono"/>
@@ -7607,11 +8346,8 @@
           <w:color w:val="DDE4FF"/>
           <w:sz w:val="16"/>
         </w:rPr>
-        <w:t>│   ├── docsight-ooxml/        # OPC + OOXML parser</w:t>
-      </w:r>
-      <w:r>
-        <w:br/>
-      </w:r>
+      </w:r>
+      <w:r/>
       <w:r>
         <w:rPr>
           <w:rFonts w:ascii="Liberation Mono" w:hAnsi="Liberation Mono"/>
@@ -7619,11 +8355,8 @@
           <w:color w:val="DDE4FF"/>
           <w:sz w:val="16"/>
         </w:rPr>
-        <w:t>│   ├── docsight-layout/       # DOCX pagination/layout engine</w:t>
-      </w:r>
-      <w:r>
-        <w:br/>
-      </w:r>
+      </w:r>
+      <w:r/>
       <w:r>
         <w:rPr>
           <w:rFonts w:ascii="Liberation Mono" w:hAnsi="Liberation Mono"/>
@@ -7631,11 +8364,8 @@
           <w:color w:val="DDE4FF"/>
           <w:sz w:val="16"/>
         </w:rPr>
-        <w:t>│   ├── docsight-pdf/          # PDF backend abstraction + MuPDF FFI</w:t>
-      </w:r>
-      <w:r>
-        <w:br/>
-      </w:r>
+      </w:r>
+      <w:r/>
       <w:r>
         <w:rPr>
           <w:rFonts w:ascii="Liberation Mono" w:hAnsi="Liberation Mono"/>
@@ -7643,11 +8373,8 @@
           <w:color w:val="DDE4FF"/>
           <w:sz w:val="16"/>
         </w:rPr>
-        <w:t>│   ├── docsight-render/       # display lists, raster/crop/contact sheet</w:t>
-      </w:r>
-      <w:r>
-        <w:br/>
-      </w:r>
+      </w:r>
+      <w:r/>
       <w:r>
         <w:rPr>
           <w:rFonts w:ascii="Liberation Mono" w:hAnsi="Liberation Mono"/>
@@ -7655,11 +8382,8 @@
           <w:color w:val="DDE4FF"/>
           <w:sz w:val="16"/>
         </w:rPr>
-        <w:t>│   ├── docsight-fonts/        # font discovery, shaping, fallback</w:t>
-      </w:r>
-      <w:r>
-        <w:br/>
-      </w:r>
+      </w:r>
+      <w:r/>
       <w:r>
         <w:rPr>
           <w:rFonts w:ascii="Liberation Mono" w:hAnsi="Liberation Mono"/>
@@ -7667,11 +8391,8 @@
           <w:color w:val="DDE4FF"/>
           <w:sz w:val="16"/>
         </w:rPr>
-        <w:t>│   ├── docsight-tables/       # PDF table inference + exports</w:t>
-      </w:r>
-      <w:r>
-        <w:br/>
-      </w:r>
+      </w:r>
+      <w:r/>
       <w:r>
         <w:rPr>
           <w:rFonts w:ascii="Liberation Mono" w:hAnsi="Liberation Mono"/>
@@ -7679,11 +8400,8 @@
           <w:color w:val="DDE4FF"/>
           <w:sz w:val="16"/>
         </w:rPr>
-        <w:t>│   ├── docsight-search/       # text index, regex, DQL</w:t>
-      </w:r>
-      <w:r>
-        <w:br/>
-      </w:r>
+      </w:r>
+      <w:r/>
       <w:r>
         <w:rPr>
           <w:rFonts w:ascii="Liberation Mono" w:hAnsi="Liberation Mono"/>
@@ -7691,11 +8409,8 @@
           <w:color w:val="DDE4FF"/>
           <w:sz w:val="16"/>
         </w:rPr>
-        <w:t>│   ├── docsight-diff/         # semantic + visual diff</w:t>
-      </w:r>
-      <w:r>
-        <w:br/>
-      </w:r>
+      </w:r>
+      <w:r/>
       <w:r>
         <w:rPr>
           <w:rFonts w:ascii="Liberation Mono" w:hAnsi="Liberation Mono"/>
@@ -7703,11 +8418,8 @@
           <w:color w:val="DDE4FF"/>
           <w:sz w:val="16"/>
         </w:rPr>
-        <w:t>│   ├── docsight-cache/        # content-addressed caches</w:t>
-      </w:r>
-      <w:r>
-        <w:br/>
-      </w:r>
+      </w:r>
+      <w:r/>
       <w:r>
         <w:rPr>
           <w:rFonts w:ascii="Liberation Mono" w:hAnsi="Liberation Mono"/>
@@ -7715,11 +8427,8 @@
           <w:color w:val="DDE4FF"/>
           <w:sz w:val="16"/>
         </w:rPr>
-        <w:t>│   └── docsight-worker/       # isolation boundary</w:t>
-      </w:r>
-      <w:r>
-        <w:br/>
-      </w:r>
+      </w:r>
+      <w:r/>
       <w:r>
         <w:rPr>
           <w:rFonts w:ascii="Liberation Mono" w:hAnsi="Liberation Mono"/>
@@ -7727,11 +8436,8 @@
           <w:color w:val="DDE4FF"/>
           <w:sz w:val="16"/>
         </w:rPr>
-        <w:t>├── native/                    # pinned MuPDF build integration</w:t>
-      </w:r>
-      <w:r>
-        <w:br/>
-      </w:r>
+      </w:r>
+      <w:r/>
       <w:r>
         <w:rPr>
           <w:rFonts w:ascii="Liberation Mono" w:hAnsi="Liberation Mono"/>
@@ -7739,11 +8445,8 @@
           <w:color w:val="DDE4FF"/>
           <w:sz w:val="16"/>
         </w:rPr>
-        <w:t>├── fixtures/                  # adversarial and golden documents</w:t>
-      </w:r>
-      <w:r>
-        <w:br/>
-      </w:r>
+      </w:r>
+      <w:r/>
       <w:r>
         <w:rPr>
           <w:rFonts w:ascii="Liberation Mono" w:hAnsi="Liberation Mono"/>
@@ -7751,11 +8454,8 @@
           <w:color w:val="DDE4FF"/>
           <w:sz w:val="16"/>
         </w:rPr>
-        <w:t>├── schemas/                   # JSON schema snapshots</w:t>
-      </w:r>
-      <w:r>
-        <w:br/>
-      </w:r>
+      </w:r>
+      <w:r/>
       <w:r>
         <w:rPr>
           <w:rFonts w:ascii="Liberation Mono" w:hAnsi="Liberation Mono"/>
@@ -7763,7 +8463,6 @@
           <w:color w:val="DDE4FF"/>
           <w:sz w:val="16"/>
         </w:rPr>
-        <w:t>└── xtask/                     # release/build/golden-update tasks</w:t>
       </w:r>
     </w:p>
     <w:p>
@@ -7797,7 +8496,7 @@
           <w:rFonts w:ascii="Aptos" w:hAnsi="Aptos"/>
           <w:sz w:val="18"/>
         </w:rPr>
-        <w:t>Good FFI story for a mature native PDF engine.</w:t>
+        <w:t>Rust remains suitable for the authoritative engine, while a narrow audited C ABI can be exposed later for optional in-tree C/C++ modules or language bindings without moving document semantics outside DOCSIGHT.</w:t>
       </w:r>
     </w:p>
     <w:p>
@@ -7865,7 +8564,7 @@
         <w:rPr>
           <w:rFonts w:ascii="Aptos" w:hAnsi="Aptos"/>
         </w:rPr>
-        <w:t>No dependency gets to leak its data types into the public DIR. All backends are adapters. The goal is to be able to replace ZIP/XML/font/PDF libraries without redesigning the CLI protocol.</w:t>
+        <w:t>No dependency gets to leak its data types into the public DIR. General-purpose ZIP/XML/compression/image/font libraries are replaceable implementation details behind adapters. The goal is to be able to replace each primitive with an in-tree Rust, C or C++ implementation without redesigning the CLI, evidence model or schemas. Third-party document engines are not runtime adapters: they are outside the production trust boundary and may be used only as explicit development/test oracles.</w:t>
       </w:r>
     </w:p>
     <w:p>
@@ -8015,10 +8714,24 @@
           <w:sz w:val="16"/>
         </w:rPr>
         <w:t>$ docsight fingerprint file.docx</w:t>
-      </w:r>
-      <w:r>
         <w:br/>
-      </w:r>
+        <w:t>file_sha256       7f31a9d3…</w:t>
+        <w:br/>
+        <w:t>engine            docsight 1.1.0</w:t>
+        <w:br/>
+        <w:t>ooxml_engine      docsight-ooxml 0.x</w:t>
+        <w:br/>
+        <w:t>pdf_engine        docsight-pdf 0.x</w:t>
+        <w:br/>
+        <w:t>raster_engine     docsight-render 0.x</w:t>
+        <w:br/>
+        <w:t>fonts             1cb9d8…</w:t>
+        <w:br/>
+        <w:t>layout_profile    agent-fidelity-v1</w:t>
+        <w:br/>
+        <w:t>result_fingerprint 54fa1e7c…</w:t>
+      </w:r>
+      <w:r/>
       <w:r>
         <w:rPr>
           <w:rFonts w:ascii="Liberation Mono" w:hAnsi="Liberation Mono"/>
@@ -8026,11 +8739,8 @@
           <w:color w:val="DDE4FF"/>
           <w:sz w:val="16"/>
         </w:rPr>
-        <w:t>file_sha256       7f31a9d3…</w:t>
-      </w:r>
-      <w:r>
-        <w:br/>
-      </w:r>
+      </w:r>
+      <w:r/>
       <w:r>
         <w:rPr>
           <w:rFonts w:ascii="Liberation Mono" w:hAnsi="Liberation Mono"/>
@@ -8038,11 +8748,8 @@
           <w:color w:val="DDE4FF"/>
           <w:sz w:val="16"/>
         </w:rPr>
-        <w:t>engine            docsight 1.0.0</w:t>
-      </w:r>
-      <w:r>
-        <w:br/>
-      </w:r>
+      </w:r>
+      <w:r/>
       <w:r>
         <w:rPr>
           <w:rFonts w:ascii="Liberation Mono" w:hAnsi="Liberation Mono"/>
@@ -8050,11 +8757,8 @@
           <w:color w:val="DDE4FF"/>
           <w:sz w:val="16"/>
         </w:rPr>
-        <w:t>ooxml_backend     1.0</w:t>
-      </w:r>
-      <w:r>
-        <w:br/>
-      </w:r>
+      </w:r>
+      <w:r/>
       <w:r>
         <w:rPr>
           <w:rFonts w:ascii="Liberation Mono" w:hAnsi="Liberation Mono"/>
@@ -8062,11 +8766,8 @@
           <w:color w:val="DDE4FF"/>
           <w:sz w:val="16"/>
         </w:rPr>
-        <w:t>pdf_backend       mupdf 1.26.x-pinned</w:t>
-      </w:r>
-      <w:r>
-        <w:br/>
-      </w:r>
+      </w:r>
+      <w:r/>
       <w:r>
         <w:rPr>
           <w:rFonts w:ascii="Liberation Mono" w:hAnsi="Liberation Mono"/>
@@ -8074,11 +8775,8 @@
           <w:color w:val="DDE4FF"/>
           <w:sz w:val="16"/>
         </w:rPr>
-        <w:t>fonts             1cb9d8…</w:t>
-      </w:r>
-      <w:r>
-        <w:br/>
-      </w:r>
+      </w:r>
+      <w:r/>
       <w:r>
         <w:rPr>
           <w:rFonts w:ascii="Liberation Mono" w:hAnsi="Liberation Mono"/>
@@ -8086,11 +8784,8 @@
           <w:color w:val="DDE4FF"/>
           <w:sz w:val="16"/>
         </w:rPr>
-        <w:t>layout_profile     agent-fidelity-v1</w:t>
-      </w:r>
-      <w:r>
-        <w:br/>
-      </w:r>
+      </w:r>
+      <w:r/>
       <w:r>
         <w:rPr>
           <w:rFonts w:ascii="Liberation Mono" w:hAnsi="Liberation Mono"/>
@@ -8098,7 +8793,6 @@
           <w:color w:val="DDE4FF"/>
           <w:sz w:val="16"/>
         </w:rPr>
-        <w:t>result_fingerprint 54fa1e7c…</w:t>
       </w:r>
     </w:p>
     <w:p>
@@ -8115,6 +8809,40 @@
           <w:rFonts w:ascii="Aptos" w:hAnsi="Aptos"/>
         </w:rPr>
         <w:t>Pages may parse/render concurrently, but externally observable ordering is always canonical: page number, reading order, object ID. Diagnostics are sorted before emission. This prevents flaky agent behavior and snapshot tests.</w:t>
+      </w:r>
+    </w:p>
+    <w:p>
+      <w:pPr>
+        <w:pStyle w:val="Heading2"/>
+      </w:pPr>
+      <w:r>
+        <w:t>15.3 Deterministic trace and replay</w:t>
+      </w:r>
+    </w:p>
+    <w:p>
+      <w:pPr/>
+      <w:r>
+        <w:t>Debug and conformance builds can record a deterministic trace of the decisions required to reproduce a page or object: resolved resources, glyph metrics, line breaks, table sizing, pagination decisions, display-list operations and relevant fingerprints. replay consumes that trace and verifies that the same engine inputs produce the same normalized display list and raster result.</w:t>
+      </w:r>
+    </w:p>
+    <w:p>
+      <w:pPr>
+        <w:pStyle w:val="CodeBlock"/>
+        <w:shd w:fill="0E1424"/>
+        <w:pBdr>
+          <w:bottom w:val="single" w:sz="2" w:space="1" w:color="2B3658"/>
+        </w:pBdr>
+      </w:pPr>
+      <w:r>
+        <w:rPr>
+          <w:rFonts w:ascii="Liberation Mono" w:hAnsi="Liberation Mono"/>
+          <w:b w:val="0"/>
+          <w:color w:val="DDE4FF"/>
+          <w:sz w:val="16"/>
+        </w:rPr>
+        <w:t>docsight render file.docx --page 7 --trace page7.dstrace --out page7.png</w:t>
+        <w:br/>
+        <w:t>docsight replay page7.dstrace --verify --json</w:t>
       </w:r>
     </w:p>
     <w:p>
@@ -9293,6 +10021,20 @@
       </w:r>
     </w:p>
     <w:p>
+      <w:pPr>
+        <w:pStyle w:val="Heading2"/>
+      </w:pPr>
+      <w:r>
+        <w:t>16.2 Coverage is a diagnostic surface</w:t>
+      </w:r>
+    </w:p>
+    <w:p>
+      <w:pPr/>
+      <w:r>
+        <w:t>coverage aggregates diagnostics into an explicit map of understood, inferred, approximated and unsupported evidence. The command must never turn missing support into a false percentage of certainty: scores are accompanied by affected pages/objects and reason codes, and unknown regions remain enumerable.</w:t>
+      </w:r>
+    </w:p>
+    <w:p>
       <w:r>
         <w:br w:type="page"/>
       </w:r>
@@ -9964,6 +10706,214 @@
           </w:p>
         </w:tc>
       </w:tr>
+      <w:tr>
+        <w:tc>
+          <w:tcPr>
+            <w:tcW w:type="dxa" w:w="2520"/>
+            <w:shd w:fill="FFFFFF"/>
+            <w:tcMar>
+              <w:top w:w="80" w:type="dxa"/>
+              <w:start w:w="90" w:type="dxa"/>
+              <w:bottom w:w="80" w:type="dxa"/>
+              <w:end w:w="90" w:type="dxa"/>
+            </w:tcMar>
+            <w:tcBorders>
+              <w:top w:val="single" w:sz="4" w:color="D9DEEA"/>
+              <w:left w:val="single" w:sz="4" w:color="D9DEEA"/>
+              <w:bottom w:val="single" w:sz="4" w:color="D9DEEA"/>
+              <w:right w:val="single" w:sz="4" w:color="D9DEEA"/>
+              <w:insideH w:val="single" w:sz="4" w:color="D9DEEA"/>
+              <w:insideV w:val="single" w:sz="4" w:color="D9DEEA"/>
+            </w:tcBorders>
+          </w:tcPr>
+          <w:p>
+            <w:r>
+              <w:t>Evidence graph</w:t>
+            </w:r>
+          </w:p>
+        </w:tc>
+        <w:tc>
+          <w:tcPr>
+            <w:tcW w:type="dxa" w:w="7128"/>
+            <w:shd w:fill="FFFFFF"/>
+            <w:tcMar>
+              <w:top w:w="80" w:type="dxa"/>
+              <w:start w:w="90" w:type="dxa"/>
+              <w:bottom w:w="80" w:type="dxa"/>
+              <w:end w:w="90" w:type="dxa"/>
+            </w:tcMar>
+            <w:tcBorders>
+              <w:top w:val="single" w:sz="4" w:color="D9DEEA"/>
+              <w:left w:val="single" w:sz="4" w:color="D9DEEA"/>
+              <w:bottom w:val="single" w:sz="4" w:color="D9DEEA"/>
+              <w:right w:val="single" w:sz="4" w:color="D9DEEA"/>
+              <w:insideH w:val="single" w:sz="4" w:color="D9DEEA"/>
+              <w:insideV w:val="single" w:sz="4" w:color="D9DEEA"/>
+            </w:tcBorders>
+          </w:tcPr>
+          <w:p>
+            <w:r>
+              <w:t>Round-trip source→object→geometry→pixels and reverse hit-testing fixtures</w:t>
+            </w:r>
+          </w:p>
+        </w:tc>
+      </w:tr>
+      <w:tr>
+        <w:tc>
+          <w:tcPr>
+            <w:tcW w:type="dxa" w:w="2520"/>
+            <w:shd w:fill="FFFFFF"/>
+            <w:tcMar>
+              <w:top w:w="80" w:type="dxa"/>
+              <w:start w:w="90" w:type="dxa"/>
+              <w:bottom w:w="80" w:type="dxa"/>
+              <w:end w:w="90" w:type="dxa"/>
+            </w:tcMar>
+            <w:tcBorders>
+              <w:top w:val="single" w:sz="4" w:color="D9DEEA"/>
+              <w:left w:val="single" w:sz="4" w:color="D9DEEA"/>
+              <w:bottom w:val="single" w:sz="4" w:color="D9DEEA"/>
+              <w:right w:val="single" w:sz="4" w:color="D9DEEA"/>
+              <w:insideH w:val="single" w:sz="4" w:color="D9DEEA"/>
+              <w:insideV w:val="single" w:sz="4" w:color="D9DEEA"/>
+            </w:tcBorders>
+          </w:tcPr>
+          <w:p>
+            <w:r>
+              <w:t>Fidelity/coverage</w:t>
+            </w:r>
+          </w:p>
+        </w:tc>
+        <w:tc>
+          <w:tcPr>
+            <w:tcW w:type="dxa" w:w="7128"/>
+            <w:shd w:fill="FFFFFF"/>
+            <w:tcMar>
+              <w:top w:w="80" w:type="dxa"/>
+              <w:start w:w="90" w:type="dxa"/>
+              <w:bottom w:w="80" w:type="dxa"/>
+              <w:end w:w="90" w:type="dxa"/>
+            </w:tcMar>
+            <w:tcBorders>
+              <w:top w:val="single" w:sz="4" w:color="D9DEEA"/>
+              <w:left w:val="single" w:sz="4" w:color="D9DEEA"/>
+              <w:bottom w:val="single" w:sz="4" w:color="D9DEEA"/>
+              <w:right w:val="single" w:sz="4" w:color="D9DEEA"/>
+              <w:insideH w:val="single" w:sz="4" w:color="D9DEEA"/>
+              <w:insideV w:val="single" w:sz="4" w:color="D9DEEA"/>
+            </w:tcBorders>
+          </w:tcPr>
+          <w:p>
+            <w:r>
+              <w:t>Fixtures with known unsupported features and expected affected regions/reason codes</w:t>
+            </w:r>
+          </w:p>
+        </w:tc>
+      </w:tr>
+      <w:tr>
+        <w:tc>
+          <w:tcPr>
+            <w:tcW w:type="dxa" w:w="2520"/>
+            <w:shd w:fill="FFFFFF"/>
+            <w:tcMar>
+              <w:top w:w="80" w:type="dxa"/>
+              <w:start w:w="90" w:type="dxa"/>
+              <w:bottom w:w="80" w:type="dxa"/>
+              <w:end w:w="90" w:type="dxa"/>
+            </w:tcMar>
+            <w:tcBorders>
+              <w:top w:val="single" w:sz="4" w:color="D9DEEA"/>
+              <w:left w:val="single" w:sz="4" w:color="D9DEEA"/>
+              <w:bottom w:val="single" w:sz="4" w:color="D9DEEA"/>
+              <w:right w:val="single" w:sz="4" w:color="D9DEEA"/>
+              <w:insideH w:val="single" w:sz="4" w:color="D9DEEA"/>
+              <w:insideV w:val="single" w:sz="4" w:color="D9DEEA"/>
+            </w:tcBorders>
+          </w:tcPr>
+          <w:p>
+            <w:r>
+              <w:t>Trace/replay</w:t>
+            </w:r>
+          </w:p>
+        </w:tc>
+        <w:tc>
+          <w:tcPr>
+            <w:tcW w:type="dxa" w:w="7128"/>
+            <w:shd w:fill="FFFFFF"/>
+            <w:tcMar>
+              <w:top w:w="80" w:type="dxa"/>
+              <w:start w:w="90" w:type="dxa"/>
+              <w:bottom w:w="80" w:type="dxa"/>
+              <w:end w:w="90" w:type="dxa"/>
+            </w:tcMar>
+            <w:tcBorders>
+              <w:top w:val="single" w:sz="4" w:color="D9DEEA"/>
+              <w:left w:val="single" w:sz="4" w:color="D9DEEA"/>
+              <w:bottom w:val="single" w:sz="4" w:color="D9DEEA"/>
+              <w:right w:val="single" w:sz="4" w:color="D9DEEA"/>
+              <w:insideH w:val="single" w:sz="4" w:color="D9DEEA"/>
+              <w:insideV w:val="single" w:sz="4" w:color="D9DEEA"/>
+            </w:tcBorders>
+          </w:tcPr>
+          <w:p>
+            <w:r>
+              <w:t>Recorded traces reproduce canonical display lists and raster fingerprints</w:t>
+            </w:r>
+          </w:p>
+        </w:tc>
+      </w:tr>
+      <w:tr>
+        <w:tc>
+          <w:tcPr>
+            <w:tcW w:type="dxa" w:w="2520"/>
+            <w:shd w:fill="F6F7FA"/>
+            <w:tcMar>
+              <w:top w:w="80" w:type="dxa"/>
+              <w:start w:w="90" w:type="dxa"/>
+              <w:bottom w:w="80" w:type="dxa"/>
+              <w:end w:w="90" w:type="dxa"/>
+            </w:tcMar>
+            <w:tcBorders>
+              <w:top w:val="single" w:sz="4" w:color="D9DEEA"/>
+              <w:left w:val="single" w:sz="4" w:color="D9DEEA"/>
+              <w:bottom w:val="single" w:sz="4" w:color="D9DEEA"/>
+              <w:right w:val="single" w:sz="4" w:color="D9DEEA"/>
+              <w:insideH w:val="single" w:sz="4" w:color="D9DEEA"/>
+              <w:insideV w:val="single" w:sz="4" w:color="D9DEEA"/>
+            </w:tcBorders>
+          </w:tcPr>
+          <w:p>
+            <w:r>
+              <w:t>Lineage/diff</w:t>
+            </w:r>
+          </w:p>
+        </w:tc>
+        <w:tc>
+          <w:tcPr>
+            <w:tcW w:type="dxa" w:w="7128"/>
+            <w:shd w:fill="F6F7FA"/>
+            <w:tcMar>
+              <w:top w:w="80" w:type="dxa"/>
+              <w:start w:w="90" w:type="dxa"/>
+              <w:bottom w:w="80" w:type="dxa"/>
+              <w:end w:w="90" w:type="dxa"/>
+            </w:tcMar>
+            <w:tcBorders>
+              <w:top w:val="single" w:sz="4" w:color="D9DEEA"/>
+              <w:left w:val="single" w:sz="4" w:color="D9DEEA"/>
+              <w:bottom w:val="single" w:sz="4" w:color="D9DEEA"/>
+              <w:right w:val="single" w:sz="4" w:color="D9DEEA"/>
+              <w:insideH w:val="single" w:sz="4" w:color="D9DEEA"/>
+              <w:insideV w:val="single" w:sz="4" w:color="D9DEEA"/>
+            </w:tcBorders>
+          </w:tcPr>
+          <w:p>
+            <w:r>
+              <w:t>Curated before/after pairs with labeled object correspondences and ambiguity cases</w:t>
+            </w:r>
+          </w:p>
+        </w:tc>
+      </w:tr>
     </w:tbl>
     <w:p>
       <w:pPr>
@@ -9993,11 +10943,21 @@
           <w:color w:val="DDE4FF"/>
           <w:sz w:val="16"/>
         </w:rPr>
-        <w:t>fuzz_opc_container</w:t>
-      </w:r>
-      <w:r>
+        <w:t>fuzz_opc_container          fuzz_ooxml_relationships</w:t>
         <w:br/>
-      </w:r>
+        <w:t>fuzz_styles_cascade         fuzz_numbering</w:t>
+        <w:br/>
+        <w:t>fuzz_table_grid             fuzz_layout_paragraph</w:t>
+        <w:br/>
+        <w:t>fuzz_pdf_syntax             fuzz_pdf_xref</w:t>
+        <w:br/>
+        <w:t>fuzz_pdf_content_stream     fuzz_pdf_span_cluster</w:t>
+        <w:br/>
+        <w:t>fuzz_spatial_dql_parser     fuzz_hit_test</w:t>
+        <w:br/>
+        <w:t>fuzz_evidence_bundle_manifest</w:t>
+      </w:r>
+      <w:r/>
       <w:r>
         <w:rPr>
           <w:rFonts w:ascii="Liberation Mono" w:hAnsi="Liberation Mono"/>
@@ -10005,11 +10965,8 @@
           <w:color w:val="DDE4FF"/>
           <w:sz w:val="16"/>
         </w:rPr>
-        <w:t>fuzz_ooxml_relationships</w:t>
-      </w:r>
-      <w:r>
-        <w:br/>
-      </w:r>
+      </w:r>
+      <w:r/>
       <w:r>
         <w:rPr>
           <w:rFonts w:ascii="Liberation Mono" w:hAnsi="Liberation Mono"/>
@@ -10017,11 +10974,8 @@
           <w:color w:val="DDE4FF"/>
           <w:sz w:val="16"/>
         </w:rPr>
-        <w:t>fuzz_styles_cascade</w:t>
-      </w:r>
-      <w:r>
-        <w:br/>
-      </w:r>
+      </w:r>
+      <w:r/>
       <w:r>
         <w:rPr>
           <w:rFonts w:ascii="Liberation Mono" w:hAnsi="Liberation Mono"/>
@@ -10029,11 +10983,8 @@
           <w:color w:val="DDE4FF"/>
           <w:sz w:val="16"/>
         </w:rPr>
-        <w:t>fuzz_numbering</w:t>
-      </w:r>
-      <w:r>
-        <w:br/>
-      </w:r>
+      </w:r>
+      <w:r/>
       <w:r>
         <w:rPr>
           <w:rFonts w:ascii="Liberation Mono" w:hAnsi="Liberation Mono"/>
@@ -10041,11 +10992,8 @@
           <w:color w:val="DDE4FF"/>
           <w:sz w:val="16"/>
         </w:rPr>
-        <w:t>fuzz_table_grid</w:t>
-      </w:r>
-      <w:r>
-        <w:br/>
-      </w:r>
+      </w:r>
+      <w:r/>
       <w:r>
         <w:rPr>
           <w:rFonts w:ascii="Liberation Mono" w:hAnsi="Liberation Mono"/>
@@ -10053,11 +11001,8 @@
           <w:color w:val="DDE4FF"/>
           <w:sz w:val="16"/>
         </w:rPr>
-        <w:t>fuzz_layout_paragraph</w:t>
-      </w:r>
-      <w:r>
-        <w:br/>
-      </w:r>
+      </w:r>
+      <w:r/>
       <w:r>
         <w:rPr>
           <w:rFonts w:ascii="Liberation Mono" w:hAnsi="Liberation Mono"/>
@@ -10065,11 +11010,8 @@
           <w:color w:val="DDE4FF"/>
           <w:sz w:val="16"/>
         </w:rPr>
-        <w:t>fuzz_pdf_span_cluster</w:t>
-      </w:r>
-      <w:r>
-        <w:br/>
-      </w:r>
+      </w:r>
+      <w:r/>
       <w:r>
         <w:rPr>
           <w:rFonts w:ascii="Liberation Mono" w:hAnsi="Liberation Mono"/>
@@ -10077,7 +11019,6 @@
           <w:color w:val="DDE4FF"/>
           <w:sz w:val="16"/>
         </w:rPr>
-        <w:t>fuzz_dql_parser</w:t>
       </w:r>
     </w:p>
     <w:p>
@@ -10090,7 +11031,7 @@
         <w:pStyle w:val="Heading1"/>
       </w:pPr>
       <w:r>
-        <w:t>18. Roadmap: M0 → M9</w:t>
+        <w:t>18. Roadmap: M0 → M15</w:t>
       </w:r>
     </w:p>
     <w:tbl>
@@ -10204,6 +11145,9 @@
         </w:tc>
       </w:tr>
       <w:tr>
+        <w:trPr>
+          <w:cantSplit/>
+        </w:trPr>
         <w:tc>
           <w:tcPr>
             <w:tcW w:type="dxa" w:w="648"/>
@@ -10296,6 +11240,9 @@
         </w:tc>
       </w:tr>
       <w:tr>
+        <w:trPr>
+          <w:cantSplit/>
+        </w:trPr>
         <w:tc>
           <w:tcPr>
             <w:tcW w:type="dxa" w:w="648"/>
@@ -10388,6 +11335,9 @@
         </w:tc>
       </w:tr>
       <w:tr>
+        <w:trPr>
+          <w:cantSplit/>
+        </w:trPr>
         <w:tc>
           <w:tcPr>
             <w:tcW w:type="dxa" w:w="648"/>
@@ -10480,6 +11430,9 @@
         </w:tc>
       </w:tr>
       <w:tr>
+        <w:trPr>
+          <w:cantSplit/>
+        </w:trPr>
         <w:tc>
           <w:tcPr>
             <w:tcW w:type="dxa" w:w="648"/>
@@ -10572,6 +11525,9 @@
         </w:tc>
       </w:tr>
       <w:tr>
+        <w:trPr>
+          <w:cantSplit/>
+        </w:trPr>
         <w:tc>
           <w:tcPr>
             <w:tcW w:type="dxa" w:w="648"/>
@@ -10664,6 +11620,9 @@
         </w:tc>
       </w:tr>
       <w:tr>
+        <w:trPr>
+          <w:cantSplit/>
+        </w:trPr>
         <w:tc>
           <w:tcPr>
             <w:tcW w:type="dxa" w:w="648"/>
@@ -10756,6 +11715,9 @@
         </w:tc>
       </w:tr>
       <w:tr>
+        <w:trPr>
+          <w:cantSplit/>
+        </w:trPr>
         <w:tc>
           <w:tcPr>
             <w:tcW w:type="dxa" w:w="648"/>
@@ -10848,6 +11810,9 @@
         </w:tc>
       </w:tr>
       <w:tr>
+        <w:trPr>
+          <w:cantSplit/>
+        </w:trPr>
         <w:tc>
           <w:tcPr>
             <w:tcW w:type="dxa" w:w="648"/>
@@ -10940,6 +11905,9 @@
         </w:tc>
       </w:tr>
       <w:tr>
+        <w:trPr>
+          <w:cantSplit/>
+        </w:trPr>
         <w:tc>
           <w:tcPr>
             <w:tcW w:type="dxa" w:w="648"/>
@@ -11032,6 +12000,9 @@
         </w:tc>
       </w:tr>
       <w:tr>
+        <w:trPr>
+          <w:cantSplit/>
+        </w:trPr>
         <w:tc>
           <w:tcPr>
             <w:tcW w:type="dxa" w:w="648"/>
@@ -11123,11 +12094,497 @@
           </w:p>
         </w:tc>
       </w:tr>
+      <w:tr>
+        <w:trPr>
+          <w:cantSplit/>
+        </w:trPr>
+        <w:tc>
+          <w:tcPr>
+            <w:tcW w:type="dxa" w:w="648"/>
+            <w:shd w:fill="F6F7FA"/>
+            <w:tcMar>
+              <w:top w:w="80" w:type="dxa"/>
+              <w:start w:w="90" w:type="dxa"/>
+              <w:bottom w:w="80" w:type="dxa"/>
+              <w:end w:w="90" w:type="dxa"/>
+            </w:tcMar>
+            <w:tcBorders>
+              <w:top w:val="single" w:sz="4" w:color="D9DEEA"/>
+              <w:left w:val="single" w:sz="4" w:color="D9DEEA"/>
+              <w:bottom w:val="single" w:sz="4" w:color="D9DEEA"/>
+              <w:right w:val="single" w:sz="4" w:color="D9DEEA"/>
+              <w:insideH w:val="single" w:sz="4" w:color="D9DEEA"/>
+              <w:insideV w:val="single" w:sz="4" w:color="D9DEEA"/>
+            </w:tcBorders>
+          </w:tcPr>
+          <w:p>
+            <w:r>
+              <w:t>M10</w:t>
+            </w:r>
+          </w:p>
+        </w:tc>
+        <w:tc>
+          <w:tcPr>
+            <w:tcW w:type="dxa" w:w="4320"/>
+            <w:shd w:fill="F6F7FA"/>
+            <w:tcMar>
+              <w:top w:w="80" w:type="dxa"/>
+              <w:start w:w="90" w:type="dxa"/>
+              <w:bottom w:w="80" w:type="dxa"/>
+              <w:end w:w="90" w:type="dxa"/>
+            </w:tcMar>
+            <w:tcBorders>
+              <w:top w:val="single" w:sz="4" w:color="D9DEEA"/>
+              <w:left w:val="single" w:sz="4" w:color="D9DEEA"/>
+              <w:bottom w:val="single" w:sz="4" w:color="D9DEEA"/>
+              <w:right w:val="single" w:sz="4" w:color="D9DEEA"/>
+              <w:insideH w:val="single" w:sz="4" w:color="D9DEEA"/>
+              <w:insideV w:val="single" w:sz="4" w:color="D9DEEA"/>
+            </w:tcBorders>
+          </w:tcPr>
+          <w:p>
+            <w:r>
+              <w:t>Evidence graph + fidelity profiles</w:t>
+            </w:r>
+          </w:p>
+        </w:tc>
+        <w:tc>
+          <w:tcPr>
+            <w:tcW w:type="dxa" w:w="4680"/>
+            <w:shd w:fill="F6F7FA"/>
+            <w:tcMar>
+              <w:top w:w="80" w:type="dxa"/>
+              <w:start w:w="90" w:type="dxa"/>
+              <w:bottom w:w="80" w:type="dxa"/>
+              <w:end w:w="90" w:type="dxa"/>
+            </w:tcMar>
+            <w:tcBorders>
+              <w:top w:val="single" w:sz="4" w:color="D9DEEA"/>
+              <w:left w:val="single" w:sz="4" w:color="D9DEEA"/>
+              <w:bottom w:val="single" w:sz="4" w:color="D9DEEA"/>
+              <w:right w:val="single" w:sz="4" w:color="D9DEEA"/>
+              <w:insideH w:val="single" w:sz="4" w:color="D9DEEA"/>
+              <w:insideV w:val="single" w:sz="4" w:color="D9DEEA"/>
+            </w:tcBorders>
+          </w:tcPr>
+          <w:p>
+            <w:r>
+              <w:t>evidence/coverage can trace source, semantics, geometry and visual provenance without hidden certainty</w:t>
+            </w:r>
+          </w:p>
+        </w:tc>
+      </w:tr>
+      <w:tr>
+        <w:trPr>
+          <w:cantSplit/>
+        </w:trPr>
+        <w:tc>
+          <w:tcPr>
+            <w:tcW w:type="dxa" w:w="648"/>
+            <w:shd w:fill="FFFFFF"/>
+            <w:tcMar>
+              <w:top w:w="80" w:type="dxa"/>
+              <w:start w:w="90" w:type="dxa"/>
+              <w:bottom w:w="80" w:type="dxa"/>
+              <w:end w:w="90" w:type="dxa"/>
+            </w:tcMar>
+            <w:tcBorders>
+              <w:top w:val="single" w:sz="4" w:color="D9DEEA"/>
+              <w:left w:val="single" w:sz="4" w:color="D9DEEA"/>
+              <w:bottom w:val="single" w:sz="4" w:color="D9DEEA"/>
+              <w:right w:val="single" w:sz="4" w:color="D9DEEA"/>
+              <w:insideH w:val="single" w:sz="4" w:color="D9DEEA"/>
+              <w:insideV w:val="single" w:sz="4" w:color="D9DEEA"/>
+            </w:tcBorders>
+          </w:tcPr>
+          <w:p>
+            <w:r>
+              <w:t>M11</w:t>
+            </w:r>
+          </w:p>
+        </w:tc>
+        <w:tc>
+          <w:tcPr>
+            <w:tcW w:type="dxa" w:w="4320"/>
+            <w:shd w:fill="FFFFFF"/>
+            <w:tcMar>
+              <w:top w:w="80" w:type="dxa"/>
+              <w:start w:w="90" w:type="dxa"/>
+              <w:bottom w:w="80" w:type="dxa"/>
+              <w:end w:w="90" w:type="dxa"/>
+            </w:tcMar>
+            <w:tcBorders>
+              <w:top w:val="single" w:sz="4" w:color="D9DEEA"/>
+              <w:left w:val="single" w:sz="4" w:color="D9DEEA"/>
+              <w:bottom w:val="single" w:sz="4" w:color="D9DEEA"/>
+              <w:right w:val="single" w:sz="4" w:color="D9DEEA"/>
+              <w:insideH w:val="single" w:sz="4" w:color="D9DEEA"/>
+              <w:insideV w:val="single" w:sz="4" w:color="D9DEEA"/>
+            </w:tcBorders>
+          </w:tcPr>
+          <w:p>
+            <w:r>
+              <w:t>Reverse visual navigation</w:t>
+            </w:r>
+          </w:p>
+        </w:tc>
+        <w:tc>
+          <w:tcPr>
+            <w:tcW w:type="dxa" w:w="4680"/>
+            <w:shd w:fill="FFFFFF"/>
+            <w:tcMar>
+              <w:top w:w="80" w:type="dxa"/>
+              <w:start w:w="90" w:type="dxa"/>
+              <w:bottom w:w="80" w:type="dxa"/>
+              <w:end w:w="90" w:type="dxa"/>
+            </w:tcMar>
+            <w:tcBorders>
+              <w:top w:val="single" w:sz="4" w:color="D9DEEA"/>
+              <w:left w:val="single" w:sz="4" w:color="D9DEEA"/>
+              <w:bottom w:val="single" w:sz="4" w:color="D9DEEA"/>
+              <w:right w:val="single" w:sz="4" w:color="D9DEEA"/>
+              <w:insideH w:val="single" w:sz="4" w:color="D9DEEA"/>
+              <w:insideV w:val="single" w:sz="4" w:color="D9DEEA"/>
+            </w:tcBorders>
+          </w:tcPr>
+          <w:p>
+            <w:r>
+              <w:t>hit resolves page points/regions back to semantic/source objects using the rendering transform</w:t>
+            </w:r>
+          </w:p>
+        </w:tc>
+      </w:tr>
+      <w:tr>
+        <w:trPr>
+          <w:cantSplit/>
+        </w:trPr>
+        <w:tc>
+          <w:tcPr>
+            <w:tcW w:type="dxa" w:w="648"/>
+            <w:shd w:fill="F6F7FA"/>
+            <w:tcMar>
+              <w:top w:w="80" w:type="dxa"/>
+              <w:start w:w="90" w:type="dxa"/>
+              <w:bottom w:w="80" w:type="dxa"/>
+              <w:end w:w="90" w:type="dxa"/>
+            </w:tcMar>
+            <w:tcBorders>
+              <w:top w:val="single" w:sz="4" w:color="D9DEEA"/>
+              <w:left w:val="single" w:sz="4" w:color="D9DEEA"/>
+              <w:bottom w:val="single" w:sz="4" w:color="D9DEEA"/>
+              <w:right w:val="single" w:sz="4" w:color="D9DEEA"/>
+              <w:insideH w:val="single" w:sz="4" w:color="D9DEEA"/>
+              <w:insideV w:val="single" w:sz="4" w:color="D9DEEA"/>
+            </w:tcBorders>
+          </w:tcPr>
+          <w:p>
+            <w:r>
+              <w:t>M12</w:t>
+            </w:r>
+          </w:p>
+        </w:tc>
+        <w:tc>
+          <w:tcPr>
+            <w:tcW w:type="dxa" w:w="4320"/>
+            <w:shd w:fill="F6F7FA"/>
+            <w:tcMar>
+              <w:top w:w="80" w:type="dxa"/>
+              <w:start w:w="90" w:type="dxa"/>
+              <w:bottom w:w="80" w:type="dxa"/>
+              <w:end w:w="90" w:type="dxa"/>
+            </w:tcMar>
+            <w:tcBorders>
+              <w:top w:val="single" w:sz="4" w:color="D9DEEA"/>
+              <w:left w:val="single" w:sz="4" w:color="D9DEEA"/>
+              <w:bottom w:val="single" w:sz="4" w:color="D9DEEA"/>
+              <w:right w:val="single" w:sz="4" w:color="D9DEEA"/>
+              <w:insideH w:val="single" w:sz="4" w:color="D9DEEA"/>
+              <w:insideV w:val="single" w:sz="4" w:color="D9DEEA"/>
+            </w:tcBorders>
+          </w:tcPr>
+          <w:p>
+            <w:r>
+              <w:t>Spatial DQL + semantic viewport</w:t>
+            </w:r>
+          </w:p>
+        </w:tc>
+        <w:tc>
+          <w:tcPr>
+            <w:tcW w:type="dxa" w:w="4680"/>
+            <w:shd w:fill="F6F7FA"/>
+            <w:tcMar>
+              <w:top w:w="80" w:type="dxa"/>
+              <w:start w:w="90" w:type="dxa"/>
+              <w:bottom w:w="80" w:type="dxa"/>
+              <w:end w:w="90" w:type="dxa"/>
+            </w:tcMar>
+            <w:tcBorders>
+              <w:top w:val="single" w:sz="4" w:color="D9DEEA"/>
+              <w:left w:val="single" w:sz="4" w:color="D9DEEA"/>
+              <w:bottom w:val="single" w:sz="4" w:color="D9DEEA"/>
+              <w:right w:val="single" w:sz="4" w:color="D9DEEA"/>
+              <w:insideH w:val="single" w:sz="4" w:color="D9DEEA"/>
+              <w:insideV w:val="single" w:sz="4" w:color="D9DEEA"/>
+            </w:tcBorders>
+          </w:tcPr>
+          <w:p>
+            <w:r>
+              <w:t>agents can query relative geometry and focus bounded neighborhoods without serializing the whole document</w:t>
+            </w:r>
+          </w:p>
+        </w:tc>
+      </w:tr>
+      <w:tr>
+        <w:trPr>
+          <w:cantSplit/>
+        </w:trPr>
+        <w:tc>
+          <w:tcPr>
+            <w:tcW w:type="dxa" w:w="648"/>
+            <w:shd w:fill="FFFFFF"/>
+            <w:tcMar>
+              <w:top w:w="80" w:type="dxa"/>
+              <w:start w:w="90" w:type="dxa"/>
+              <w:bottom w:w="80" w:type="dxa"/>
+              <w:end w:w="90" w:type="dxa"/>
+            </w:tcMar>
+            <w:tcBorders>
+              <w:top w:val="single" w:sz="4" w:color="D9DEEA"/>
+              <w:left w:val="single" w:sz="4" w:color="D9DEEA"/>
+              <w:bottom w:val="single" w:sz="4" w:color="D9DEEA"/>
+              <w:right w:val="single" w:sz="4" w:color="D9DEEA"/>
+              <w:insideH w:val="single" w:sz="4" w:color="D9DEEA"/>
+              <w:insideV w:val="single" w:sz="4" w:color="D9DEEA"/>
+            </w:tcBorders>
+          </w:tcPr>
+          <w:p>
+            <w:r>
+              <w:t>M13</w:t>
+            </w:r>
+          </w:p>
+        </w:tc>
+        <w:tc>
+          <w:tcPr>
+            <w:tcW w:type="dxa" w:w="4320"/>
+            <w:shd w:fill="FFFFFF"/>
+            <w:tcMar>
+              <w:top w:w="80" w:type="dxa"/>
+              <w:start w:w="90" w:type="dxa"/>
+              <w:bottom w:w="80" w:type="dxa"/>
+              <w:end w:w="90" w:type="dxa"/>
+            </w:tcMar>
+            <w:tcBorders>
+              <w:top w:val="single" w:sz="4" w:color="D9DEEA"/>
+              <w:left w:val="single" w:sz="4" w:color="D9DEEA"/>
+              <w:bottom w:val="single" w:sz="4" w:color="D9DEEA"/>
+              <w:right w:val="single" w:sz="4" w:color="D9DEEA"/>
+              <w:insideH w:val="single" w:sz="4" w:color="D9DEEA"/>
+              <w:insideV w:val="single" w:sz="4" w:color="D9DEEA"/>
+            </w:tcBorders>
+          </w:tcPr>
+          <w:p>
+            <w:r>
+              <w:t>Cross-version lineage + advanced diff</w:t>
+            </w:r>
+          </w:p>
+        </w:tc>
+        <w:tc>
+          <w:tcPr>
+            <w:tcW w:type="dxa" w:w="4680"/>
+            <w:shd w:fill="FFFFFF"/>
+            <w:tcMar>
+              <w:top w:w="80" w:type="dxa"/>
+              <w:start w:w="90" w:type="dxa"/>
+              <w:bottom w:w="80" w:type="dxa"/>
+              <w:end w:w="90" w:type="dxa"/>
+            </w:tcMar>
+            <w:tcBorders>
+              <w:top w:val="single" w:sz="4" w:color="D9DEEA"/>
+              <w:left w:val="single" w:sz="4" w:color="D9DEEA"/>
+              <w:bottom w:val="single" w:sz="4" w:color="D9DEEA"/>
+              <w:right w:val="single" w:sz="4" w:color="D9DEEA"/>
+              <w:insideH w:val="single" w:sz="4" w:color="D9DEEA"/>
+              <w:insideV w:val="single" w:sz="4" w:color="D9DEEA"/>
+            </w:tcBorders>
+          </w:tcPr>
+          <w:p>
+            <w:r>
+              <w:t>diff maps corresponding objects across changed file digests and reports ambiguity explicitly</w:t>
+            </w:r>
+          </w:p>
+        </w:tc>
+      </w:tr>
+      <w:tr>
+        <w:trPr>
+          <w:cantSplit/>
+        </w:trPr>
+        <w:tc>
+          <w:tcPr>
+            <w:tcW w:type="dxa" w:w="648"/>
+            <w:shd w:fill="F6F7FA"/>
+            <w:tcMar>
+              <w:top w:w="80" w:type="dxa"/>
+              <w:start w:w="90" w:type="dxa"/>
+              <w:bottom w:w="80" w:type="dxa"/>
+              <w:end w:w="90" w:type="dxa"/>
+            </w:tcMar>
+            <w:tcBorders>
+              <w:top w:val="single" w:sz="4" w:color="D9DEEA"/>
+              <w:left w:val="single" w:sz="4" w:color="D9DEEA"/>
+              <w:bottom w:val="single" w:sz="4" w:color="D9DEEA"/>
+              <w:right w:val="single" w:sz="4" w:color="D9DEEA"/>
+              <w:insideH w:val="single" w:sz="4" w:color="D9DEEA"/>
+              <w:insideV w:val="single" w:sz="4" w:color="D9DEEA"/>
+            </w:tcBorders>
+          </w:tcPr>
+          <w:p>
+            <w:r>
+              <w:t>M14</w:t>
+            </w:r>
+          </w:p>
+        </w:tc>
+        <w:tc>
+          <w:tcPr>
+            <w:tcW w:type="dxa" w:w="4320"/>
+            <w:shd w:fill="F6F7FA"/>
+            <w:tcMar>
+              <w:top w:w="80" w:type="dxa"/>
+              <w:start w:w="90" w:type="dxa"/>
+              <w:bottom w:w="80" w:type="dxa"/>
+              <w:end w:w="90" w:type="dxa"/>
+            </w:tcMar>
+            <w:tcBorders>
+              <w:top w:val="single" w:sz="4" w:color="D9DEEA"/>
+              <w:left w:val="single" w:sz="4" w:color="D9DEEA"/>
+              <w:bottom w:val="single" w:sz="4" w:color="D9DEEA"/>
+              <w:right w:val="single" w:sz="4" w:color="D9DEEA"/>
+              <w:insideH w:val="single" w:sz="4" w:color="D9DEEA"/>
+              <w:insideV w:val="single" w:sz="4" w:color="D9DEEA"/>
+            </w:tcBorders>
+          </w:tcPr>
+          <w:p>
+            <w:r>
+              <w:t>Trace/replay + verifiable proof bundles</w:t>
+            </w:r>
+          </w:p>
+        </w:tc>
+        <w:tc>
+          <w:tcPr>
+            <w:tcW w:type="dxa" w:w="4680"/>
+            <w:shd w:fill="F6F7FA"/>
+            <w:tcMar>
+              <w:top w:w="80" w:type="dxa"/>
+              <w:start w:w="90" w:type="dxa"/>
+              <w:bottom w:w="80" w:type="dxa"/>
+              <w:end w:w="90" w:type="dxa"/>
+            </w:tcMar>
+            <w:tcBorders>
+              <w:top w:val="single" w:sz="4" w:color="D9DEEA"/>
+              <w:left w:val="single" w:sz="4" w:color="D9DEEA"/>
+              <w:bottom w:val="single" w:sz="4" w:color="D9DEEA"/>
+              <w:right w:val="single" w:sz="4" w:color="D9DEEA"/>
+              <w:insideH w:val="single" w:sz="4" w:color="D9DEEA"/>
+              <w:insideV w:val="single" w:sz="4" w:color="D9DEEA"/>
+            </w:tcBorders>
+          </w:tcPr>
+          <w:p>
+            <w:r>
+              <w:t>selected evidence and layout decisions can be reproduced and verified offline</w:t>
+            </w:r>
+          </w:p>
+        </w:tc>
+      </w:tr>
+      <w:tr>
+        <w:trPr>
+          <w:cantSplit/>
+        </w:trPr>
+        <w:tc>
+          <w:tcPr>
+            <w:tcW w:type="dxa" w:w="648"/>
+            <w:shd w:fill="FFFFFF"/>
+            <w:tcMar>
+              <w:top w:w="80" w:type="dxa"/>
+              <w:start w:w="90" w:type="dxa"/>
+              <w:bottom w:w="80" w:type="dxa"/>
+              <w:end w:w="90" w:type="dxa"/>
+            </w:tcMar>
+            <w:tcBorders>
+              <w:top w:val="single" w:sz="4" w:color="D9DEEA"/>
+              <w:left w:val="single" w:sz="4" w:color="D9DEEA"/>
+              <w:bottom w:val="single" w:sz="4" w:color="D9DEEA"/>
+              <w:right w:val="single" w:sz="4" w:color="D9DEEA"/>
+              <w:insideH w:val="single" w:sz="4" w:color="D9DEEA"/>
+              <w:insideV w:val="single" w:sz="4" w:color="D9DEEA"/>
+            </w:tcBorders>
+          </w:tcPr>
+          <w:p>
+            <w:r>
+              <w:t>M15</w:t>
+            </w:r>
+          </w:p>
+        </w:tc>
+        <w:tc>
+          <w:tcPr>
+            <w:tcW w:type="dxa" w:w="4320"/>
+            <w:shd w:fill="FFFFFF"/>
+            <w:tcMar>
+              <w:top w:w="80" w:type="dxa"/>
+              <w:start w:w="90" w:type="dxa"/>
+              <w:bottom w:w="80" w:type="dxa"/>
+              <w:end w:w="90" w:type="dxa"/>
+            </w:tcMar>
+            <w:tcBorders>
+              <w:top w:val="single" w:sz="4" w:color="D9DEEA"/>
+              <w:left w:val="single" w:sz="4" w:color="D9DEEA"/>
+              <w:bottom w:val="single" w:sz="4" w:color="D9DEEA"/>
+              <w:right w:val="single" w:sz="4" w:color="D9DEEA"/>
+              <w:insideH w:val="single" w:sz="4" w:color="D9DEEA"/>
+              <w:insideV w:val="single" w:sz="4" w:color="D9DEEA"/>
+            </w:tcBorders>
+          </w:tcPr>
+          <w:p>
+            <w:r>
+              <w:t>Evidence-engine conformance + hardening</w:t>
+            </w:r>
+          </w:p>
+        </w:tc>
+        <w:tc>
+          <w:tcPr>
+            <w:tcW w:type="dxa" w:w="4680"/>
+            <w:shd w:fill="FFFFFF"/>
+            <w:tcMar>
+              <w:top w:w="80" w:type="dxa"/>
+              <w:start w:w="90" w:type="dxa"/>
+              <w:bottom w:w="80" w:type="dxa"/>
+              <w:end w:w="90" w:type="dxa"/>
+            </w:tcMar>
+            <w:tcBorders>
+              <w:top w:val="single" w:sz="4" w:color="D9DEEA"/>
+              <w:left w:val="single" w:sz="4" w:color="D9DEEA"/>
+              <w:bottom w:val="single" w:sz="4" w:color="D9DEEA"/>
+              <w:right w:val="single" w:sz="4" w:color="D9DEEA"/>
+              <w:insideH w:val="single" w:sz="4" w:color="D9DEEA"/>
+              <w:insideV w:val="single" w:sz="4" w:color="D9DEEA"/>
+            </w:tcBorders>
+          </w:tcPr>
+          <w:p>
+            <w:r>
+              <w:t>cross-platform golden corpus proves deterministic schemas, geometry, pixels, coverage and failure behavior</w:t>
+            </w:r>
+          </w:p>
+        </w:tc>
+      </w:tr>
     </w:tbl>
     <w:p>
       <w:pPr>
         <w:spacing w:after="0"/>
       </w:pPr>
+    </w:p>
+    <w:p>
+      <w:pPr/>
+      <w:r>
+        <w:t>M0–M9 remain the production-quality baseline. M10–M15 are differentiating evidence-engine phases: they deepen bidirectional provenance, visual navigation, spatial querying, cross-version reasoning and reproducibility without broadening the v1 format scope beyond DOCX/PDF.</w:t>
+      </w:r>
     </w:p>
     <w:p>
       <w:pPr>
@@ -11213,6 +12670,14 @@
           <w:sz w:val="18"/>
         </w:rPr>
         <w:t>Network services or daemon mode.</w:t>
+      </w:r>
+    </w:p>
+    <w:p>
+      <w:pPr>
+        <w:pStyle w:val="ListBullet"/>
+      </w:pPr>
+      <w:r>
+        <w:t>Reimplementing every general-purpose primitive solely to remove a library dependency. Engine ownership is mandatory; replacing ZIP/XML/compression/image/font helpers is incremental and driven by security, determinism, portability or measured performance.</w:t>
       </w:r>
     </w:p>
     <w:p>
@@ -11420,19 +12885,19 @@
       <w:r>
         <w:rPr>
           <w:rFonts w:ascii="Aptos" w:hAnsi="Aptos"/>
-          <w:b/>
+          <w:b w:val="0"/>
           <w:color w:val="172033"/>
           <w:sz w:val="18"/>
         </w:rPr>
-        <w:t xml:space="preserve">9.  </w:t>
+        <w:t>9.  Implement the bounded in-tree PDF syntax/xref/object/page-tree foundation; do not vendor or invoke an external PDF engine.</w:t>
       </w:r>
       <w:r>
         <w:rPr>
           <w:rFonts w:ascii="Aptos" w:hAnsi="Aptos"/>
+          <w:b w:val="0"/>
           <w:color w:val="172033"/>
           <w:sz w:val="18"/>
         </w:rPr>
-        <w:t>Vendor/build pinned MuPDF and expose a minimal safe Rust wrapper.</w:t>
       </w:r>
     </w:p>
     <w:p>
@@ -11443,19 +12908,19 @@
       <w:r>
         <w:rPr>
           <w:rFonts w:ascii="Aptos" w:hAnsi="Aptos"/>
-          <w:b/>
+          <w:b w:val="0"/>
           <w:color w:val="172033"/>
           <w:sz w:val="18"/>
         </w:rPr>
-        <w:t xml:space="preserve">10.  </w:t>
+        <w:t>10.  Implement the in-tree PDF content-stream/display-list path and deterministic PNG rasterization for the first supported graphics subset.</w:t>
       </w:r>
       <w:r>
         <w:rPr>
           <w:rFonts w:ascii="Aptos" w:hAnsi="Aptos"/>
+          <w:b w:val="0"/>
           <w:color w:val="172033"/>
           <w:sz w:val="18"/>
         </w:rPr>
-        <w:t>Implement PDF page metadata and PNG rasterization.</w:t>
       </w:r>
     </w:p>
     <w:p>
@@ -11466,19 +12931,19 @@
       <w:r>
         <w:rPr>
           <w:rFonts w:ascii="Aptos" w:hAnsi="Aptos"/>
-          <w:b/>
+          <w:b w:val="0"/>
           <w:color w:val="172033"/>
           <w:sz w:val="18"/>
         </w:rPr>
-        <w:t xml:space="preserve">11.  </w:t>
+        <w:t>11.  Implement PDF text span extraction and semantic reconstruction with normalized page coordinates and explicit confidence.</w:t>
       </w:r>
       <w:r>
         <w:rPr>
           <w:rFonts w:ascii="Aptos" w:hAnsi="Aptos"/>
+          <w:b w:val="0"/>
           <w:color w:val="172033"/>
           <w:sz w:val="18"/>
         </w:rPr>
-        <w:t>Implement PDF text span extraction with normalized page coordinates.</w:t>
       </w:r>
     </w:p>
     <w:p>
@@ -11635,6 +13100,74 @@
     </w:tbl>
     <w:p>
       <w:pPr>
+        <w:pStyle w:val="Heading2"/>
+      </w:pPr>
+      <w:r>
+        <w:t>19.1 Next implementation issues after the baseline</w:t>
+      </w:r>
+    </w:p>
+    <w:p>
+      <w:pPr/>
+      <w:r>
+        <w:t>16.  Add EvidenceRecord/FidelityProfile schemas without replacing inference confidence where it is semantically correct.</w:t>
+      </w:r>
+    </w:p>
+    <w:p>
+      <w:pPr/>
+      <w:r>
+        <w:t>17.  Implement bidirectional object hit-testing using the exact render/page transform.</w:t>
+      </w:r>
+    </w:p>
+    <w:p>
+      <w:pPr/>
+      <w:r>
+        <w:t>18.  Implement coverage aggregation with affected-object and reason-code reporting.</w:t>
+      </w:r>
+    </w:p>
+    <w:p>
+      <w:pPr/>
+      <w:r>
+        <w:t>19.  Add source→semantic→layout→display-list trace records for selected objects/pages.</w:t>
+      </w:r>
+    </w:p>
+    <w:p>
+      <w:pPr/>
+      <w:r>
+        <w:t>20.  Extend DQL with bounded spatial operators such as above/below/inside/overlaps/nearest/distance-to.</w:t>
+      </w:r>
+    </w:p>
+    <w:p>
+      <w:pPr/>
+      <w:r>
+        <w:t>21.  Add overview/focus bounded semantic navigation on top of the continuation-token protocol.</w:t>
+      </w:r>
+    </w:p>
+    <w:p>
+      <w:pPr/>
+      <w:r>
+        <w:t>22.  Implement cross-version lineage matching as a separate concept from deterministic ObjectId.</w:t>
+      </w:r>
+    </w:p>
+    <w:p>
+      <w:pPr/>
+      <w:r>
+        <w:t>23.  Define the deterministic .dse proof-bundle manifest and offline verification command.</w:t>
+      </w:r>
+    </w:p>
+    <w:p>
+      <w:pPr/>
+      <w:r>
+        <w:t>24.  Implement trace/replay verification for canonical display-list and raster fingerprints.</w:t>
+      </w:r>
+    </w:p>
+    <w:p>
+      <w:pPr/>
+      <w:r>
+        <w:t>25.  Build an evidence-engine conformance corpus covering source provenance, fidelity, hit-testing, lineage, replay and cross-platform determinism.</w:t>
+      </w:r>
+    </w:p>
+    <w:p>
+      <w:pPr>
         <w:spacing w:after="0"/>
       </w:pPr>
     </w:p>
@@ -11787,6 +13320,14 @@
           <w:sz w:val="18"/>
         </w:rPr>
         <w:t>A before/after document pair can be compared structurally and visually from the same CLI.</w:t>
+      </w:r>
+    </w:p>
+    <w:p>
+      <w:pPr>
+        <w:pStyle w:val="ListBullet"/>
+      </w:pPr>
+      <w:r>
+        <w:t>The authoritative DOCX/PDF inspection and rendering path does not require or silently fall back to an external document engine.</w:t>
       </w:r>
     </w:p>
     <w:p>
@@ -11813,10 +13354,22 @@
           <w:sz w:val="16"/>
         </w:rPr>
         <w:t>$ docsight inspect generated-report.docx --json | agent</w:t>
-      </w:r>
-      <w:r>
         <w:br/>
-      </w:r>
+        <w:t>$ docsight page generated-report.docx 12 --json</w:t>
+        <w:br/>
+        <w:t>$ docsight crop generated-report.docx --object tbl_0006 --out /tmp/tbl.png</w:t>
+        <w:br/>
+        <w:t>$ docsight hit generated-report.docx --page 12 --point 318,442 --json</w:t>
+        <w:br/>
+        <w:t>$ docsight evidence generated-report.docx tbl_0006 --json</w:t>
+        <w:br/>
+        <w:t>$ docsight coverage generated-report.docx --json</w:t>
+        <w:br/>
+        <w:t>$ docsight diff template.docx generated-report.docx --json</w:t>
+        <w:br/>
+        <w:t># No Word. No LibreOffice. No GUI. No external document engine. The file is still inspectable.</w:t>
+      </w:r>
+      <w:r/>
       <w:r>
         <w:rPr>
           <w:rFonts w:ascii="Liberation Mono" w:hAnsi="Liberation Mono"/>
@@ -11824,11 +13377,8 @@
           <w:color w:val="DDE4FF"/>
           <w:sz w:val="16"/>
         </w:rPr>
-        <w:t>$ docsight page generated-report.docx 12 --json</w:t>
-      </w:r>
-      <w:r>
-        <w:br/>
-      </w:r>
+      </w:r>
+      <w:r/>
       <w:r>
         <w:rPr>
           <w:rFonts w:ascii="Liberation Mono" w:hAnsi="Liberation Mono"/>
@@ -11836,11 +13386,8 @@
           <w:color w:val="DDE4FF"/>
           <w:sz w:val="16"/>
         </w:rPr>
-        <w:t>$ docsight crop generated-report.docx --object tbl_0006 --out /tmp/tbl.png</w:t>
-      </w:r>
-      <w:r>
-        <w:br/>
-      </w:r>
+      </w:r>
+      <w:r/>
       <w:r>
         <w:rPr>
           <w:rFonts w:ascii="Liberation Mono" w:hAnsi="Liberation Mono"/>
@@ -11848,11 +13395,8 @@
           <w:color w:val="DDE4FF"/>
           <w:sz w:val="16"/>
         </w:rPr>
-        <w:t>$ docsight diff template.docx generated-report.docx --json</w:t>
-      </w:r>
-      <w:r>
-        <w:br/>
-      </w:r>
+      </w:r>
+      <w:r/>
       <w:r>
         <w:rPr>
           <w:rFonts w:ascii="Liberation Mono" w:hAnsi="Liberation Mono"/>
@@ -11861,9 +13405,7 @@
           <w:sz w:val="16"/>
         </w:rPr>
       </w:r>
-      <w:r>
-        <w:br/>
-      </w:r>
+      <w:r/>
       <w:r>
         <w:rPr>
           <w:rFonts w:ascii="Liberation Mono" w:hAnsi="Liberation Mono"/>
@@ -11871,7 +13413,62 @@
           <w:color w:val="DDE4FF"/>
           <w:sz w:val="16"/>
         </w:rPr>
-        <w:t># No Word. No LibreOffice. No GUI. The file is still inspectable.</w:t>
+      </w:r>
+    </w:p>
+    <w:p>
+      <w:pPr>
+        <w:pStyle w:val="Heading2"/>
+      </w:pPr>
+      <w:r>
+        <w:t>20.2 Advanced evidence-engine target</w:t>
+      </w:r>
+    </w:p>
+    <w:p>
+      <w:pPr>
+        <w:pStyle w:val="ListBullet"/>
+      </w:pPr>
+      <w:r>
+        <w:t>Every important agent-visible claim can carry a provenance path from source representation to semantic object and, when visual, to geometry/display operations/pixels.</w:t>
+      </w:r>
+    </w:p>
+    <w:p>
+      <w:pPr>
+        <w:pStyle w:val="ListBullet"/>
+      </w:pPr>
+      <w:r>
+        <w:t>A page coordinate or selected raster region can be resolved back to the semantic/source objects that produced it.</w:t>
+      </w:r>
+    </w:p>
+    <w:p>
+      <w:pPr>
+        <w:pStyle w:val="ListBullet"/>
+      </w:pPr>
+      <w:r>
+        <w:t>Fidelity and coverage identify exactly which kinds of evidence are exact, inferred, approximated or unsupported.</w:t>
+      </w:r>
+    </w:p>
+    <w:p>
+      <w:pPr>
+        <w:pStyle w:val="ListBullet"/>
+      </w:pPr>
+      <w:r>
+        <w:t>Spatial DQL and focus operations let an agent navigate by semantic and geometric relationships under strict output budgets.</w:t>
+      </w:r>
+    </w:p>
+    <w:p>
+      <w:pPr>
+        <w:pStyle w:val="ListBullet"/>
+      </w:pPr>
+      <w:r>
+        <w:t>Cross-version lineage distinguishes “the same logical object changed” from unrelated additions/removals without weakening document-bound ObjectIds.</w:t>
+      </w:r>
+    </w:p>
+    <w:p>
+      <w:pPr>
+        <w:pStyle w:val="ListBullet"/>
+      </w:pPr>
+      <w:r>
+        <w:t>Trace/replay and proof bundles can reproduce or verify selected evidence offline with deterministic fingerprints.</w:t>
       </w:r>
     </w:p>
     <w:tbl>
@@ -11928,7 +13525,7 @@
                 <w:color w:val="172033"/>
                 <w:sz w:val="18"/>
               </w:rPr>
-              <w:t>DOCSIGHT is not a document converter. It is an evidence layer between opaque office files and terminal-native agents.</w:t>
+              <w:t>DOCSIGHT is not a document converter. It is a deterministic document debugger and evidence layer between opaque office files and terminal-native agents. Its defining direction is bidirectional traceability between source bytes/OOXML/PDF objects, semantic structure, layout geometry, display operations and pixels — locally, reproducibly and without an external document engine.</w:t>
             </w:r>
           </w:p>
         </w:tc>

</xml_diff>

<commit_message>
docs: Update DOCSIGHT project specification document
- Revised project requirements and objectives
- Updated technical specifications and architecture details
- Enhanced documentation clarity and completeness
- Aligned specification with current development scope
</commit_message>
<xml_diff>
--- a/Projeto_DOCSIGHT_Especificacao.docx
+++ b/Projeto_DOCSIGHT_Especificacao.docx
@@ -7,13 +7,7 @@
         <w:spacing w:before="1680" w:after="160"/>
       </w:pPr>
       <w:r>
-        <w:rPr>
-          <w:rFonts w:ascii="Aptos" w:hAnsi="Aptos"/>
-          <w:b/>
-          <w:color w:val="4C63D2"/>
-          <w:sz w:val="18"/>
-        </w:rPr>
-        <w:t>PROJECT SPECIFICATION  /  v1.1 — architecture revision</w:t>
+        <w:t>PROJECT SPECIFICATION  /  v1.2 — agent interaction economy revision</w:t>
       </w:r>
     </w:p>
     <w:p>
@@ -56,6 +50,10 @@
         <w:gridCol w:w="9864"/>
       </w:tblGrid>
       <w:tr>
+        <w:trPr>
+          <w:tblHeader/>
+          <w:cantSplit/>
+        </w:trPr>
         <w:tc>
           <w:tcPr>
             <w:tcW w:type="dxa" w:w="9994"/>
@@ -140,12 +138,7 @@
     </w:p>
     <w:p>
       <w:r>
-        <w:rPr>
-          <w:rFonts w:ascii="Aptos" w:hAnsi="Aptos"/>
-          <w:color w:val="5D667A"/>
-          <w:sz w:val="19"/>
-        </w:rPr>
-        <w:t>CLI + document IR + in-tree OOXML/PDF engines + deterministic layout/rendering + agent evidence protocol</w:t>
+        <w:t>CLI + document IR + in-tree OOXML/PDF engines + deterministic layout/rendering + agent evidence and interaction protocol</w:t>
       </w:r>
     </w:p>
     <w:p>
@@ -170,6 +163,7 @@
     <w:p>
       <w:pPr>
         <w:pStyle w:val="Heading1"/>
+        <w:keepNext/>
       </w:pPr>
       <w:r>
         <w:t>1. Problem statement</w:t>
@@ -194,6 +188,7 @@
     <w:p>
       <w:pPr>
         <w:pStyle w:val="Heading2"/>
+        <w:keepNext/>
       </w:pPr>
       <w:r>
         <w:t>1.1 Non-goals</w:t>
@@ -262,6 +257,7 @@
     <w:p>
       <w:pPr>
         <w:pStyle w:val="Heading2"/>
+        <w:keepNext/>
       </w:pPr>
       <w:r>
         <w:t>1.2 Definition of success</w:t>
@@ -278,6 +274,10 @@
         <w:gridCol w:w="9864"/>
       </w:tblGrid>
       <w:tr>
+        <w:trPr>
+          <w:tblHeader/>
+          <w:cantSplit/>
+        </w:trPr>
         <w:tc>
           <w:tcPr>
             <w:tcW w:type="dxa" w:w="9994"/>
@@ -344,6 +344,10 @@
         <w:gridCol w:w="4997"/>
       </w:tblGrid>
       <w:tr>
+        <w:trPr>
+          <w:tblHeader/>
+          <w:cantSplit/>
+        </w:trPr>
         <w:tc>
           <w:tcPr>
             <w:tcW w:type="dxa" w:w="3600"/>
@@ -410,6 +414,9 @@
         </w:tc>
       </w:tr>
       <w:tr>
+        <w:trPr>
+          <w:cantSplit/>
+        </w:trPr>
         <w:tc>
           <w:tcPr>
             <w:tcW w:type="dxa" w:w="3600"/>
@@ -472,6 +479,9 @@
         </w:tc>
       </w:tr>
       <w:tr>
+        <w:trPr>
+          <w:cantSplit/>
+        </w:trPr>
         <w:tc>
           <w:tcPr>
             <w:tcW w:type="dxa" w:w="3600"/>
@@ -534,6 +544,9 @@
         </w:tc>
       </w:tr>
       <w:tr>
+        <w:trPr>
+          <w:cantSplit/>
+        </w:trPr>
         <w:tc>
           <w:tcPr>
             <w:tcW w:type="dxa" w:w="3600"/>
@@ -596,6 +609,9 @@
         </w:tc>
       </w:tr>
       <w:tr>
+        <w:trPr>
+          <w:cantSplit/>
+        </w:trPr>
         <w:tc>
           <w:tcPr>
             <w:tcW w:type="dxa" w:w="3600"/>
@@ -658,6 +674,9 @@
         </w:tc>
       </w:tr>
       <w:tr>
+        <w:trPr>
+          <w:cantSplit/>
+        </w:trPr>
         <w:tc>
           <w:tcPr>
             <w:tcW w:type="dxa" w:w="3600"/>
@@ -720,6 +739,9 @@
         </w:tc>
       </w:tr>
       <w:tr>
+        <w:trPr>
+          <w:cantSplit/>
+        </w:trPr>
         <w:tc>
           <w:tcPr>
             <w:tcW w:type="dxa" w:w="3600"/>
@@ -782,6 +804,9 @@
         </w:tc>
       </w:tr>
       <w:tr>
+        <w:trPr>
+          <w:cantSplit/>
+        </w:trPr>
         <w:tc>
           <w:tcPr>
             <w:tcW w:type="dxa" w:w="3600"/>
@@ -847,6 +872,7 @@
     <w:p>
       <w:pPr>
         <w:pStyle w:val="Heading1"/>
+        <w:keepNext/>
       </w:pPr>
       <w:r>
         <w:t>2. Product shape</w:t>
@@ -869,114 +895,35 @@
         </w:pBdr>
       </w:pPr>
       <w:r>
-        <w:rPr>
-          <w:rFonts w:ascii="Liberation Mono" w:hAnsi="Liberation Mono"/>
-          <w:b w:val="0"/>
-          <w:color w:val="DDE4FF"/>
-          <w:sz w:val="16"/>
-        </w:rPr>
         <w:t>docsight inspect contract.docx</w:t>
-      </w:r>
-      <w:r>
         <w:br/>
-      </w:r>
-      <w:r>
-        <w:rPr>
-          <w:rFonts w:ascii="Liberation Mono" w:hAnsi="Liberation Mono"/>
-          <w:b w:val="0"/>
-          <w:color w:val="DDE4FF"/>
-          <w:sz w:val="16"/>
-        </w:rPr>
         <w:t>docsight outline contract.docx</w:t>
-      </w:r>
-      <w:r>
         <w:br/>
-      </w:r>
-      <w:r>
-        <w:rPr>
-          <w:rFonts w:ascii="Liberation Mono" w:hAnsi="Liberation Mono"/>
-          <w:b w:val="0"/>
-          <w:color w:val="DDE4FF"/>
-          <w:sz w:val="16"/>
-        </w:rPr>
         <w:t>docsight page contract.docx 7</w:t>
-      </w:r>
-      <w:r>
         <w:br/>
-      </w:r>
-      <w:r>
-        <w:rPr>
-          <w:rFonts w:ascii="Liberation Mono" w:hAnsi="Liberation Mono"/>
-          <w:b w:val="0"/>
-          <w:color w:val="DDE4FF"/>
-          <w:sz w:val="16"/>
-        </w:rPr>
+        <w:t>docsight peek contract.docx --page 7 --budget 4kb --json</w:t>
+        <w:br/>
+        <w:t>docsight resolve contract.docx --text "termination table" --kind table --json</w:t>
+        <w:br/>
+        <w:t>docsight context contract.docx tbl_0008 --include content,neighbors,geometry --json</w:t>
+        <w:br/>
         <w:t>docsight render contract.docx --page 7 --out page-7.png</w:t>
-      </w:r>
-      <w:r>
         <w:br/>
-      </w:r>
-      <w:r>
-        <w:rPr>
-          <w:rFonts w:ascii="Liberation Mono" w:hAnsi="Liberation Mono"/>
-          <w:b w:val="0"/>
-          <w:color w:val="DDE4FF"/>
-          <w:sz w:val="16"/>
-        </w:rPr>
         <w:t>docsight crop contract.docx --page 7 --bbox 72,180,520,430 --out clause.png</w:t>
-      </w:r>
-      <w:r>
         <w:br/>
-      </w:r>
-      <w:r>
-        <w:rPr>
-          <w:rFonts w:ascii="Liberation Mono" w:hAnsi="Liberation Mono"/>
-          <w:b w:val="0"/>
-          <w:color w:val="DDE4FF"/>
-          <w:sz w:val="16"/>
-        </w:rPr>
         <w:t>docsight tables contract.docx</w:t>
-      </w:r>
-      <w:r>
         <w:br/>
-      </w:r>
-      <w:r>
-        <w:rPr>
-          <w:rFonts w:ascii="Liberation Mono" w:hAnsi="Liberation Mono"/>
-          <w:b w:val="0"/>
-          <w:color w:val="DDE4FF"/>
-          <w:sz w:val="16"/>
-        </w:rPr>
         <w:t>docsight table contract.docx tbl_0008 --format markdown</w:t>
-      </w:r>
-      <w:r>
         <w:br/>
-      </w:r>
-      <w:r>
-        <w:rPr>
-          <w:rFonts w:ascii="Liberation Mono" w:hAnsi="Liberation Mono"/>
-          <w:b w:val="0"/>
-          <w:color w:val="DDE4FF"/>
-          <w:sz w:val="16"/>
-        </w:rPr>
         <w:t>docsight find contract.docx "termination" --context 2</w:t>
-      </w:r>
-      <w:r>
         <w:br/>
-      </w:r>
-      <w:r>
-        <w:rPr>
-          <w:rFonts w:ascii="Liberation Mono" w:hAnsi="Liberation Mono"/>
-          <w:b w:val="0"/>
-          <w:color w:val="DDE4FF"/>
-          <w:sz w:val="16"/>
-        </w:rPr>
         <w:t>docsight explain contract.docx blk_01J8... --json</w:t>
       </w:r>
     </w:p>
     <w:p>
       <w:pPr>
         <w:pStyle w:val="Heading2"/>
+        <w:keepNext/>
       </w:pPr>
       <w:r>
         <w:t>2.1 Core command groups</w:t>
@@ -995,6 +942,10 @@
         <w:gridCol w:w="3331"/>
       </w:tblGrid>
       <w:tr>
+        <w:trPr>
+          <w:tblHeader/>
+          <w:cantSplit/>
+        </w:trPr>
         <w:tc>
           <w:tcPr>
             <w:tcW w:type="dxa" w:w="1800"/>
@@ -1093,6 +1044,9 @@
         </w:tc>
       </w:tr>
       <w:tr>
+        <w:trPr>
+          <w:cantSplit/>
+        </w:trPr>
         <w:tc>
           <w:tcPr>
             <w:tcW w:type="dxa" w:w="1800"/>
@@ -1185,6 +1139,9 @@
         </w:tc>
       </w:tr>
       <w:tr>
+        <w:trPr>
+          <w:cantSplit/>
+        </w:trPr>
         <w:tc>
           <w:tcPr>
             <w:tcW w:type="dxa" w:w="1800"/>
@@ -1277,6 +1234,9 @@
         </w:tc>
       </w:tr>
       <w:tr>
+        <w:trPr>
+          <w:cantSplit/>
+        </w:trPr>
         <w:tc>
           <w:tcPr>
             <w:tcW w:type="dxa" w:w="1800"/>
@@ -1369,6 +1329,9 @@
         </w:tc>
       </w:tr>
       <w:tr>
+        <w:trPr>
+          <w:cantSplit/>
+        </w:trPr>
         <w:tc>
           <w:tcPr>
             <w:tcW w:type="dxa" w:w="1800"/>
@@ -1461,6 +1424,9 @@
         </w:tc>
       </w:tr>
       <w:tr>
+        <w:trPr>
+          <w:cantSplit/>
+        </w:trPr>
         <w:tc>
           <w:tcPr>
             <w:tcW w:type="dxa" w:w="1800"/>
@@ -1553,6 +1519,9 @@
         </w:tc>
       </w:tr>
       <w:tr>
+        <w:trPr>
+          <w:cantSplit/>
+        </w:trPr>
         <w:tc>
           <w:tcPr>
             <w:tcW w:type="dxa" w:w="1800"/>
@@ -1645,6 +1614,9 @@
         </w:tc>
       </w:tr>
       <w:tr>
+        <w:trPr>
+          <w:cantSplit/>
+        </w:trPr>
         <w:tc>
           <w:tcPr>
             <w:tcW w:type="dxa" w:w="1800"/>
@@ -1737,6 +1709,9 @@
         </w:tc>
       </w:tr>
       <w:tr>
+        <w:trPr>
+          <w:cantSplit/>
+        </w:trPr>
         <w:tc>
           <w:tcPr>
             <w:tcW w:type="dxa" w:w="1800"/>
@@ -1829,6 +1804,9 @@
         </w:tc>
       </w:tr>
       <w:tr>
+        <w:trPr>
+          <w:cantSplit/>
+        </w:trPr>
         <w:tc>
           <w:tcPr>
             <w:tcW w:type="dxa" w:w="1800"/>
@@ -1921,6 +1899,9 @@
         </w:tc>
       </w:tr>
       <w:tr>
+        <w:trPr>
+          <w:cantSplit/>
+        </w:trPr>
         <w:tc>
           <w:tcPr>
             <w:tcW w:type="dxa" w:w="1800"/>
@@ -2013,6 +1994,9 @@
         </w:tc>
       </w:tr>
       <w:tr>
+        <w:trPr>
+          <w:cantSplit/>
+        </w:trPr>
         <w:tc>
           <w:tcPr>
             <w:tcW w:type="dxa" w:w="1800"/>
@@ -2105,6 +2089,9 @@
         </w:tc>
       </w:tr>
       <w:tr>
+        <w:trPr>
+          <w:cantSplit/>
+        </w:trPr>
         <w:tc>
           <w:tcPr>
             <w:tcW w:type="dxa" w:w="1800"/>
@@ -2182,6 +2169,9 @@
         </w:tc>
       </w:tr>
       <w:tr>
+        <w:trPr>
+          <w:cantSplit/>
+        </w:trPr>
         <w:tc>
           <w:tcPr>
             <w:tcW w:type="dxa" w:w="1800"/>
@@ -2259,6 +2249,9 @@
         </w:tc>
       </w:tr>
       <w:tr>
+        <w:trPr>
+          <w:cantSplit/>
+        </w:trPr>
         <w:tc>
           <w:tcPr>
             <w:tcW w:type="dxa" w:w="1800"/>
@@ -2335,6 +2328,273 @@
           </w:p>
         </w:tc>
       </w:tr>
+      <w:tr>
+        <w:trPr>
+          <w:cantSplit/>
+        </w:trPr>
+        <w:tc>
+          <w:tcPr>
+            <w:tcW w:type="dxa" w:w="1800"/>
+            <w:shd w:fill="FFFFFF"/>
+            <w:tcMar>
+              <w:top w:w="80" w:type="dxa"/>
+              <w:start w:w="90" w:type="dxa"/>
+              <w:bottom w:w="80" w:type="dxa"/>
+              <w:end w:w="90" w:type="dxa"/>
+            </w:tcMar>
+            <w:tcBorders>
+              <w:top w:val="single" w:sz="4" w:color="D9DEEA"/>
+              <w:left w:val="single" w:sz="4" w:color="D9DEEA"/>
+              <w:bottom w:val="single" w:sz="4" w:color="D9DEEA"/>
+              <w:right w:val="single" w:sz="4" w:color="D9DEEA"/>
+              <w:insideH w:val="single" w:sz="4" w:color="D9DEEA"/>
+              <w:insideV w:val="single" w:sz="4" w:color="D9DEEA"/>
+            </w:tcBorders>
+          </w:tcPr>
+          <w:p>
+            <w:pPr>
+              <w:spacing w:after="0"/>
+            </w:pPr>
+            <w:r>
+              <w:t>peek</w:t>
+            </w:r>
+          </w:p>
+        </w:tc>
+        <w:tc>
+          <w:tcPr>
+            <w:tcW w:type="dxa" w:w="3528"/>
+            <w:shd w:fill="FFFFFF"/>
+            <w:tcMar>
+              <w:top w:w="80" w:type="dxa"/>
+              <w:start w:w="90" w:type="dxa"/>
+              <w:bottom w:w="80" w:type="dxa"/>
+              <w:end w:w="90" w:type="dxa"/>
+            </w:tcMar>
+            <w:tcBorders>
+              <w:top w:val="single" w:sz="4" w:color="D9DEEA"/>
+              <w:left w:val="single" w:sz="4" w:color="D9DEEA"/>
+              <w:bottom w:val="single" w:sz="4" w:color="D9DEEA"/>
+              <w:right w:val="single" w:sz="4" w:color="D9DEEA"/>
+              <w:insideH w:val="single" w:sz="4" w:color="D9DEEA"/>
+              <w:insideV w:val="single" w:sz="4" w:color="D9DEEA"/>
+            </w:tcBorders>
+          </w:tcPr>
+          <w:p>
+            <w:pPr>
+              <w:spacing w:after="0"/>
+            </w:pPr>
+            <w:r>
+              <w:t>Compact page/section/object snapshot under a strict output budget</w:t>
+            </w:r>
+          </w:p>
+        </w:tc>
+        <w:tc>
+          <w:tcPr>
+            <w:tcW w:type="dxa" w:w="4320"/>
+            <w:shd w:fill="FFFFFF"/>
+            <w:tcMar>
+              <w:top w:w="80" w:type="dxa"/>
+              <w:start w:w="90" w:type="dxa"/>
+              <w:bottom w:w="80" w:type="dxa"/>
+              <w:end w:w="90" w:type="dxa"/>
+            </w:tcMar>
+            <w:tcBorders>
+              <w:top w:val="single" w:sz="4" w:color="D9DEEA"/>
+              <w:left w:val="single" w:sz="4" w:color="D9DEEA"/>
+              <w:bottom w:val="single" w:sz="4" w:color="D9DEEA"/>
+              <w:right w:val="single" w:sz="4" w:color="D9DEEA"/>
+              <w:insideH w:val="single" w:sz="4" w:color="D9DEEA"/>
+              <w:insideV w:val="single" w:sz="4" w:color="D9DEEA"/>
+            </w:tcBorders>
+          </w:tcPr>
+          <w:p>
+            <w:pPr>
+              <w:spacing w:after="0"/>
+            </w:pPr>
+            <w:r>
+              <w:t>Understand enough to choose the next action without dumping full content</w:t>
+            </w:r>
+          </w:p>
+        </w:tc>
+      </w:tr>
+      <w:tr>
+        <w:trPr>
+          <w:cantSplit/>
+        </w:trPr>
+        <w:tc>
+          <w:tcPr>
+            <w:tcW w:type="dxa" w:w="1800"/>
+            <w:shd w:fill="FFFFFF"/>
+            <w:tcMar>
+              <w:top w:w="80" w:type="dxa"/>
+              <w:start w:w="90" w:type="dxa"/>
+              <w:bottom w:w="80" w:type="dxa"/>
+              <w:end w:w="90" w:type="dxa"/>
+            </w:tcMar>
+            <w:tcBorders>
+              <w:top w:val="single" w:sz="4" w:color="D9DEEA"/>
+              <w:left w:val="single" w:sz="4" w:color="D9DEEA"/>
+              <w:bottom w:val="single" w:sz="4" w:color="D9DEEA"/>
+              <w:right w:val="single" w:sz="4" w:color="D9DEEA"/>
+              <w:insideH w:val="single" w:sz="4" w:color="D9DEEA"/>
+              <w:insideV w:val="single" w:sz="4" w:color="D9DEEA"/>
+            </w:tcBorders>
+          </w:tcPr>
+          <w:p>
+            <w:pPr>
+              <w:spacing w:after="0"/>
+            </w:pPr>
+            <w:r>
+              <w:t>context</w:t>
+            </w:r>
+          </w:p>
+        </w:tc>
+        <w:tc>
+          <w:tcPr>
+            <w:tcW w:type="dxa" w:w="3528"/>
+            <w:shd w:fill="FFFFFF"/>
+            <w:tcMar>
+              <w:top w:w="80" w:type="dxa"/>
+              <w:start w:w="90" w:type="dxa"/>
+              <w:bottom w:w="80" w:type="dxa"/>
+              <w:end w:w="90" w:type="dxa"/>
+            </w:tcMar>
+            <w:tcBorders>
+              <w:top w:val="single" w:sz="4" w:color="D9DEEA"/>
+              <w:left w:val="single" w:sz="4" w:color="D9DEEA"/>
+              <w:bottom w:val="single" w:sz="4" w:color="D9DEEA"/>
+              <w:right w:val="single" w:sz="4" w:color="D9DEEA"/>
+              <w:insideH w:val="single" w:sz="4" w:color="D9DEEA"/>
+              <w:insideV w:val="single" w:sz="4" w:color="D9DEEA"/>
+            </w:tcBorders>
+          </w:tcPr>
+          <w:p>
+            <w:pPr>
+              <w:spacing w:after="0"/>
+            </w:pPr>
+            <w:r>
+              <w:t>Object + semantic neighborhood + selected content/provenance</w:t>
+            </w:r>
+          </w:p>
+        </w:tc>
+        <w:tc>
+          <w:tcPr>
+            <w:tcW w:type="dxa" w:w="4320"/>
+            <w:shd w:fill="FFFFFF"/>
+            <w:tcMar>
+              <w:top w:w="80" w:type="dxa"/>
+              <w:start w:w="90" w:type="dxa"/>
+              <w:bottom w:w="80" w:type="dxa"/>
+              <w:end w:w="90" w:type="dxa"/>
+            </w:tcMar>
+            <w:tcBorders>
+              <w:top w:val="single" w:sz="4" w:color="D9DEEA"/>
+              <w:left w:val="single" w:sz="4" w:color="D9DEEA"/>
+              <w:bottom w:val="single" w:sz="4" w:color="D9DEEA"/>
+              <w:right w:val="single" w:sz="4" w:color="D9DEEA"/>
+              <w:insideH w:val="single" w:sz="4" w:color="D9DEEA"/>
+              <w:insideV w:val="single" w:sz="4" w:color="D9DEEA"/>
+            </w:tcBorders>
+          </w:tcPr>
+          <w:p>
+            <w:pPr>
+              <w:spacing w:after="0"/>
+            </w:pPr>
+            <w:r>
+              <w:t>Resolve a common question in one call after an object is known</w:t>
+            </w:r>
+          </w:p>
+        </w:tc>
+      </w:tr>
+      <w:tr>
+        <w:trPr>
+          <w:cantSplit/>
+        </w:trPr>
+        <w:tc>
+          <w:tcPr>
+            <w:tcW w:type="dxa" w:w="1800"/>
+            <w:shd w:fill="FFFFFF"/>
+            <w:tcMar>
+              <w:top w:w="80" w:type="dxa"/>
+              <w:start w:w="90" w:type="dxa"/>
+              <w:bottom w:w="80" w:type="dxa"/>
+              <w:end w:w="90" w:type="dxa"/>
+            </w:tcMar>
+            <w:tcBorders>
+              <w:top w:val="single" w:sz="4" w:color="D9DEEA"/>
+              <w:left w:val="single" w:sz="4" w:color="D9DEEA"/>
+              <w:bottom w:val="single" w:sz="4" w:color="D9DEEA"/>
+              <w:right w:val="single" w:sz="4" w:color="D9DEEA"/>
+              <w:insideH w:val="single" w:sz="4" w:color="D9DEEA"/>
+              <w:insideV w:val="single" w:sz="4" w:color="D9DEEA"/>
+            </w:tcBorders>
+          </w:tcPr>
+          <w:p>
+            <w:pPr>
+              <w:spacing w:after="0"/>
+            </w:pPr>
+            <w:r>
+              <w:t>resolve</w:t>
+            </w:r>
+          </w:p>
+        </w:tc>
+        <w:tc>
+          <w:tcPr>
+            <w:tcW w:type="dxa" w:w="3528"/>
+            <w:shd w:fill="FFFFFF"/>
+            <w:tcMar>
+              <w:top w:w="80" w:type="dxa"/>
+              <w:start w:w="90" w:type="dxa"/>
+              <w:bottom w:w="80" w:type="dxa"/>
+              <w:end w:w="90" w:type="dxa"/>
+            </w:tcMar>
+            <w:tcBorders>
+              <w:top w:val="single" w:sz="4" w:color="D9DEEA"/>
+              <w:left w:val="single" w:sz="4" w:color="D9DEEA"/>
+              <w:bottom w:val="single" w:sz="4" w:color="D9DEEA"/>
+              <w:right w:val="single" w:sz="4" w:color="D9DEEA"/>
+              <w:insideH w:val="single" w:sz="4" w:color="D9DEEA"/>
+              <w:insideV w:val="single" w:sz="4" w:color="D9DEEA"/>
+            </w:tcBorders>
+          </w:tcPr>
+          <w:p>
+            <w:pPr>
+              <w:spacing w:after="0"/>
+            </w:pPr>
+            <w:r>
+              <w:t>Deterministic descriptor-to-object candidate ranking</w:t>
+            </w:r>
+          </w:p>
+        </w:tc>
+        <w:tc>
+          <w:tcPr>
+            <w:tcW w:type="dxa" w:w="4320"/>
+            <w:shd w:fill="FFFFFF"/>
+            <w:tcMar>
+              <w:top w:w="80" w:type="dxa"/>
+              <w:start w:w="90" w:type="dxa"/>
+              <w:bottom w:w="80" w:type="dxa"/>
+              <w:end w:w="90" w:type="dxa"/>
+            </w:tcMar>
+            <w:tcBorders>
+              <w:top w:val="single" w:sz="4" w:color="D9DEEA"/>
+              <w:left w:val="single" w:sz="4" w:color="D9DEEA"/>
+              <w:bottom w:val="single" w:sz="4" w:color="D9DEEA"/>
+              <w:right w:val="single" w:sz="4" w:color="D9DEEA"/>
+              <w:insideH w:val="single" w:sz="4" w:color="D9DEEA"/>
+              <w:insideV w:val="single" w:sz="4" w:color="D9DEEA"/>
+            </w:tcBorders>
+          </w:tcPr>
+          <w:p>
+            <w:pPr>
+              <w:spacing w:after="0"/>
+            </w:pPr>
+            <w:r>
+              <w:t>Turn a human phrase such as “table of expenses” into explainable object candidates without embeddings</w:t>
+            </w:r>
+          </w:p>
+        </w:tc>
+      </w:tr>
     </w:tbl>
     <w:p>
       <w:pPr>
@@ -2344,6 +2604,7 @@
     <w:p>
       <w:pPr>
         <w:pStyle w:val="Heading2"/>
+        <w:keepNext/>
       </w:pPr>
       <w:r>
         <w:t>2.2 Two audiences, one binary</w:t>
@@ -2391,6 +2652,7 @@
     <w:p>
       <w:pPr>
         <w:pStyle w:val="Heading2"/>
+        <w:keepNext/>
       </w:pPr>
       <w:r>
         <w:t>2.3 Self-contained engine doctrine</w:t>
@@ -2427,7 +2689,59 @@
     </w:p>
     <w:p>
       <w:pPr>
+        <w:pStyle w:val="Heading2"/>
+        <w:keepNext/>
+      </w:pPr>
+      <w:r>
+        <w:t>2.4 Agent interaction economy</w:t>
+      </w:r>
+    </w:p>
+    <w:p>
+      <w:pPr/>
+      <w:r>
+        <w:t>A core product objective is to minimize the amount of orchestration an agent must invent around document inspection. Once a file path is known, common workflows should require one or two DOCSIGHT invocations rather than ad-hoc extraction scripts, interpreter setup, temporary conversions and repeated parsing.</w:t>
+      </w:r>
+    </w:p>
+    <w:p>
+      <w:pPr/>
+      <w:r>
+        <w:t>The CLI therefore optimizes for progressive disclosure and task completion, not for exposing every internal structure at once. Commands such as peek, context and resolve compose existing evidence primitives into bounded operations while preserving the same typed DIR, provenance, geometry, diagnostics and deterministic ordering.</w:t>
+      </w:r>
+    </w:p>
+    <w:p>
+      <w:pPr>
+        <w:pStyle w:val="Heading3"/>
+        <w:keepNext/>
+      </w:pPr>
+      <w:r>
+        <w:t>No-scratch-code rule</w:t>
+      </w:r>
+    </w:p>
+    <w:p>
+      <w:pPr/>
+      <w:r>
+        <w:t>Normal inspection must not require an agent to generate Python, JavaScript or other throwaway parser code merely to open a DOCX/PDF, extract a table, locate a page or obtain a crop. External orchestration may call DOCSIGHT, but document understanding belongs inside the stable executable and its versioned protocol.</w:t>
+      </w:r>
+    </w:p>
+    <w:p>
+      <w:pPr>
+        <w:pStyle w:val="Heading3"/>
+        <w:keepNext/>
+      </w:pPr>
+      <w:r>
+        <w:t>Interaction depth is testable</w:t>
+      </w:r>
+    </w:p>
+    <w:p>
+      <w:pPr/>
+      <w:r>
+        <w:t>Maintain scenario benchmarks for representative agent tasks. Count CLI invocations, serialized bytes and render requests required to reach sufficient evidence. Regressions that turn a one-call or two-call workflow into a multi-step scratch pipeline are product regressions even if raw parser accuracy is unchanged.</w:t>
+      </w:r>
+    </w:p>
+    <w:p>
+      <w:pPr>
         <w:pStyle w:val="Heading1"/>
+        <w:keepNext/>
       </w:pPr>
       <w:r>
         <w:t>3. The central abstraction: Document IR</w:t>
@@ -2444,6 +2758,7 @@
     <w:p>
       <w:pPr>
         <w:pStyle w:val="Heading2"/>
+        <w:keepNext/>
       </w:pPr>
       <w:r>
         <w:t>3.1 Object hierarchy</w:t>
@@ -2638,6 +2953,7 @@
     <w:p>
       <w:pPr>
         <w:pStyle w:val="Heading2"/>
+        <w:keepNext/>
       </w:pPr>
       <w:r>
         <w:t>3.2 Every visible object carries geometry</w:t>
@@ -2780,6 +3096,7 @@
     <w:p>
       <w:pPr>
         <w:pStyle w:val="Heading2"/>
+        <w:keepNext/>
       </w:pPr>
       <w:r>
         <w:t>3.3 Stable object identifiers</w:t>
@@ -2838,6 +3155,7 @@
     <w:p>
       <w:pPr>
         <w:pStyle w:val="Heading2"/>
+        <w:keepNext/>
       </w:pPr>
       <w:r>
         <w:t>3.4 Evidence graph and bidirectional provenance</w:t>
@@ -2878,6 +3196,7 @@
     <w:p>
       <w:pPr>
         <w:pStyle w:val="Heading2"/>
+        <w:keepNext/>
       </w:pPr>
       <w:r>
         <w:t>3.5 Fidelity profile</w:t>
@@ -2922,6 +3241,7 @@
     <w:p>
       <w:pPr>
         <w:pStyle w:val="Heading2"/>
+        <w:keepNext/>
       </w:pPr>
       <w:r>
         <w:t>3.6 Evidence invariants</w:t>
@@ -2967,6 +3287,7 @@
     <w:p>
       <w:pPr>
         <w:pStyle w:val="Heading1"/>
+        <w:keepNext/>
       </w:pPr>
       <w:r>
         <w:t>4. DOCX ingestion without Office</w:t>
@@ -2983,6 +3304,7 @@
     <w:p>
       <w:pPr>
         <w:pStyle w:val="Heading2"/>
+        <w:keepNext/>
       </w:pPr>
       <w:r>
         <w:t>4.1 Required OOXML coverage for v1</w:t>
@@ -3000,6 +3322,10 @@
         <w:gridCol w:w="4997"/>
       </w:tblGrid>
       <w:tr>
+        <w:trPr>
+          <w:tblHeader/>
+          <w:cantSplit/>
+        </w:trPr>
         <w:tc>
           <w:tcPr>
             <w:tcW w:type="dxa" w:w="3600"/>
@@ -3066,6 +3392,9 @@
         </w:tc>
       </w:tr>
       <w:tr>
+        <w:trPr>
+          <w:cantSplit/>
+        </w:trPr>
         <w:tc>
           <w:tcPr>
             <w:tcW w:type="dxa" w:w="3600"/>
@@ -3128,6 +3457,9 @@
         </w:tc>
       </w:tr>
       <w:tr>
+        <w:trPr>
+          <w:cantSplit/>
+        </w:trPr>
         <w:tc>
           <w:tcPr>
             <w:tcW w:type="dxa" w:w="3600"/>
@@ -3190,6 +3522,9 @@
         </w:tc>
       </w:tr>
       <w:tr>
+        <w:trPr>
+          <w:cantSplit/>
+        </w:trPr>
         <w:tc>
           <w:tcPr>
             <w:tcW w:type="dxa" w:w="3600"/>
@@ -3252,6 +3587,9 @@
         </w:tc>
       </w:tr>
       <w:tr>
+        <w:trPr>
+          <w:cantSplit/>
+        </w:trPr>
         <w:tc>
           <w:tcPr>
             <w:tcW w:type="dxa" w:w="3600"/>
@@ -3314,6 +3652,9 @@
         </w:tc>
       </w:tr>
       <w:tr>
+        <w:trPr>
+          <w:cantSplit/>
+        </w:trPr>
         <w:tc>
           <w:tcPr>
             <w:tcW w:type="dxa" w:w="3600"/>
@@ -3376,6 +3717,9 @@
         </w:tc>
       </w:tr>
       <w:tr>
+        <w:trPr>
+          <w:cantSplit/>
+        </w:trPr>
         <w:tc>
           <w:tcPr>
             <w:tcW w:type="dxa" w:w="3600"/>
@@ -3438,6 +3782,9 @@
         </w:tc>
       </w:tr>
       <w:tr>
+        <w:trPr>
+          <w:cantSplit/>
+        </w:trPr>
         <w:tc>
           <w:tcPr>
             <w:tcW w:type="dxa" w:w="3600"/>
@@ -3500,6 +3847,9 @@
         </w:tc>
       </w:tr>
       <w:tr>
+        <w:trPr>
+          <w:cantSplit/>
+        </w:trPr>
         <w:tc>
           <w:tcPr>
             <w:tcW w:type="dxa" w:w="3600"/>
@@ -3562,6 +3912,9 @@
         </w:tc>
       </w:tr>
       <w:tr>
+        <w:trPr>
+          <w:cantSplit/>
+        </w:trPr>
         <w:tc>
           <w:tcPr>
             <w:tcW w:type="dxa" w:w="3600"/>
@@ -3624,6 +3977,9 @@
         </w:tc>
       </w:tr>
       <w:tr>
+        <w:trPr>
+          <w:cantSplit/>
+        </w:trPr>
         <w:tc>
           <w:tcPr>
             <w:tcW w:type="dxa" w:w="3600"/>
@@ -3686,6 +4042,9 @@
         </w:tc>
       </w:tr>
       <w:tr>
+        <w:trPr>
+          <w:cantSplit/>
+        </w:trPr>
         <w:tc>
           <w:tcPr>
             <w:tcW w:type="dxa" w:w="3600"/>
@@ -3748,6 +4107,9 @@
         </w:tc>
       </w:tr>
       <w:tr>
+        <w:trPr>
+          <w:cantSplit/>
+        </w:trPr>
         <w:tc>
           <w:tcPr>
             <w:tcW w:type="dxa" w:w="3600"/>
@@ -3818,6 +4180,7 @@
     <w:p>
       <w:pPr>
         <w:pStyle w:val="Heading2"/>
+        <w:keepNext/>
       </w:pPr>
       <w:r>
         <w:t>4.2 Style cascade</w:t>
@@ -3995,6 +4358,10 @@
         <w:gridCol w:w="9864"/>
       </w:tblGrid>
       <w:tr>
+        <w:trPr>
+          <w:tblHeader/>
+          <w:cantSplit/>
+        </w:trPr>
         <w:tc>
           <w:tcPr>
             <w:tcW w:type="dxa" w:w="9994"/>
@@ -4052,6 +4419,7 @@
     <w:p>
       <w:pPr>
         <w:pStyle w:val="Heading1"/>
+        <w:keepNext/>
       </w:pPr>
       <w:r>
         <w:t>5. DOCX layout engine</w:t>
@@ -4068,6 +4436,7 @@
     <w:p>
       <w:pPr>
         <w:pStyle w:val="Heading2"/>
+        <w:keepNext/>
       </w:pPr>
       <w:r>
         <w:t>5.1 Layout phases</w:t>
@@ -4306,6 +4675,7 @@
     <w:p>
       <w:pPr>
         <w:pStyle w:val="Heading2"/>
+        <w:keepNext/>
       </w:pPr>
       <w:r>
         <w:t>5.2 Text engine</w:t>
@@ -4388,6 +4758,7 @@
     <w:p>
       <w:pPr>
         <w:pStyle w:val="Heading2"/>
+        <w:keepNext/>
       </w:pPr>
       <w:r>
         <w:t>5.3 Layout truthfulness</w:t>
@@ -4453,6 +4824,7 @@
     <w:p>
       <w:pPr>
         <w:pStyle w:val="Heading1"/>
+        <w:keepNext/>
       </w:pPr>
       <w:r>
         <w:t>6. PDF backend</w:t>
@@ -4469,6 +4841,7 @@
     <w:p>
       <w:pPr>
         <w:pStyle w:val="Heading2"/>
+        <w:keepNext/>
       </w:pPr>
       <w:r>
         <w:t>6.1 Backend strategy</w:t>
@@ -4485,6 +4858,7 @@
     <w:p>
       <w:pPr>
         <w:pStyle w:val="Heading2"/>
+        <w:keepNext/>
       </w:pPr>
       <w:r>
         <w:t>6.1.1 PDF engine ownership boundary</w:t>
@@ -4499,6 +4873,7 @@
     <w:p>
       <w:pPr>
         <w:pStyle w:val="Heading2"/>
+        <w:keepNext/>
       </w:pPr>
       <w:r>
         <w:t>6.2 PDF reconstruction pipeline</w:t>
@@ -4714,6 +5089,7 @@
     <w:p>
       <w:pPr>
         <w:pStyle w:val="Heading2"/>
+        <w:keepNext/>
       </w:pPr>
       <w:r>
         <w:t>6.3 Scanned PDFs</w:t>
@@ -4730,6 +5106,10 @@
         <w:gridCol w:w="9864"/>
       </w:tblGrid>
       <w:tr>
+        <w:trPr>
+          <w:tblHeader/>
+          <w:cantSplit/>
+        </w:trPr>
         <w:tc>
           <w:tcPr>
             <w:tcW w:type="dxa" w:w="9994"/>
@@ -4792,6 +5172,7 @@
     <w:p>
       <w:pPr>
         <w:pStyle w:val="Heading1"/>
+        <w:keepNext/>
       </w:pPr>
       <w:r>
         <w:t>7. CLI contract in detail</w:t>
@@ -4800,6 +5181,7 @@
     <w:p>
       <w:pPr>
         <w:pStyle w:val="Heading2"/>
+        <w:keepNext/>
       </w:pPr>
       <w:r>
         <w:t>7.1 inspect</w:t>
@@ -4981,6 +5363,7 @@
     <w:p>
       <w:pPr>
         <w:pStyle w:val="Heading2"/>
+        <w:keepNext/>
       </w:pPr>
       <w:r>
         <w:t>7.2 page</w:t>
@@ -5091,6 +5474,7 @@
     <w:p>
       <w:pPr>
         <w:pStyle w:val="Heading2"/>
+        <w:keepNext/>
       </w:pPr>
       <w:r>
         <w:t>7.3 explain</w:t>
@@ -5233,6 +5617,7 @@
     <w:p>
       <w:pPr>
         <w:pStyle w:val="Heading2"/>
+        <w:keepNext/>
       </w:pPr>
       <w:r>
         <w:t>7.4 Layout causality</w:t>
@@ -5270,6 +5655,7 @@
     <w:p>
       <w:pPr>
         <w:pStyle w:val="Heading1"/>
+        <w:keepNext/>
       </w:pPr>
       <w:r>
         <w:t>8. Agent protocol and machine-readable output</w:t>
@@ -5286,6 +5672,7 @@
     <w:p>
       <w:pPr>
         <w:pStyle w:val="Heading2"/>
+        <w:keepNext/>
       </w:pPr>
       <w:r>
         <w:t>8.1 Envelope</w:t>
@@ -5396,6 +5783,7 @@
     <w:p>
       <w:pPr>
         <w:pStyle w:val="Heading2"/>
+        <w:keepNext/>
       </w:pPr>
       <w:r>
         <w:t>8.2 NDJSON streaming</w:t>
@@ -5466,6 +5854,7 @@
     <w:p>
       <w:pPr>
         <w:pStyle w:val="Heading2"/>
+        <w:keepNext/>
       </w:pPr>
       <w:r>
         <w:t>8.3 Output limits</w:t>
@@ -5483,6 +5872,10 @@
         <w:gridCol w:w="4997"/>
       </w:tblGrid>
       <w:tr>
+        <w:trPr>
+          <w:tblHeader/>
+          <w:cantSplit/>
+        </w:trPr>
         <w:tc>
           <w:tcPr>
             <w:tcW w:type="dxa" w:w="2880"/>
@@ -5549,6 +5942,9 @@
         </w:tc>
       </w:tr>
       <w:tr>
+        <w:trPr>
+          <w:cantSplit/>
+        </w:trPr>
         <w:tc>
           <w:tcPr>
             <w:tcW w:type="dxa" w:w="2880"/>
@@ -5611,6 +6007,9 @@
         </w:tc>
       </w:tr>
       <w:tr>
+        <w:trPr>
+          <w:cantSplit/>
+        </w:trPr>
         <w:tc>
           <w:tcPr>
             <w:tcW w:type="dxa" w:w="2880"/>
@@ -5673,6 +6072,9 @@
         </w:tc>
       </w:tr>
       <w:tr>
+        <w:trPr>
+          <w:cantSplit/>
+        </w:trPr>
         <w:tc>
           <w:tcPr>
             <w:tcW w:type="dxa" w:w="2880"/>
@@ -5735,6 +6137,9 @@
         </w:tc>
       </w:tr>
       <w:tr>
+        <w:trPr>
+          <w:cantSplit/>
+        </w:trPr>
         <w:tc>
           <w:tcPr>
             <w:tcW w:type="dxa" w:w="2880"/>
@@ -5797,6 +6202,9 @@
         </w:tc>
       </w:tr>
       <w:tr>
+        <w:trPr>
+          <w:cantSplit/>
+        </w:trPr>
         <w:tc>
           <w:tcPr>
             <w:tcW w:type="dxa" w:w="2880"/>
@@ -5859,6 +6267,9 @@
         </w:tc>
       </w:tr>
       <w:tr>
+        <w:trPr>
+          <w:cantSplit/>
+        </w:trPr>
         <w:tc>
           <w:tcPr>
             <w:tcW w:type="dxa" w:w="2880"/>
@@ -5920,6 +6331,128 @@
           </w:p>
         </w:tc>
       </w:tr>
+      <w:tr>
+        <w:trPr>
+          <w:cantSplit/>
+        </w:trPr>
+        <w:tc>
+          <w:tcPr>
+            <w:tcW w:type="dxa" w:w="2880"/>
+            <w:shd w:fill="F6F7FA"/>
+            <w:tcMar>
+              <w:top w:w="80" w:type="dxa"/>
+              <w:start w:w="90" w:type="dxa"/>
+              <w:bottom w:w="80" w:type="dxa"/>
+              <w:end w:w="90" w:type="dxa"/>
+            </w:tcMar>
+            <w:tcBorders>
+              <w:top w:val="single" w:sz="4" w:color="D9DEEA"/>
+              <w:left w:val="single" w:sz="4" w:color="D9DEEA"/>
+              <w:bottom w:val="single" w:sz="4" w:color="D9DEEA"/>
+              <w:right w:val="single" w:sz="4" w:color="D9DEEA"/>
+              <w:insideH w:val="single" w:sz="4" w:color="D9DEEA"/>
+              <w:insideV w:val="single" w:sz="4" w:color="D9DEEA"/>
+            </w:tcBorders>
+          </w:tcPr>
+          <w:p>
+            <w:pPr>
+              <w:spacing w:after="0"/>
+            </w:pPr>
+            <w:r>
+              <w:t>--budget N</w:t>
+            </w:r>
+          </w:p>
+        </w:tc>
+        <w:tc>
+          <w:tcPr>
+            <w:tcW w:type="dxa" w:w="6768"/>
+            <w:shd w:fill="F6F7FA"/>
+            <w:tcMar>
+              <w:top w:w="80" w:type="dxa"/>
+              <w:start w:w="90" w:type="dxa"/>
+              <w:bottom w:w="80" w:type="dxa"/>
+              <w:end w:w="90" w:type="dxa"/>
+            </w:tcMar>
+            <w:tcBorders>
+              <w:top w:val="single" w:sz="4" w:color="D9DEEA"/>
+              <w:left w:val="single" w:sz="4" w:color="D9DEEA"/>
+              <w:bottom w:val="single" w:sz="4" w:color="D9DEEA"/>
+              <w:right w:val="single" w:sz="4" w:color="D9DEEA"/>
+              <w:insideH w:val="single" w:sz="4" w:color="D9DEEA"/>
+              <w:insideV w:val="single" w:sz="4" w:color="D9DEEA"/>
+            </w:tcBorders>
+          </w:tcPr>
+          <w:p>
+            <w:pPr>
+              <w:spacing w:after="0"/>
+            </w:pPr>
+            <w:r>
+              <w:t>Adaptive serialized-output budget (for example 4kb or 24kb). The engine chooses a deterministic projection tier instead of emitting rich data and truncating it afterward</w:t>
+            </w:r>
+          </w:p>
+        </w:tc>
+      </w:tr>
+      <w:tr>
+        <w:trPr>
+          <w:cantSplit/>
+        </w:trPr>
+        <w:tc>
+          <w:tcPr>
+            <w:tcW w:type="dxa" w:w="2880"/>
+            <w:shd w:fill="F6F7FA"/>
+            <w:tcMar>
+              <w:top w:w="80" w:type="dxa"/>
+              <w:start w:w="90" w:type="dxa"/>
+              <w:bottom w:w="80" w:type="dxa"/>
+              <w:end w:w="90" w:type="dxa"/>
+            </w:tcMar>
+            <w:tcBorders>
+              <w:top w:val="single" w:sz="4" w:color="D9DEEA"/>
+              <w:left w:val="single" w:sz="4" w:color="D9DEEA"/>
+              <w:bottom w:val="single" w:sz="4" w:color="D9DEEA"/>
+              <w:right w:val="single" w:sz="4" w:color="D9DEEA"/>
+              <w:insideH w:val="single" w:sz="4" w:color="D9DEEA"/>
+              <w:insideV w:val="single" w:sz="4" w:color="D9DEEA"/>
+            </w:tcBorders>
+          </w:tcPr>
+          <w:p>
+            <w:pPr>
+              <w:spacing w:after="0"/>
+            </w:pPr>
+            <w:r>
+              <w:t>--budget-profile MODE</w:t>
+            </w:r>
+          </w:p>
+        </w:tc>
+        <w:tc>
+          <w:tcPr>
+            <w:tcW w:type="dxa" w:w="6768"/>
+            <w:shd w:fill="F6F7FA"/>
+            <w:tcMar>
+              <w:top w:w="80" w:type="dxa"/>
+              <w:start w:w="90" w:type="dxa"/>
+              <w:bottom w:w="80" w:type="dxa"/>
+              <w:end w:w="90" w:type="dxa"/>
+            </w:tcMar>
+            <w:tcBorders>
+              <w:top w:val="single" w:sz="4" w:color="D9DEEA"/>
+              <w:left w:val="single" w:sz="4" w:color="D9DEEA"/>
+              <w:bottom w:val="single" w:sz="4" w:color="D9DEEA"/>
+              <w:right w:val="single" w:sz="4" w:color="D9DEEA"/>
+              <w:insideH w:val="single" w:sz="4" w:color="D9DEEA"/>
+              <w:insideV w:val="single" w:sz="4" w:color="D9DEEA"/>
+            </w:tcBorders>
+          </w:tcPr>
+          <w:p>
+            <w:pPr>
+              <w:spacing w:after="0"/>
+            </w:pPr>
+            <w:r>
+              <w:t>Optional compact/balanced/rich projection policy. It changes included evidence classes, never document semantics or object identity</w:t>
+            </w:r>
+          </w:p>
+        </w:tc>
+      </w:tr>
     </w:tbl>
     <w:p>
       <w:pPr>
@@ -5934,6 +6467,7 @@
     <w:p>
       <w:pPr>
         <w:pStyle w:val="Heading1"/>
+        <w:keepNext/>
       </w:pPr>
       <w:r>
         <w:t>9. Visual inspection primitives</w:t>
@@ -5950,6 +6484,7 @@
     <w:p>
       <w:pPr>
         <w:pStyle w:val="Heading2"/>
+        <w:keepNext/>
       </w:pPr>
       <w:r>
         <w:t>9.1 render</w:t>
@@ -6000,6 +6535,7 @@
     <w:p>
       <w:pPr>
         <w:pStyle w:val="Heading2"/>
+        <w:keepNext/>
       </w:pPr>
       <w:r>
         <w:t>9.2 crop by semantic object</w:t>
@@ -6046,6 +6582,7 @@
     <w:p>
       <w:pPr>
         <w:pStyle w:val="Heading2"/>
+        <w:keepNext/>
       </w:pPr>
       <w:r>
         <w:t>9.3 contact sheets</w:t>
@@ -6080,6 +6617,7 @@
     <w:p>
       <w:pPr>
         <w:pStyle w:val="Heading2"/>
+        <w:keepNext/>
       </w:pPr>
       <w:r>
         <w:t>9.4 terminal protocols</w:t>
@@ -6140,6 +6678,7 @@
     <w:p>
       <w:pPr>
         <w:pStyle w:val="Heading2"/>
+        <w:keepNext/>
       </w:pPr>
       <w:r>
         <w:t>9.5 Reverse hit-testing</w:t>
@@ -6174,6 +6713,7 @@
     <w:p>
       <w:pPr>
         <w:pStyle w:val="Heading2"/>
+        <w:keepNext/>
       </w:pPr>
       <w:r>
         <w:t>9.6 Coverage maps</w:t>
@@ -6208,6 +6748,7 @@
     <w:p>
       <w:pPr>
         <w:pStyle w:val="Heading2"/>
+        <w:keepNext/>
       </w:pPr>
       <w:r>
         <w:t>9.7 Verifiable evidence bundles</w:t>
@@ -6242,6 +6783,7 @@
     <w:p>
       <w:pPr>
         <w:pStyle w:val="Heading1"/>
+        <w:keepNext/>
       </w:pPr>
       <w:r>
         <w:t>10. Tables are first-class objects</w:t>
@@ -6258,6 +6800,7 @@
     <w:p>
       <w:pPr>
         <w:pStyle w:val="Heading2"/>
+        <w:keepNext/>
       </w:pPr>
       <w:r>
         <w:t>10.1 Canonical table model</w:t>
@@ -6380,6 +6923,7 @@
     <w:p>
       <w:pPr>
         <w:pStyle w:val="Heading2"/>
+        <w:keepNext/>
       </w:pPr>
       <w:r>
         <w:t>10.2 Export modes</w:t>
@@ -6397,6 +6941,10 @@
         <w:gridCol w:w="4997"/>
       </w:tblGrid>
       <w:tr>
+        <w:trPr>
+          <w:tblHeader/>
+          <w:cantSplit/>
+        </w:trPr>
         <w:tc>
           <w:tcPr>
             <w:tcW w:type="dxa" w:w="2448"/>
@@ -6463,6 +7011,9 @@
         </w:tc>
       </w:tr>
       <w:tr>
+        <w:trPr>
+          <w:cantSplit/>
+        </w:trPr>
         <w:tc>
           <w:tcPr>
             <w:tcW w:type="dxa" w:w="2448"/>
@@ -6525,6 +7076,9 @@
         </w:tc>
       </w:tr>
       <w:tr>
+        <w:trPr>
+          <w:cantSplit/>
+        </w:trPr>
         <w:tc>
           <w:tcPr>
             <w:tcW w:type="dxa" w:w="2448"/>
@@ -6587,6 +7141,9 @@
         </w:tc>
       </w:tr>
       <w:tr>
+        <w:trPr>
+          <w:cantSplit/>
+        </w:trPr>
         <w:tc>
           <w:tcPr>
             <w:tcW w:type="dxa" w:w="2448"/>
@@ -6649,6 +7206,9 @@
         </w:tc>
       </w:tr>
       <w:tr>
+        <w:trPr>
+          <w:cantSplit/>
+        </w:trPr>
         <w:tc>
           <w:tcPr>
             <w:tcW w:type="dxa" w:w="2448"/>
@@ -6711,6 +7271,9 @@
         </w:tc>
       </w:tr>
       <w:tr>
+        <w:trPr>
+          <w:cantSplit/>
+        </w:trPr>
         <w:tc>
           <w:tcPr>
             <w:tcW w:type="dxa" w:w="2448"/>
@@ -6781,6 +7344,7 @@
     <w:p>
       <w:pPr>
         <w:pStyle w:val="Heading2"/>
+        <w:keepNext/>
       </w:pPr>
       <w:r>
         <w:t>10.3 Detection confidence for PDFs</w:t>
@@ -6868,6 +7432,7 @@
     <w:p>
       <w:pPr>
         <w:pStyle w:val="Heading1"/>
+        <w:keepNext/>
       </w:pPr>
       <w:r>
         <w:t>11. Search and document queries</w:t>
@@ -6876,6 +7441,7 @@
     <w:p>
       <w:pPr>
         <w:pStyle w:val="Heading2"/>
+        <w:keepNext/>
       </w:pPr>
       <w:r>
         <w:t>11.1 find</w:t>
@@ -6934,6 +7500,7 @@
     <w:p>
       <w:pPr>
         <w:pStyle w:val="Heading2"/>
+        <w:keepNext/>
       </w:pPr>
       <w:r>
         <w:t>11.2 A small query language</w:t>
@@ -7004,6 +7571,7 @@
     <w:p>
       <w:pPr>
         <w:pStyle w:val="Heading2"/>
+        <w:keepNext/>
       </w:pPr>
       <w:r>
         <w:t>11.3 No hidden embeddings in core</w:t>
@@ -7020,6 +7588,10 @@
         <w:gridCol w:w="9864"/>
       </w:tblGrid>
       <w:tr>
+        <w:trPr>
+          <w:tblHeader/>
+          <w:cantSplit/>
+        </w:trPr>
         <w:tc>
           <w:tcPr>
             <w:tcW w:type="dxa" w:w="9994"/>
@@ -7072,6 +7644,7 @@
     <w:p>
       <w:pPr>
         <w:pStyle w:val="Heading2"/>
+        <w:keepNext/>
       </w:pPr>
       <w:r>
         <w:t>11.4 Spatial DQL</w:t>
@@ -7110,6 +7683,7 @@
     <w:p>
       <w:pPr>
         <w:pStyle w:val="Heading2"/>
+        <w:keepNext/>
       </w:pPr>
       <w:r>
         <w:t>11.5 Agent viewport and semantic focus</w:t>
@@ -7155,7 +7729,145 @@
     </w:p>
     <w:p>
       <w:pPr>
+        <w:pStyle w:val="Heading2"/>
+        <w:keepNext/>
+      </w:pPr>
+      <w:r>
+        <w:t>11.6 peek: cheap structural sight</w:t>
+      </w:r>
+    </w:p>
+    <w:p>
+      <w:pPr/>
+      <w:r>
+        <w:t>peek is a deliberately compact inspection primitive. It accepts a page, heading, section, object or small page range and returns enough structure to decide what deserves a richer call: object kinds, IDs, short text snippets, geometry summaries, warnings and relationship hints. It must avoid expensive full table serialization and high-resolution rendering unless explicitly requested.</w:t>
+      </w:r>
+    </w:p>
+    <w:p>
+      <w:pPr>
+        <w:pStyle w:val="CodeBlock"/>
+        <w:shd w:fill="0E1424"/>
+        <w:pBdr>
+          <w:bottom w:val="single" w:sz="2" w:space="1" w:color="2B3658"/>
+        </w:pBdr>
+      </w:pPr>
+      <w:r>
+        <w:t>docsight peek report.docx --page 7 --budget 4kb --json</w:t>
+        <w:br/>
+        <w:t>docsight peek report.docx --object h2_009 --related --json</w:t>
+        <w:br/>
+        <w:t>docsight peek report.pdf --pages 20-22 --budget-profile compact --json</w:t>
+      </w:r>
+    </w:p>
+    <w:p>
+      <w:pPr>
+        <w:pStyle w:val="Heading2"/>
+        <w:keepNext/>
+      </w:pPr>
+      <w:r>
+        <w:t>11.7 context: one-call evidence neighborhood</w:t>
+      </w:r>
+    </w:p>
+    <w:p>
+      <w:pPr/>
+      <w:r>
+        <w:t>context packages the evidence an agent commonly gathers through several separate commands. Given an object, it can return the object itself, containing page/section, nearest heading, preceding/following reading-order neighbors, related caption or note, selected table/figure content, geometry, fidelity and source provenance. Every included field is still produced by the canonical DIR and evidence graph; context is an aggregation command, not a separate interpretation engine.</w:t>
+      </w:r>
+    </w:p>
+    <w:p>
+      <w:pPr>
+        <w:pStyle w:val="CodeBlock"/>
+        <w:shd w:fill="0E1424"/>
+        <w:pBdr>
+          <w:bottom w:val="single" w:sz="2" w:space="1" w:color="2B3658"/>
+        </w:pBdr>
+      </w:pPr>
+      <w:r>
+        <w:t>docsight context report.docx tbl_0008 --include content,neighbors,geometry,fidelity --budget 12kb --json</w:t>
+        <w:br/>
+        <w:t>docsight context report.docx --find "despesas" --kind table --include content,heading,neighbors --json</w:t>
+      </w:r>
+    </w:p>
+    <w:p>
+      <w:pPr/>
+      <w:r>
+        <w:t>When --find is used, matching and context expansion happen in the same invocation. The result must still expose the matched range, chosen object and reasons so an agent can distinguish direct evidence from neighborhood evidence.</w:t>
+      </w:r>
+    </w:p>
+    <w:p>
+      <w:pPr>
+        <w:pStyle w:val="Heading2"/>
+        <w:keepNext/>
+      </w:pPr>
+      <w:r>
+        <w:t>11.8 resolve: deterministic descriptor lookup</w:t>
+      </w:r>
+    </w:p>
+    <w:p>
+      <w:pPr/>
+      <w:r>
+        <w:t>resolve turns a compact human descriptor into ranked object candidates without natural-language Q&amp;A, hidden embeddings or a remote model. Ranking may use exact/fuzzy lexical matches, object kind, captions, nearest headings, page constraints, structural relations and canonical geometry. Every candidate includes machine-readable reason codes and component scores.</w:t>
+      </w:r>
+    </w:p>
+    <w:p>
+      <w:pPr>
+        <w:pStyle w:val="CodeBlock"/>
+        <w:shd w:fill="0E1424"/>
+        <w:pBdr>
+          <w:bottom w:val="single" w:sz="2" w:space="1" w:color="2B3658"/>
+        </w:pBdr>
+      </w:pPr>
+      <w:r>
+        <w:t>docsight resolve report.docx --text "tabela de despesas" --kind table --json</w:t>
+        <w:br/>
+        <w:t>docsight resolve report.pdf --text "assinatura do diretor" --pages 10-14 --json</w:t>
+      </w:r>
+    </w:p>
+    <w:p>
+      <w:pPr/>
+      <w:r>
+        <w:t>A low score or ambiguous tie is returned as ambiguity, not silently converted into a confident selection. resolve is a navigation aid over deterministic document evidence, not semantic question answering.</w:t>
+      </w:r>
+    </w:p>
+    <w:p>
+      <w:pPr>
+        <w:pStyle w:val="Heading2"/>
+        <w:keepNext/>
+      </w:pPr>
+      <w:r>
+        <w:t>11.9 Budget-aware adaptive projection</w:t>
+      </w:r>
+    </w:p>
+    <w:p>
+      <w:pPr/>
+      <w:r>
+        <w:t>Hard caps such as --max-bytes remain safety boundaries. --budget is different: it asks DOCSIGHT to choose the richest deterministic representation that fits a requested serialized-byte budget. A compact projection may return IDs, kinds and headings; a larger budget may add snippets, full object content, provenance, fidelity and related objects. The same inputs, engine version and budget always choose the same projection.</w:t>
+      </w:r>
+    </w:p>
+    <w:p>
+      <w:pPr/>
+      <w:r>
+        <w:t>The budget is defined in serialized bytes rather than model tokens so behavior remains model-independent and reproducible. Agent runtimes may translate their own token budget into a byte budget before invocation.</w:t>
+      </w:r>
+    </w:p>
+    <w:p>
+      <w:pPr>
+        <w:pStyle w:val="Heading2"/>
+        <w:keepNext/>
+      </w:pPr>
+      <w:r>
+        <w:t>11.10 Disposable-code elimination as an interface criterion</w:t>
+      </w:r>
+    </w:p>
+    <w:p>
+      <w:pPr/>
+      <w:r>
+        <w:t>For each recurring scratch pattern observed in agents—open DOCX with a temporary Python script, enumerate paragraphs, guess table index, convert to PDF, rasterize, crop coordinates manually—prefer a stable DOCSIGHT primitive that returns typed evidence. The project should not add convenience commands for every question, but repeated multi-step parser glue is evidence that a reusable primitive or aggregation boundary is missing.</w:t>
+      </w:r>
+    </w:p>
+    <w:p>
+      <w:pPr>
         <w:pStyle w:val="Heading1"/>
+        <w:keepNext/>
       </w:pPr>
       <w:r>
         <w:t>12. Document diffing</w:t>
@@ -7172,6 +7884,7 @@
     <w:p>
       <w:pPr>
         <w:pStyle w:val="Heading2"/>
+        <w:keepNext/>
       </w:pPr>
       <w:r>
         <w:t>12.1 Three-layer diff</w:t>
@@ -7362,6 +8075,7 @@
     <w:p>
       <w:pPr>
         <w:pStyle w:val="Heading2"/>
+        <w:keepNext/>
       </w:pPr>
       <w:r>
         <w:t>12.2 Visual diff artifacts</w:t>
@@ -7435,6 +8149,7 @@
     <w:p>
       <w:pPr>
         <w:pStyle w:val="Heading2"/>
+        <w:keepNext/>
       </w:pPr>
       <w:r>
         <w:t>12.3 Object identity and semantic lineage</w:t>
@@ -7469,6 +8184,7 @@
     <w:p>
       <w:pPr>
         <w:pStyle w:val="Heading2"/>
+        <w:keepNext/>
       </w:pPr>
       <w:r>
         <w:t>12.4 Evidence-aware diff</w:t>
@@ -7488,6 +8204,7 @@
     <w:p>
       <w:pPr>
         <w:pStyle w:val="Heading1"/>
+        <w:keepNext/>
       </w:pPr>
       <w:r>
         <w:t>13. Security model</w:t>
@@ -7504,6 +8221,7 @@
     <w:p>
       <w:pPr>
         <w:pStyle w:val="Heading2"/>
+        <w:keepNext/>
       </w:pPr>
       <w:r>
         <w:t>13.1 Mandatory defenses</w:t>
@@ -7521,6 +8239,10 @@
         <w:gridCol w:w="4997"/>
       </w:tblGrid>
       <w:tr>
+        <w:trPr>
+          <w:tblHeader/>
+          <w:cantSplit/>
+        </w:trPr>
         <w:tc>
           <w:tcPr>
             <w:tcW w:type="dxa" w:w="2952"/>
@@ -7587,6 +8309,9 @@
         </w:tc>
       </w:tr>
       <w:tr>
+        <w:trPr>
+          <w:cantSplit/>
+        </w:trPr>
         <w:tc>
           <w:tcPr>
             <w:tcW w:type="dxa" w:w="2952"/>
@@ -7649,6 +8374,9 @@
         </w:tc>
       </w:tr>
       <w:tr>
+        <w:trPr>
+          <w:cantSplit/>
+        </w:trPr>
         <w:tc>
           <w:tcPr>
             <w:tcW w:type="dxa" w:w="2952"/>
@@ -7711,6 +8439,9 @@
         </w:tc>
       </w:tr>
       <w:tr>
+        <w:trPr>
+          <w:cantSplit/>
+        </w:trPr>
         <w:tc>
           <w:tcPr>
             <w:tcW w:type="dxa" w:w="2952"/>
@@ -7773,6 +8504,9 @@
         </w:tc>
       </w:tr>
       <w:tr>
+        <w:trPr>
+          <w:cantSplit/>
+        </w:trPr>
         <w:tc>
           <w:tcPr>
             <w:tcW w:type="dxa" w:w="2952"/>
@@ -7835,6 +8569,9 @@
         </w:tc>
       </w:tr>
       <w:tr>
+        <w:trPr>
+          <w:cantSplit/>
+        </w:trPr>
         <w:tc>
           <w:tcPr>
             <w:tcW w:type="dxa" w:w="2952"/>
@@ -7892,6 +8629,9 @@
         </w:tc>
       </w:tr>
       <w:tr>
+        <w:trPr>
+          <w:cantSplit/>
+        </w:trPr>
         <w:tc>
           <w:tcPr>
             <w:tcW w:type="dxa" w:w="2952"/>
@@ -7954,6 +8694,9 @@
         </w:tc>
       </w:tr>
       <w:tr>
+        <w:trPr>
+          <w:cantSplit/>
+        </w:trPr>
         <w:tc>
           <w:tcPr>
             <w:tcW w:type="dxa" w:w="2952"/>
@@ -8016,6 +8759,9 @@
         </w:tc>
       </w:tr>
       <w:tr>
+        <w:trPr>
+          <w:cantSplit/>
+        </w:trPr>
         <w:tc>
           <w:tcPr>
             <w:tcW w:type="dxa" w:w="2952"/>
@@ -8078,6 +8824,9 @@
         </w:tc>
       </w:tr>
       <w:tr>
+        <w:trPr>
+          <w:cantSplit/>
+        </w:trPr>
         <w:tc>
           <w:tcPr>
             <w:tcW w:type="dxa" w:w="2952"/>
@@ -8148,6 +8897,7 @@
     <w:p>
       <w:pPr>
         <w:pStyle w:val="Heading2"/>
+        <w:keepNext/>
       </w:pPr>
       <w:r>
         <w:t>13.2 Worker isolation mode</w:t>
@@ -8225,6 +8975,7 @@
     <w:p>
       <w:pPr>
         <w:pStyle w:val="Heading2"/>
+        <w:keepNext/>
       </w:pPr>
       <w:r>
         <w:t>13.3 Engine-independence security rule</w:t>
@@ -8244,6 +8995,7 @@
     <w:p>
       <w:pPr>
         <w:pStyle w:val="Heading1"/>
+        <w:keepNext/>
       </w:pPr>
       <w:r>
         <w:t>14. Repository and crate architecture</w:t>
@@ -8468,6 +9220,7 @@
     <w:p>
       <w:pPr>
         <w:pStyle w:val="Heading2"/>
+        <w:keepNext/>
       </w:pPr>
       <w:r>
         <w:t>14.1 Why Rust fits this project</w:t>
@@ -8554,6 +9307,7 @@
     <w:p>
       <w:pPr>
         <w:pStyle w:val="Heading2"/>
+        <w:keepNext/>
       </w:pPr>
       <w:r>
         <w:t>14.2 Dependency discipline</w:t>
@@ -8575,6 +9329,7 @@
     <w:p>
       <w:pPr>
         <w:pStyle w:val="Heading1"/>
+        <w:keepNext/>
       </w:pPr>
       <w:r>
         <w:t>15. Cache, determinism and reproducibility</w:t>
@@ -8693,6 +9448,7 @@
     <w:p>
       <w:pPr>
         <w:pStyle w:val="Heading2"/>
+        <w:keepNext/>
       </w:pPr>
       <w:r>
         <w:t>15.1 Reproducibility fingerprint</w:t>
@@ -8798,6 +9554,7 @@
     <w:p>
       <w:pPr>
         <w:pStyle w:val="Heading2"/>
+        <w:keepNext/>
       </w:pPr>
       <w:r>
         <w:t>15.2 Concurrency rule</w:t>
@@ -8814,6 +9571,7 @@
     <w:p>
       <w:pPr>
         <w:pStyle w:val="Heading2"/>
+        <w:keepNext/>
       </w:pPr>
       <w:r>
         <w:t>15.3 Deterministic trace and replay</w:t>
@@ -8853,6 +9611,7 @@
     <w:p>
       <w:pPr>
         <w:pStyle w:val="Heading1"/>
+        <w:keepNext/>
       </w:pPr>
       <w:r>
         <w:t>16. Diagnostics and exit codes</w:t>
@@ -8879,6 +9638,10 @@
         <w:gridCol w:w="3331"/>
       </w:tblGrid>
       <w:tr>
+        <w:trPr>
+          <w:tblHeader/>
+          <w:cantSplit/>
+        </w:trPr>
         <w:tc>
           <w:tcPr>
             <w:tcW w:type="dxa" w:w="936"/>
@@ -8977,6 +9740,9 @@
         </w:tc>
       </w:tr>
       <w:tr>
+        <w:trPr>
+          <w:cantSplit/>
+        </w:trPr>
         <w:tc>
           <w:tcPr>
             <w:tcW w:type="dxa" w:w="936"/>
@@ -9069,6 +9835,9 @@
         </w:tc>
       </w:tr>
       <w:tr>
+        <w:trPr>
+          <w:cantSplit/>
+        </w:trPr>
         <w:tc>
           <w:tcPr>
             <w:tcW w:type="dxa" w:w="936"/>
@@ -9161,6 +9930,9 @@
         </w:tc>
       </w:tr>
       <w:tr>
+        <w:trPr>
+          <w:cantSplit/>
+        </w:trPr>
         <w:tc>
           <w:tcPr>
             <w:tcW w:type="dxa" w:w="936"/>
@@ -9253,6 +10025,9 @@
         </w:tc>
       </w:tr>
       <w:tr>
+        <w:trPr>
+          <w:cantSplit/>
+        </w:trPr>
         <w:tc>
           <w:tcPr>
             <w:tcW w:type="dxa" w:w="936"/>
@@ -9345,6 +10120,9 @@
         </w:tc>
       </w:tr>
       <w:tr>
+        <w:trPr>
+          <w:cantSplit/>
+        </w:trPr>
         <w:tc>
           <w:tcPr>
             <w:tcW w:type="dxa" w:w="936"/>
@@ -9437,6 +10215,9 @@
         </w:tc>
       </w:tr>
       <w:tr>
+        <w:trPr>
+          <w:cantSplit/>
+        </w:trPr>
         <w:tc>
           <w:tcPr>
             <w:tcW w:type="dxa" w:w="936"/>
@@ -9529,6 +10310,9 @@
         </w:tc>
       </w:tr>
       <w:tr>
+        <w:trPr>
+          <w:cantSplit/>
+        </w:trPr>
         <w:tc>
           <w:tcPr>
             <w:tcW w:type="dxa" w:w="936"/>
@@ -9621,6 +10405,9 @@
         </w:tc>
       </w:tr>
       <w:tr>
+        <w:trPr>
+          <w:cantSplit/>
+        </w:trPr>
         <w:tc>
           <w:tcPr>
             <w:tcW w:type="dxa" w:w="936"/>
@@ -9713,6 +10500,9 @@
         </w:tc>
       </w:tr>
       <w:tr>
+        <w:trPr>
+          <w:cantSplit/>
+        </w:trPr>
         <w:tc>
           <w:tcPr>
             <w:tcW w:type="dxa" w:w="936"/>
@@ -9805,6 +10595,9 @@
         </w:tc>
       </w:tr>
       <w:tr>
+        <w:trPr>
+          <w:cantSplit/>
+        </w:trPr>
         <w:tc>
           <w:tcPr>
             <w:tcW w:type="dxa" w:w="936"/>
@@ -9905,6 +10698,7 @@
     <w:p>
       <w:pPr>
         <w:pStyle w:val="Heading2"/>
+        <w:keepNext/>
       </w:pPr>
       <w:r>
         <w:t>16.1 Diagnostic records</w:t>
@@ -10023,6 +10817,7 @@
     <w:p>
       <w:pPr>
         <w:pStyle w:val="Heading2"/>
+        <w:keepNext/>
       </w:pPr>
       <w:r>
         <w:t>16.2 Coverage is a diagnostic surface</w:t>
@@ -10042,6 +10837,7 @@
     <w:p>
       <w:pPr>
         <w:pStyle w:val="Heading1"/>
+        <w:keepNext/>
       </w:pPr>
       <w:r>
         <w:t>17. Testing strategy</w:t>
@@ -10050,6 +10846,7 @@
     <w:p>
       <w:pPr>
         <w:pStyle w:val="Heading2"/>
+        <w:keepNext/>
       </w:pPr>
       <w:r>
         <w:t>17.1 Golden documents</w:t>
@@ -10066,6 +10863,7 @@
     <w:p>
       <w:pPr>
         <w:pStyle w:val="Heading2"/>
+        <w:keepNext/>
       </w:pPr>
       <w:r>
         <w:t>17.2 Test layers</w:t>
@@ -10083,6 +10881,10 @@
         <w:gridCol w:w="4997"/>
       </w:tblGrid>
       <w:tr>
+        <w:trPr>
+          <w:tblHeader/>
+          <w:cantSplit/>
+        </w:trPr>
         <w:tc>
           <w:tcPr>
             <w:tcW w:type="dxa" w:w="2520"/>
@@ -10149,6 +10951,9 @@
         </w:tc>
       </w:tr>
       <w:tr>
+        <w:trPr>
+          <w:cantSplit/>
+        </w:trPr>
         <w:tc>
           <w:tcPr>
             <w:tcW w:type="dxa" w:w="2520"/>
@@ -10211,6 +11016,9 @@
         </w:tc>
       </w:tr>
       <w:tr>
+        <w:trPr>
+          <w:cantSplit/>
+        </w:trPr>
         <w:tc>
           <w:tcPr>
             <w:tcW w:type="dxa" w:w="2520"/>
@@ -10273,6 +11081,9 @@
         </w:tc>
       </w:tr>
       <w:tr>
+        <w:trPr>
+          <w:cantSplit/>
+        </w:trPr>
         <w:tc>
           <w:tcPr>
             <w:tcW w:type="dxa" w:w="2520"/>
@@ -10335,6 +11146,9 @@
         </w:tc>
       </w:tr>
       <w:tr>
+        <w:trPr>
+          <w:cantSplit/>
+        </w:trPr>
         <w:tc>
           <w:tcPr>
             <w:tcW w:type="dxa" w:w="2520"/>
@@ -10397,6 +11211,9 @@
         </w:tc>
       </w:tr>
       <w:tr>
+        <w:trPr>
+          <w:cantSplit/>
+        </w:trPr>
         <w:tc>
           <w:tcPr>
             <w:tcW w:type="dxa" w:w="2520"/>
@@ -10459,6 +11276,9 @@
         </w:tc>
       </w:tr>
       <w:tr>
+        <w:trPr>
+          <w:cantSplit/>
+        </w:trPr>
         <w:tc>
           <w:tcPr>
             <w:tcW w:type="dxa" w:w="2520"/>
@@ -10521,6 +11341,9 @@
         </w:tc>
       </w:tr>
       <w:tr>
+        <w:trPr>
+          <w:cantSplit/>
+        </w:trPr>
         <w:tc>
           <w:tcPr>
             <w:tcW w:type="dxa" w:w="2520"/>
@@ -10583,6 +11406,9 @@
         </w:tc>
       </w:tr>
       <w:tr>
+        <w:trPr>
+          <w:cantSplit/>
+        </w:trPr>
         <w:tc>
           <w:tcPr>
             <w:tcW w:type="dxa" w:w="2520"/>
@@ -10645,6 +11471,9 @@
         </w:tc>
       </w:tr>
       <w:tr>
+        <w:trPr>
+          <w:cantSplit/>
+        </w:trPr>
         <w:tc>
           <w:tcPr>
             <w:tcW w:type="dxa" w:w="2520"/>
@@ -10707,6 +11536,9 @@
         </w:tc>
       </w:tr>
       <w:tr>
+        <w:trPr>
+          <w:cantSplit/>
+        </w:trPr>
         <w:tc>
           <w:tcPr>
             <w:tcW w:type="dxa" w:w="2520"/>
@@ -10759,6 +11591,9 @@
         </w:tc>
       </w:tr>
       <w:tr>
+        <w:trPr>
+          <w:cantSplit/>
+        </w:trPr>
         <w:tc>
           <w:tcPr>
             <w:tcW w:type="dxa" w:w="2520"/>
@@ -10811,6 +11646,9 @@
         </w:tc>
       </w:tr>
       <w:tr>
+        <w:trPr>
+          <w:cantSplit/>
+        </w:trPr>
         <w:tc>
           <w:tcPr>
             <w:tcW w:type="dxa" w:w="2520"/>
@@ -10863,6 +11701,9 @@
         </w:tc>
       </w:tr>
       <w:tr>
+        <w:trPr>
+          <w:cantSplit/>
+        </w:trPr>
         <w:tc>
           <w:tcPr>
             <w:tcW w:type="dxa" w:w="2520"/>
@@ -10914,6 +11755,67 @@
           </w:p>
         </w:tc>
       </w:tr>
+      <w:tr>
+        <w:trPr>
+          <w:cantSplit/>
+        </w:trPr>
+        <w:tc>
+          <w:tcPr>
+            <w:tcW w:type="dxa" w:w="2520"/>
+            <w:shd w:fill="F6F7FA"/>
+            <w:tcMar>
+              <w:top w:w="80" w:type="dxa"/>
+              <w:start w:w="90" w:type="dxa"/>
+              <w:bottom w:w="80" w:type="dxa"/>
+              <w:end w:w="90" w:type="dxa"/>
+            </w:tcMar>
+            <w:tcBorders>
+              <w:top w:val="single" w:sz="4" w:color="D9DEEA"/>
+              <w:left w:val="single" w:sz="4" w:color="D9DEEA"/>
+              <w:bottom w:val="single" w:sz="4" w:color="D9DEEA"/>
+              <w:right w:val="single" w:sz="4" w:color="D9DEEA"/>
+              <w:insideH w:val="single" w:sz="4" w:color="D9DEEA"/>
+              <w:insideV w:val="single" w:sz="4" w:color="D9DEEA"/>
+            </w:tcBorders>
+          </w:tcPr>
+          <w:p>
+            <w:pPr>
+              <w:spacing w:after="0"/>
+            </w:pPr>
+            <w:r>
+              <w:t>Agent interaction economy</w:t>
+            </w:r>
+          </w:p>
+        </w:tc>
+        <w:tc>
+          <w:tcPr>
+            <w:tcW w:type="dxa" w:w="7128"/>
+            <w:shd w:fill="F6F7FA"/>
+            <w:tcMar>
+              <w:top w:w="80" w:type="dxa"/>
+              <w:start w:w="90" w:type="dxa"/>
+              <w:bottom w:w="80" w:type="dxa"/>
+              <w:end w:w="90" w:type="dxa"/>
+            </w:tcMar>
+            <w:tcBorders>
+              <w:top w:val="single" w:sz="4" w:color="D9DEEA"/>
+              <w:left w:val="single" w:sz="4" w:color="D9DEEA"/>
+              <w:bottom w:val="single" w:sz="4" w:color="D9DEEA"/>
+              <w:right w:val="single" w:sz="4" w:color="D9DEEA"/>
+              <w:insideH w:val="single" w:sz="4" w:color="D9DEEA"/>
+              <w:insideV w:val="single" w:sz="4" w:color="D9DEEA"/>
+            </w:tcBorders>
+          </w:tcPr>
+          <w:p>
+            <w:pPr>
+              <w:spacing w:after="0"/>
+            </w:pPr>
+            <w:r>
+              <w:t>Scenario tests count CLI calls, serialized bytes and renders for representative locate/read/verify workflows; core tasks must not require generated parser scripts</w:t>
+            </w:r>
+          </w:p>
+        </w:tc>
+      </w:tr>
     </w:tbl>
     <w:p>
       <w:pPr>
@@ -10923,6 +11825,7 @@
     <w:p>
       <w:pPr>
         <w:pStyle w:val="Heading2"/>
+        <w:keepNext/>
       </w:pPr>
       <w:r>
         <w:t>17.3 Fuzz targets</w:t>
@@ -10932,6 +11835,7 @@
       <w:pPr>
         <w:pStyle w:val="CodeBlock"/>
         <w:shd w:fill="0E1424"/>
+        <w:keepLines/>
         <w:pBdr>
           <w:bottom w:val="single" w:sz="2" w:space="1" w:color="2B3658"/>
         </w:pBdr>
@@ -11029,9 +11933,10 @@
     <w:p>
       <w:pPr>
         <w:pStyle w:val="Heading1"/>
-      </w:pPr>
-      <w:r>
-        <w:t>18. Roadmap: M0 → M15</w:t>
+        <w:keepNext/>
+      </w:pPr>
+      <w:r>
+        <w:t>18. Roadmap: M0 → M18</w:t>
       </w:r>
     </w:p>
     <w:tbl>
@@ -11047,6 +11952,10 @@
         <w:gridCol w:w="3331"/>
       </w:tblGrid>
       <w:tr>
+        <w:trPr>
+          <w:tblHeader/>
+          <w:cantSplit/>
+        </w:trPr>
         <w:tc>
           <w:tcPr>
             <w:tcW w:type="dxa" w:w="648"/>
@@ -12501,7 +13410,7 @@
         <w:tc>
           <w:tcPr>
             <w:tcW w:type="dxa" w:w="648"/>
-            <w:shd w:fill="FFFFFF"/>
+            <w:shd w:fill="F6F7FA"/>
             <w:tcMar>
               <w:top w:w="80" w:type="dxa"/>
               <w:start w:w="90" w:type="dxa"/>
@@ -12526,7 +13435,7 @@
         <w:tc>
           <w:tcPr>
             <w:tcW w:type="dxa" w:w="4320"/>
-            <w:shd w:fill="FFFFFF"/>
+            <w:shd w:fill="F6F7FA"/>
             <w:tcMar>
               <w:top w:w="80" w:type="dxa"/>
               <w:start w:w="90" w:type="dxa"/>
@@ -12551,7 +13460,7 @@
         <w:tc>
           <w:tcPr>
             <w:tcW w:type="dxa" w:w="4680"/>
-            <w:shd w:fill="FFFFFF"/>
+            <w:shd w:fill="F6F7FA"/>
             <w:tcMar>
               <w:top w:w="80" w:type="dxa"/>
               <w:start w:w="90" w:type="dxa"/>
@@ -12574,6 +13483,273 @@
           </w:p>
         </w:tc>
       </w:tr>
+      <w:tr>
+        <w:trPr>
+          <w:cantSplit/>
+        </w:trPr>
+        <w:tc>
+          <w:tcPr>
+            <w:tcW w:type="dxa" w:w="648"/>
+            <w:shd w:fill="F6F7FA"/>
+            <w:tcMar>
+              <w:top w:w="80" w:type="dxa"/>
+              <w:start w:w="90" w:type="dxa"/>
+              <w:bottom w:w="80" w:type="dxa"/>
+              <w:end w:w="90" w:type="dxa"/>
+            </w:tcMar>
+            <w:tcBorders>
+              <w:top w:val="single" w:sz="4" w:color="D9DEEA"/>
+              <w:left w:val="single" w:sz="4" w:color="D9DEEA"/>
+              <w:bottom w:val="single" w:sz="4" w:color="D9DEEA"/>
+              <w:right w:val="single" w:sz="4" w:color="D9DEEA"/>
+              <w:insideH w:val="single" w:sz="4" w:color="D9DEEA"/>
+              <w:insideV w:val="single" w:sz="4" w:color="D9DEEA"/>
+            </w:tcBorders>
+          </w:tcPr>
+          <w:p>
+            <w:pPr>
+              <w:spacing w:after="0"/>
+            </w:pPr>
+            <w:r>
+              <w:t>M16</w:t>
+            </w:r>
+          </w:p>
+        </w:tc>
+        <w:tc>
+          <w:tcPr>
+            <w:tcW w:type="dxa" w:w="4320"/>
+            <w:shd w:fill="F6F7FA"/>
+            <w:tcMar>
+              <w:top w:w="80" w:type="dxa"/>
+              <w:start w:w="90" w:type="dxa"/>
+              <w:bottom w:w="80" w:type="dxa"/>
+              <w:end w:w="90" w:type="dxa"/>
+            </w:tcMar>
+            <w:tcBorders>
+              <w:top w:val="single" w:sz="4" w:color="D9DEEA"/>
+              <w:left w:val="single" w:sz="4" w:color="D9DEEA"/>
+              <w:bottom w:val="single" w:sz="4" w:color="D9DEEA"/>
+              <w:right w:val="single" w:sz="4" w:color="D9DEEA"/>
+              <w:insideH w:val="single" w:sz="4" w:color="D9DEEA"/>
+              <w:insideV w:val="single" w:sz="4" w:color="D9DEEA"/>
+            </w:tcBorders>
+          </w:tcPr>
+          <w:p>
+            <w:pPr>
+              <w:spacing w:after="0"/>
+            </w:pPr>
+            <w:r>
+              <w:t>Agent interaction primitives</w:t>
+            </w:r>
+          </w:p>
+        </w:tc>
+        <w:tc>
+          <w:tcPr>
+            <w:tcW w:type="dxa" w:w="4680"/>
+            <w:shd w:fill="F6F7FA"/>
+            <w:tcMar>
+              <w:top w:w="80" w:type="dxa"/>
+              <w:start w:w="90" w:type="dxa"/>
+              <w:bottom w:w="80" w:type="dxa"/>
+              <w:end w:w="90" w:type="dxa"/>
+            </w:tcMar>
+            <w:tcBorders>
+              <w:top w:val="single" w:sz="4" w:color="D9DEEA"/>
+              <w:left w:val="single" w:sz="4" w:color="D9DEEA"/>
+              <w:bottom w:val="single" w:sz="4" w:color="D9DEEA"/>
+              <w:right w:val="single" w:sz="4" w:color="D9DEEA"/>
+              <w:insideH w:val="single" w:sz="4" w:color="D9DEEA"/>
+              <w:insideV w:val="single" w:sz="4" w:color="D9DEEA"/>
+            </w:tcBorders>
+          </w:tcPr>
+          <w:p>
+            <w:pPr>
+              <w:spacing w:after="0"/>
+            </w:pPr>
+            <w:r>
+              <w:t>peek/context/resolve cover common locate + understand workflows with explainable deterministic evidence and no hidden embeddings</w:t>
+            </w:r>
+          </w:p>
+        </w:tc>
+      </w:tr>
+      <w:tr>
+        <w:trPr>
+          <w:cantSplit/>
+        </w:trPr>
+        <w:tc>
+          <w:tcPr>
+            <w:tcW w:type="dxa" w:w="648"/>
+            <w:shd w:fill="F6F7FA"/>
+            <w:tcMar>
+              <w:top w:w="80" w:type="dxa"/>
+              <w:start w:w="90" w:type="dxa"/>
+              <w:bottom w:w="80" w:type="dxa"/>
+              <w:end w:w="90" w:type="dxa"/>
+            </w:tcMar>
+            <w:tcBorders>
+              <w:top w:val="single" w:sz="4" w:color="D9DEEA"/>
+              <w:left w:val="single" w:sz="4" w:color="D9DEEA"/>
+              <w:bottom w:val="single" w:sz="4" w:color="D9DEEA"/>
+              <w:right w:val="single" w:sz="4" w:color="D9DEEA"/>
+              <w:insideH w:val="single" w:sz="4" w:color="D9DEEA"/>
+              <w:insideV w:val="single" w:sz="4" w:color="D9DEEA"/>
+            </w:tcBorders>
+          </w:tcPr>
+          <w:p>
+            <w:pPr>
+              <w:spacing w:after="0"/>
+            </w:pPr>
+            <w:r>
+              <w:t>M17</w:t>
+            </w:r>
+          </w:p>
+        </w:tc>
+        <w:tc>
+          <w:tcPr>
+            <w:tcW w:type="dxa" w:w="4320"/>
+            <w:shd w:fill="F6F7FA"/>
+            <w:tcMar>
+              <w:top w:w="80" w:type="dxa"/>
+              <w:start w:w="90" w:type="dxa"/>
+              <w:bottom w:w="80" w:type="dxa"/>
+              <w:end w:w="90" w:type="dxa"/>
+            </w:tcMar>
+            <w:tcBorders>
+              <w:top w:val="single" w:sz="4" w:color="D9DEEA"/>
+              <w:left w:val="single" w:sz="4" w:color="D9DEEA"/>
+              <w:bottom w:val="single" w:sz="4" w:color="D9DEEA"/>
+              <w:right w:val="single" w:sz="4" w:color="D9DEEA"/>
+              <w:insideH w:val="single" w:sz="4" w:color="D9DEEA"/>
+              <w:insideV w:val="single" w:sz="4" w:color="D9DEEA"/>
+            </w:tcBorders>
+          </w:tcPr>
+          <w:p>
+            <w:pPr>
+              <w:spacing w:after="0"/>
+            </w:pPr>
+            <w:r>
+              <w:t>Budget-aware adaptive projection</w:t>
+            </w:r>
+          </w:p>
+        </w:tc>
+        <w:tc>
+          <w:tcPr>
+            <w:tcW w:type="dxa" w:w="4680"/>
+            <w:shd w:fill="F6F7FA"/>
+            <w:tcMar>
+              <w:top w:w="80" w:type="dxa"/>
+              <w:start w:w="90" w:type="dxa"/>
+              <w:bottom w:w="80" w:type="dxa"/>
+              <w:end w:w="90" w:type="dxa"/>
+            </w:tcMar>
+            <w:tcBorders>
+              <w:top w:val="single" w:sz="4" w:color="D9DEEA"/>
+              <w:left w:val="single" w:sz="4" w:color="D9DEEA"/>
+              <w:bottom w:val="single" w:sz="4" w:color="D9DEEA"/>
+              <w:right w:val="single" w:sz="4" w:color="D9DEEA"/>
+              <w:insideH w:val="single" w:sz="4" w:color="D9DEEA"/>
+              <w:insideV w:val="single" w:sz="4" w:color="D9DEEA"/>
+            </w:tcBorders>
+          </w:tcPr>
+          <w:p>
+            <w:pPr>
+              <w:spacing w:after="0"/>
+            </w:pPr>
+            <w:r>
+              <w:t>--budget produces deterministic compact/balanced/rich evidence projections without post-hoc blind truncation</w:t>
+            </w:r>
+          </w:p>
+        </w:tc>
+      </w:tr>
+      <w:tr>
+        <w:trPr>
+          <w:cantSplit/>
+        </w:trPr>
+        <w:tc>
+          <w:tcPr>
+            <w:tcW w:type="dxa" w:w="648"/>
+            <w:shd w:fill="F6F7FA"/>
+            <w:tcMar>
+              <w:top w:w="80" w:type="dxa"/>
+              <w:start w:w="90" w:type="dxa"/>
+              <w:bottom w:w="80" w:type="dxa"/>
+              <w:end w:w="90" w:type="dxa"/>
+            </w:tcMar>
+            <w:tcBorders>
+              <w:top w:val="single" w:sz="4" w:color="D9DEEA"/>
+              <w:left w:val="single" w:sz="4" w:color="D9DEEA"/>
+              <w:bottom w:val="single" w:sz="4" w:color="D9DEEA"/>
+              <w:right w:val="single" w:sz="4" w:color="D9DEEA"/>
+              <w:insideH w:val="single" w:sz="4" w:color="D9DEEA"/>
+              <w:insideV w:val="single" w:sz="4" w:color="D9DEEA"/>
+            </w:tcBorders>
+          </w:tcPr>
+          <w:p>
+            <w:pPr>
+              <w:spacing w:after="0"/>
+            </w:pPr>
+            <w:r>
+              <w:t>M18</w:t>
+            </w:r>
+          </w:p>
+        </w:tc>
+        <w:tc>
+          <w:tcPr>
+            <w:tcW w:type="dxa" w:w="4320"/>
+            <w:shd w:fill="F6F7FA"/>
+            <w:tcMar>
+              <w:top w:w="80" w:type="dxa"/>
+              <w:start w:w="90" w:type="dxa"/>
+              <w:bottom w:w="80" w:type="dxa"/>
+              <w:end w:w="90" w:type="dxa"/>
+            </w:tcMar>
+            <w:tcBorders>
+              <w:top w:val="single" w:sz="4" w:color="D9DEEA"/>
+              <w:left w:val="single" w:sz="4" w:color="D9DEEA"/>
+              <w:bottom w:val="single" w:sz="4" w:color="D9DEEA"/>
+              <w:right w:val="single" w:sz="4" w:color="D9DEEA"/>
+              <w:insideH w:val="single" w:sz="4" w:color="D9DEEA"/>
+              <w:insideV w:val="single" w:sz="4" w:color="D9DEEA"/>
+            </w:tcBorders>
+          </w:tcPr>
+          <w:p>
+            <w:pPr>
+              <w:spacing w:after="0"/>
+            </w:pPr>
+            <w:r>
+              <w:t>Interaction-economy conformance</w:t>
+            </w:r>
+          </w:p>
+        </w:tc>
+        <w:tc>
+          <w:tcPr>
+            <w:tcW w:type="dxa" w:w="4680"/>
+            <w:shd w:fill="F6F7FA"/>
+            <w:tcMar>
+              <w:top w:w="80" w:type="dxa"/>
+              <w:start w:w="90" w:type="dxa"/>
+              <w:bottom w:w="80" w:type="dxa"/>
+              <w:end w:w="90" w:type="dxa"/>
+            </w:tcMar>
+            <w:tcBorders>
+              <w:top w:val="single" w:sz="4" w:color="D9DEEA"/>
+              <w:left w:val="single" w:sz="4" w:color="D9DEEA"/>
+              <w:bottom w:val="single" w:sz="4" w:color="D9DEEA"/>
+              <w:right w:val="single" w:sz="4" w:color="D9DEEA"/>
+              <w:insideH w:val="single" w:sz="4" w:color="D9DEEA"/>
+              <w:insideV w:val="single" w:sz="4" w:color="D9DEEA"/>
+            </w:tcBorders>
+          </w:tcPr>
+          <w:p>
+            <w:pPr>
+              <w:spacing w:after="0"/>
+            </w:pPr>
+            <w:r>
+              <w:t>scenario corpus proves target task depth, bounded output and zero scratch-parser requirement for normal agent workflows</w:t>
+            </w:r>
+          </w:p>
+        </w:tc>
+      </w:tr>
     </w:tbl>
     <w:p>
       <w:pPr>
@@ -12583,12 +13759,13 @@
     <w:p>
       <w:pPr/>
       <w:r>
-        <w:t>M0–M9 remain the production-quality baseline. M10–M15 are differentiating evidence-engine phases: they deepen bidirectional provenance, visual navigation, spatial querying, cross-version reasoning and reproducibility without broadening the v1 format scope beyond DOCX/PDF.</w:t>
+        <w:t>M0–M9 remain the production-quality baseline. M10–M15 are differentiating evidence-engine phases: they deepen bidirectional provenance, visual navigation, spatial querying, cross-version identity and reproducibility. M16–M18 optimize the agent interaction itself so common document tasks collapse from ad-hoc multi-step scripts into one or two deterministic CLI calls.</w:t>
       </w:r>
     </w:p>
     <w:p>
       <w:pPr>
         <w:pStyle w:val="Heading2"/>
+        <w:keepNext/>
       </w:pPr>
       <w:r>
         <w:t>18.1 Deliberately postponed</w:t>
@@ -12688,6 +13865,7 @@
     <w:p>
       <w:pPr>
         <w:pStyle w:val="Heading1"/>
+        <w:keepNext/>
       </w:pPr>
       <w:r>
         <w:t>19. First 15 implementation issues</w:t>
@@ -13049,6 +14227,10 @@
         <w:gridCol w:w="9864"/>
       </w:tblGrid>
       <w:tr>
+        <w:trPr>
+          <w:tblHeader/>
+          <w:cantSplit/>
+        </w:trPr>
         <w:tc>
           <w:tcPr>
             <w:tcW w:type="dxa" w:w="9994"/>
@@ -13101,6 +14283,7 @@
     <w:p>
       <w:pPr>
         <w:pStyle w:val="Heading2"/>
+        <w:keepNext/>
       </w:pPr>
       <w:r>
         <w:t>19.1 Next implementation issues after the baseline</w:t>
@@ -13177,8 +14360,42 @@
       </w:r>
     </w:p>
     <w:p>
+      <w:pPr/>
+      <w:r>
+        <w:t>26.  Implement peek projections for page/object/section targets with compact deterministic defaults.</w:t>
+      </w:r>
+    </w:p>
+    <w:p>
+      <w:pPr/>
+      <w:r>
+        <w:t>27.  Implement context aggregation over the DIR/evidence graph, including one-call --find expansion and explicit evidence roles.</w:t>
+      </w:r>
+    </w:p>
+    <w:p>
+      <w:pPr/>
+      <w:r>
+        <w:t>28.  Implement deterministic resolve ranking with reason codes for lexical, structural, caption/heading and geometric signals.</w:t>
+      </w:r>
+    </w:p>
+    <w:p>
+      <w:pPr/>
+      <w:r>
+        <w:t>29.  Implement --budget adaptive projection tiers and prove byte-budget determinism across platforms.</w:t>
+      </w:r>
+    </w:p>
+    <w:p>
+      <w:pPr/>
+      <w:r>
+        <w:t>30.  Add interaction-economy scenario tests for locate table, read merged cells, inspect page context, verify a visual region and compare generated documents without scratch parser code.</w:t>
+      </w:r>
+    </w:p>
+    <w:p>
+      <w:pPr/>
+    </w:p>
+    <w:p>
       <w:pPr>
         <w:pStyle w:val="Heading1"/>
+        <w:keepNext/>
       </w:pPr>
       <w:r>
         <w:t>20. Definition of “complete enough to use every day”</w:t>
@@ -13332,7 +14549,24 @@
     </w:p>
     <w:p>
       <w:pPr>
+        <w:pStyle w:val="ListBullet"/>
+      </w:pPr>
+      <w:r>
+        <w:t>A typical locate + structured-read task can be completed in one or two DOCSIGHT calls after the file path is known, without generating a temporary parser script.</w:t>
+      </w:r>
+    </w:p>
+    <w:p>
+      <w:pPr>
+        <w:pStyle w:val="ListBullet"/>
+      </w:pPr>
+      <w:r>
+        <w:t>An agent can request a deterministic bounded context view rather than serializing an entire document and truncating it after the fact.</w:t>
+      </w:r>
+    </w:p>
+    <w:p>
+      <w:pPr>
         <w:pStyle w:val="Heading2"/>
+        <w:keepNext/>
       </w:pPr>
       <w:r>
         <w:t>20.1 The final experience</w:t>
@@ -13347,77 +14581,25 @@
         </w:pBdr>
       </w:pPr>
       <w:r>
-        <w:rPr>
-          <w:rFonts w:ascii="Liberation Mono" w:hAnsi="Liberation Mono"/>
-          <w:b w:val="0"/>
-          <w:color w:val="DDE4FF"/>
-          <w:sz w:val="16"/>
-        </w:rPr>
         <w:t>$ docsight inspect generated-report.docx --json | agent</w:t>
         <w:br/>
-        <w:t>$ docsight page generated-report.docx 12 --json</w:t>
+        <w:t>$ docsight peek generated-report.docx --page 12 --budget 4kb --json</w:t>
+        <w:br/>
+        <w:t>$ docsight resolve generated-report.docx --text "revenue table" --kind table --json</w:t>
+        <w:br/>
+        <w:t>$ docsight context generated-report.docx tbl_0006 --include content,neighbors,geometry --budget 12kb --json</w:t>
         <w:br/>
         <w:t>$ docsight crop generated-report.docx --object tbl_0006 --out /tmp/tbl.png</w:t>
         <w:br/>
-        <w:t>$ docsight hit generated-report.docx --page 12 --point 318,442 --json</w:t>
-        <w:br/>
-        <w:t>$ docsight evidence generated-report.docx tbl_0006 --json</w:t>
-        <w:br/>
-        <w:t>$ docsight coverage generated-report.docx --json</w:t>
-        <w:br/>
         <w:t>$ docsight diff template.docx generated-report.docx --json</w:t>
         <w:br/>
-        <w:t># No Word. No LibreOffice. No GUI. No external document engine. The file is still inspectable.</w:t>
-      </w:r>
-      <w:r/>
-      <w:r>
-        <w:rPr>
-          <w:rFonts w:ascii="Liberation Mono" w:hAnsi="Liberation Mono"/>
-          <w:b w:val="0"/>
-          <w:color w:val="DDE4FF"/>
-          <w:sz w:val="16"/>
-        </w:rPr>
-      </w:r>
-      <w:r/>
-      <w:r>
-        <w:rPr>
-          <w:rFonts w:ascii="Liberation Mono" w:hAnsi="Liberation Mono"/>
-          <w:b w:val="0"/>
-          <w:color w:val="DDE4FF"/>
-          <w:sz w:val="16"/>
-        </w:rPr>
-      </w:r>
-      <w:r/>
-      <w:r>
-        <w:rPr>
-          <w:rFonts w:ascii="Liberation Mono" w:hAnsi="Liberation Mono"/>
-          <w:b w:val="0"/>
-          <w:color w:val="DDE4FF"/>
-          <w:sz w:val="16"/>
-        </w:rPr>
-      </w:r>
-      <w:r/>
-      <w:r>
-        <w:rPr>
-          <w:rFonts w:ascii="Liberation Mono" w:hAnsi="Liberation Mono"/>
-          <w:b w:val="0"/>
-          <w:color w:val="DDE4FF"/>
-          <w:sz w:val="16"/>
-        </w:rPr>
-      </w:r>
-      <w:r/>
-      <w:r>
-        <w:rPr>
-          <w:rFonts w:ascii="Liberation Mono" w:hAnsi="Liberation Mono"/>
-          <w:b w:val="0"/>
-          <w:color w:val="DDE4FF"/>
-          <w:sz w:val="16"/>
-        </w:rPr>
+        <w:t># No Word. No LibreOffice. No GUI. No throwaway parser script. The file is still inspectable.</w:t>
       </w:r>
     </w:p>
     <w:p>
       <w:pPr>
         <w:pStyle w:val="Heading2"/>
+        <w:keepNext/>
       </w:pPr>
       <w:r>
         <w:t>20.2 Advanced evidence-engine target</w:t>
@@ -13469,6 +14651,33 @@
       </w:pPr>
       <w:r>
         <w:t>Trace/replay and proof bundles can reproduce or verify selected evidence offline with deterministic fingerprints.</w:t>
+      </w:r>
+    </w:p>
+    <w:p>
+      <w:pPr>
+        <w:pStyle w:val="Heading2"/>
+        <w:keepNext/>
+      </w:pPr>
+      <w:r>
+        <w:t>20.3 Operational interaction target</w:t>
+      </w:r>
+    </w:p>
+    <w:p>
+      <w:pPr/>
+      <w:r>
+        <w:t>DOCSIGHT should feel to an agent like a native document utility, not a library that must be wrapped differently for every task. Once a path is available, the default progression is inspect/peek → context or a typed object command → crop/render only when pixels are necessary.</w:t>
+      </w:r>
+    </w:p>
+    <w:p>
+      <w:pPr/>
+      <w:r>
+        <w:t>The product benchmark is not merely parser coverage. It is the removal of repeated orchestration: no temporary interpreter environment, no generated extraction script, no format-specific glue, no manual coordinate conversion, and no forced full-document dump for a local question.</w:t>
+      </w:r>
+    </w:p>
+    <w:p>
+      <w:pPr/>
+      <w:r>
+        <w:t>A useful comparison is jq for JSON or ripgrep for text: DOCSIGHT does not invent PDF or DOCX, but aims to make opaque documents predictable, composable and cheap enough that agents stop rebuilding a miniature document pipeline every time they encounter one.</w:t>
       </w:r>
     </w:p>
     <w:tbl>
@@ -13482,6 +14691,10 @@
         <w:gridCol w:w="9864"/>
       </w:tblGrid>
       <w:tr>
+        <w:trPr>
+          <w:tblHeader/>
+          <w:cantSplit/>
+        </w:trPr>
         <w:tc>
           <w:tcPr>
             <w:tcW w:type="dxa" w:w="9994"/>
@@ -13502,30 +14715,13 @@
             </w:tcMar>
           </w:tcPr>
           <w:p>
-            <w:pPr>
-              <w:spacing w:after="60"/>
-            </w:pPr>
             <w:r>
               <w:rPr>
-                <w:rFonts w:ascii="Aptos" w:hAnsi="Aptos"/>
                 <w:b/>
-                <w:color w:val="4C63D2"/>
-                <w:sz w:val="18"/>
               </w:rPr>
               <w:t>Project identity</w:t>
-            </w:r>
-          </w:p>
-          <w:p>
-            <w:pPr>
-              <w:spacing w:after="0"/>
-            </w:pPr>
-            <w:r>
-              <w:rPr>
-                <w:rFonts w:ascii="Aptos" w:hAnsi="Aptos"/>
-                <w:color w:val="172033"/>
-                <w:sz w:val="18"/>
-              </w:rPr>
-              <w:t>DOCSIGHT is not a document converter. It is a deterministic document debugger and evidence layer between opaque office files and terminal-native agents. Its defining direction is bidirectional traceability between source bytes/OOXML/PDF objects, semantic structure, layout geometry, display operations and pixels — locally, reproducibly and without an external document engine.</w:t>
+              <w:br/>
+              <w:t>DOCSIGHT is not a document converter. It is a deterministic document debugger and evidence layer between opaque office files and terminal-native agents. Its defining experience is that source, semantics, geometry and pixels are addressable through one self-contained engine, while common agent tasks collapse into bounded one- or two-call workflows instead of disposable parser scripts.</w:t>
             </w:r>
           </w:p>
         </w:tc>

</xml_diff>